<commit_message>
Add FastAPI web app for document processing and export functionality
- Updated requirements.txt to include FastAPI and Uvicorn for web server support.
- Modified AIClassifier to use the latest model version.
- Enhanced JSONExporter to include metadata and definitions in exported JSON files.
- Created web app structure with FastAPI, including endpoints for document processing, job status, and file downloads.
- Implemented services for job management and pipeline processing.
- Added HTML frontend for user interaction, allowing file uploads and export options.
</commit_message>
<xml_diff>
--- a/docs/luat/69_2025_QH15_603983 copy.docx
+++ b/docs/luat/69_2025_QH15_603983 copy.docx
@@ -1,6 +1,6 @@
 
 <file path=word/document.xml><?xml version="1.0" encoding="utf-8"?>
-<w:document xmlns:wpc="http://schemas.microsoft.com/office/word/2010/wordprocessingCanvas" xmlns:cx="http://schemas.microsoft.com/office/drawing/2014/chartex" xmlns:cx1="http://schemas.microsoft.com/office/drawing/2015/9/8/chartex" xmlns:cx2="http://schemas.microsoft.com/office/drawing/2015/10/21/chartex" xmlns:cx3="http://schemas.microsoft.com/office/drawing/2016/5/9/chartex" xmlns:cx4="http://schemas.microsoft.com/office/drawing/2016/5/10/chartex" xmlns:cx5="http://schemas.microsoft.com/office/drawing/2016/5/11/chartex" xmlns:cx6="http://schemas.microsoft.com/office/drawing/2016/5/12/chartex" xmlns:cx7="http://schemas.microsoft.com/office/drawing/2016/5/13/chartex" xmlns:cx8="http://schemas.microsoft.com/office/drawing/2016/5/14/chartex" xmlns:mc="http://schemas.openxmlformats.org/markup-compatibility/2006" xmlns:aink="http://schemas.microsoft.com/office/drawing/2016/ink" xmlns:am3d="http://schemas.microsoft.com/office/drawing/2017/model3d" xmlns:o="urn:schemas-microsoft-com:office:office" xmlns:oel="http://schemas.microsoft.com/office/2019/extlst" xmlns:r="http://schemas.openxmlformats.org/officeDocument/2006/relationships" xmlns:m="http://schemas.openxmlformats.org/officeDocument/2006/math" xmlns:v="urn:schemas-microsoft-com:vml" xmlns:wp14="http://schemas.microsoft.com/office/word/2010/wordprocessingDrawing" xmlns:wp="http://schemas.openxmlformats.org/drawingml/2006/wordprocessingDrawing" xmlns:w10="urn:schemas-microsoft-com:office:word" xmlns:w="http://schemas.openxmlformats.org/wordprocessingml/2006/main" xmlns:w14="http://schemas.microsoft.com/office/word/2010/wordml" xmlns:w15="http://schemas.microsoft.com/office/word/2012/wordml" xmlns:w16cex="http://schemas.microsoft.com/office/word/2018/wordml/cex" xmlns:w16cid="http://schemas.microsoft.com/office/word/2016/wordml/cid" xmlns:w16="http://schemas.microsoft.com/office/word/2018/wordml" xmlns:w16du="http://schemas.microsoft.com/office/word/2023/wordml/word16du" xmlns:w16sdtdh="http://schemas.microsoft.com/office/word/2020/wordml/sdtdatahash" xmlns:w16sdtfl="http://schemas.microsoft.com/office/word/2024/wordml/sdtformatlock" xmlns:w16se="http://schemas.microsoft.com/office/word/2015/wordml/symex" xmlns:wpg="http://schemas.microsoft.com/office/word/2010/wordprocessingGroup" xmlns:wpi="http://schemas.microsoft.com/office/word/2010/wordprocessingInk" xmlns:wne="http://schemas.microsoft.com/office/word/2006/wordml" xmlns:wps="http://schemas.microsoft.com/office/word/2010/wordprocessingShape" mc:Ignorable="w14 w15 w16se w16cid w16 w16cex w16sdtdh w16sdtfl w16du wp14">
+<w:document xmlns:wpc="http://schemas.microsoft.com/office/word/2010/wordprocessingCanvas" xmlns:cx="http://schemas.microsoft.com/office/drawing/2014/chartex" xmlns:cx1="http://schemas.microsoft.com/office/drawing/2015/9/8/chartex" xmlns:cx2="http://schemas.microsoft.com/office/drawing/2015/10/21/chartex" xmlns:cx3="http://schemas.microsoft.com/office/drawing/2016/5/9/chartex" xmlns:cx4="http://schemas.microsoft.com/office/drawing/2016/5/10/chartex" xmlns:cx5="http://schemas.microsoft.com/office/drawing/2016/5/11/chartex" xmlns:cx6="http://schemas.microsoft.com/office/drawing/2016/5/12/chartex" xmlns:cx7="http://schemas.microsoft.com/office/drawing/2016/5/13/chartex" xmlns:cx8="http://schemas.microsoft.com/office/drawing/2016/5/14/chartex" xmlns:mc="http://schemas.openxmlformats.org/markup-compatibility/2006" xmlns:aink="http://schemas.microsoft.com/office/drawing/2016/ink" xmlns:am3d="http://schemas.microsoft.com/office/drawing/2017/model3d" xmlns:o="urn:schemas-microsoft-com:office:office" xmlns:r="http://schemas.openxmlformats.org/officeDocument/2006/relationships" xmlns:m="http://schemas.openxmlformats.org/officeDocument/2006/math" xmlns:v="urn:schemas-microsoft-com:vml" xmlns:wp14="http://schemas.microsoft.com/office/word/2010/wordprocessingDrawing" xmlns:wp="http://schemas.openxmlformats.org/drawingml/2006/wordprocessingDrawing" xmlns:w10="urn:schemas-microsoft-com:office:word" xmlns:w="http://schemas.openxmlformats.org/wordprocessingml/2006/main" xmlns:w14="http://schemas.microsoft.com/office/word/2010/wordml" xmlns:w15="http://schemas.microsoft.com/office/word/2012/wordml" xmlns:w16cex="http://schemas.microsoft.com/office/word/2018/wordml/cex" xmlns:w16cid="http://schemas.microsoft.com/office/word/2016/wordml/cid" xmlns:w16="http://schemas.microsoft.com/office/word/2018/wordml" xmlns:w16sdtdh="http://schemas.microsoft.com/office/word/2020/wordml/sdtdatahash" xmlns:w16se="http://schemas.microsoft.com/office/word/2015/wordml/symex" xmlns:wpg="http://schemas.microsoft.com/office/word/2010/wordprocessingGroup" xmlns:wpi="http://schemas.microsoft.com/office/word/2010/wordprocessingInk" xmlns:wne="http://schemas.microsoft.com/office/word/2006/wordml" xmlns:wps="http://schemas.microsoft.com/office/word/2010/wordprocessingShape" mc:Ignorable="w14 w15 w16se w16cid w16 w16cex w16sdtdh wp14">
   <w:body>
     <w:tbl>
       <w:tblPr>
@@ -259,179 +259,207 @@
           <w:i/>
           <w:iCs/>
         </w:rPr>
-        <w:t>Quốc hội ban hành Luật Hóa chất.</w:t>
-      </w:r>
-    </w:p>
-    <w:p>
-      <w:pPr>
-        <w:spacing w:before="120" w:after="280" w:afterAutospacing="1"/>
-      </w:pPr>
-      <w:bookmarkStart w:id="3" w:name="chuong_1"/>
-      <w:r>
-        <w:rPr>
-          <w:b/>
-          <w:bCs/>
-        </w:rPr>
-        <w:t>Chương I</w:t>
-      </w:r>
-      <w:bookmarkEnd w:id="3"/>
-      <w:r>
-        <w:rPr>
-          <w:b/>
-          <w:bCs/>
-        </w:rPr>
-        <w:t xml:space="preserve"> </w:t>
-      </w:r>
-    </w:p>
-    <w:p>
-      <w:pPr>
-        <w:spacing w:before="120" w:after="280" w:afterAutospacing="1"/>
-        <w:jc w:val="center"/>
-      </w:pPr>
-      <w:bookmarkStart w:id="4" w:name="chuong_1_name"/>
-      <w:r>
-        <w:rPr>
-          <w:b/>
-          <w:bCs/>
-        </w:rPr>
-        <w:t>QUY ĐỊNH CHUNG</w:t>
-      </w:r>
-      <w:bookmarkEnd w:id="4"/>
-    </w:p>
-    <w:p>
-      <w:pPr>
-        <w:spacing w:before="120" w:after="280" w:afterAutospacing="1"/>
-      </w:pPr>
-      <w:bookmarkStart w:id="5" w:name="dieu_1"/>
-      <w:r>
-        <w:rPr>
-          <w:b/>
-          <w:bCs/>
-        </w:rPr>
-        <w:t>Điều 1. Phạm vi điều chỉnh</w:t>
-      </w:r>
-      <w:bookmarkEnd w:id="5"/>
-    </w:p>
-    <w:p>
-      <w:pPr>
-        <w:spacing w:before="120" w:after="280" w:afterAutospacing="1"/>
-      </w:pPr>
-      <w:r>
-        <w:t>Luật này quy định về hóa chất, quản lý hoạt động hóa chất; phát triển ngành công nghiệp hóa chất; thông tin hóa chất; hóa chất nguy hiểm trong sản phẩm, hàng hóa; an toàn, an ninh trong hoạt động hóa chất.</w:t>
-      </w:r>
-    </w:p>
-    <w:p>
-      <w:pPr>
-        <w:spacing w:before="120" w:after="280" w:afterAutospacing="1"/>
-      </w:pPr>
-      <w:bookmarkStart w:id="6" w:name="dieu_2"/>
-      <w:r>
-        <w:rPr>
-          <w:b/>
-          <w:bCs/>
-        </w:rPr>
-        <w:t>Điều 2. Giải thích từ ngữ</w:t>
-      </w:r>
-      <w:bookmarkEnd w:id="6"/>
-    </w:p>
-    <w:p>
-      <w:pPr>
-        <w:spacing w:before="120" w:after="280" w:afterAutospacing="1"/>
-      </w:pPr>
-      <w:r>
-        <w:t>Trong Luật này, các từ ngữ dưới đây được hiểu như sau:</w:t>
-      </w:r>
-    </w:p>
-    <w:p>
-      <w:pPr>
-        <w:spacing w:before="120" w:after="280" w:afterAutospacing="1"/>
-      </w:pPr>
-      <w:r>
-        <w:t xml:space="preserve">1. </w:t>
+        <w:t xml:space="preserve">Quốc hội ban hành Luật </w:t>
       </w:r>
       <w:r>
         <w:rPr>
           <w:i/>
           <w:iCs/>
         </w:rPr>
-        <w:t>Hóa chất</w:t>
-      </w:r>
-      <w:r>
-        <w:t xml:space="preserve"> là chất, hỗn hợp chất tự nhiên hoặc được con người khai thác, tạo ra.</w:t>
-      </w:r>
-    </w:p>
-    <w:p>
-      <w:pPr>
-        <w:spacing w:before="120" w:after="280" w:afterAutospacing="1"/>
-      </w:pPr>
-      <w:r>
-        <w:t xml:space="preserve">2. </w:t>
+        <w:t>Hóa chất.</w:t>
+      </w:r>
+    </w:p>
+    <w:p>
+      <w:pPr>
+        <w:spacing w:before="120" w:after="280" w:afterAutospacing="1"/>
+      </w:pPr>
+      <w:bookmarkStart w:id="3" w:name="chuong_1"/>
+      <w:r>
+        <w:rPr>
+          <w:b/>
+          <w:bCs/>
+        </w:rPr>
+        <w:t>Chương I</w:t>
+      </w:r>
+      <w:bookmarkEnd w:id="3"/>
+      <w:r>
+        <w:rPr>
+          <w:b/>
+          <w:bCs/>
+        </w:rPr>
+        <w:t xml:space="preserve"> </w:t>
+      </w:r>
+    </w:p>
+    <w:p>
+      <w:pPr>
+        <w:spacing w:before="120" w:after="280" w:afterAutospacing="1"/>
+        <w:jc w:val="center"/>
+      </w:pPr>
+      <w:bookmarkStart w:id="4" w:name="chuong_1_name"/>
+      <w:r>
+        <w:rPr>
+          <w:b/>
+          <w:bCs/>
+        </w:rPr>
+        <w:t>QUY ĐỊNH CHUNG</w:t>
+      </w:r>
+      <w:bookmarkEnd w:id="4"/>
+    </w:p>
+    <w:p>
+      <w:pPr>
+        <w:spacing w:before="120" w:after="280" w:afterAutospacing="1"/>
+      </w:pPr>
+      <w:bookmarkStart w:id="5" w:name="dieu_1"/>
+      <w:proofErr w:type="spellStart"/>
+      <w:r>
+        <w:rPr>
+          <w:b/>
+          <w:bCs/>
+        </w:rPr>
+        <w:t>Điều</w:t>
+      </w:r>
+      <w:proofErr w:type="spellEnd"/>
+      <w:r>
+        <w:rPr>
+          <w:b/>
+          <w:bCs/>
+        </w:rPr>
+        <w:t xml:space="preserve"> 1. Phạm vi điều chỉnh</w:t>
+      </w:r>
+      <w:bookmarkEnd w:id="5"/>
+    </w:p>
+    <w:p>
+      <w:pPr>
+        <w:spacing w:before="120" w:after="280" w:afterAutospacing="1"/>
+      </w:pPr>
+      <w:r>
+        <w:t>Luật này quy định về hóa chất, quản lý hoạt động hóa chất; phát triển ngành công nghiệp hóa chất; thông tin hóa chất; hóa chất nguy hiểm trong sản phẩm, hàng hóa; an toàn, an ninh trong hoạt độn</w:t>
+      </w:r>
+      <w:r>
+        <w:t>g hóa chất.</w:t>
+      </w:r>
+    </w:p>
+    <w:p>
+      <w:pPr>
+        <w:spacing w:before="120" w:after="280" w:afterAutospacing="1"/>
+      </w:pPr>
+      <w:bookmarkStart w:id="6" w:name="dieu_2"/>
+      <w:r>
+        <w:rPr>
+          <w:b/>
+          <w:bCs/>
+        </w:rPr>
+        <w:t>Điều 2. Giải thích từ ngữ</w:t>
+      </w:r>
+      <w:bookmarkEnd w:id="6"/>
+    </w:p>
+    <w:p>
+      <w:pPr>
+        <w:spacing w:before="120" w:after="280" w:afterAutospacing="1"/>
+      </w:pPr>
+      <w:r>
+        <w:t>Trong Luật này, các từ ngữ dưới đây được hiểu như sau:</w:t>
+      </w:r>
+    </w:p>
+    <w:p>
+      <w:pPr>
+        <w:spacing w:before="120" w:after="280" w:afterAutospacing="1"/>
+      </w:pPr>
+      <w:r>
+        <w:t xml:space="preserve">1. </w:t>
       </w:r>
       <w:r>
         <w:rPr>
           <w:i/>
           <w:iCs/>
         </w:rPr>
-        <w:t>Chất</w:t>
-      </w:r>
-      <w:r>
-        <w:t xml:space="preserve"> là đơn chất, hợp chất bao gồm cả tạp chất sinh ra trong quá trình chế biến; những phụ gia cần thiết để bảo đảm đặc tính lý, hóa ổn định; không bao gồm dung môi mà khi tách ra thì tính chất của chất đó không thay đổi.</w:t>
-      </w:r>
-    </w:p>
-    <w:p>
-      <w:pPr>
-        <w:spacing w:before="120" w:after="280" w:afterAutospacing="1"/>
-      </w:pPr>
-      <w:r>
-        <w:t xml:space="preserve">3. </w:t>
+        <w:t>Hóa chất</w:t>
+      </w:r>
+      <w:r>
+        <w:t xml:space="preserve"> là chất, hỗn hợp chất tự nhiên hoặc được con người khai thác, tạo ra.</w:t>
+      </w:r>
+    </w:p>
+    <w:p>
+      <w:pPr>
+        <w:spacing w:before="120" w:after="280" w:afterAutospacing="1"/>
+      </w:pPr>
+      <w:r>
+        <w:t xml:space="preserve">2. </w:t>
       </w:r>
       <w:r>
         <w:rPr>
           <w:i/>
           <w:iCs/>
         </w:rPr>
-        <w:t>Hỗn hợp chất</w:t>
-      </w:r>
-      <w:r>
-        <w:t xml:space="preserve"> là tập hợp của hai chất hoặc nhiều chất mà giữa chúng không xảy ra phản ứng hóa học trong điều kiện bình thường.</w:t>
-      </w:r>
-    </w:p>
-    <w:p>
-      <w:pPr>
-        <w:spacing w:before="120" w:after="280" w:afterAutospacing="1"/>
-      </w:pPr>
-      <w:r>
-        <w:t xml:space="preserve">4. </w:t>
+        <w:t>Chất</w:t>
+      </w:r>
+      <w:r>
+        <w:t xml:space="preserve"> là đơn chất, hợp chất bao gồm cả tạp chất sinh ra trong quá trình chế biế</w:t>
+      </w:r>
+      <w:r>
+        <w:t>n; những phụ gia cần thiết để bảo đảm đặc tính lý, hóa ổn định; không bao gồm dung môi mà khi tách ra thì tính chất của chất đó không thay đổi.</w:t>
+      </w:r>
+    </w:p>
+    <w:p>
+      <w:pPr>
+        <w:spacing w:before="120" w:after="280" w:afterAutospacing="1"/>
+      </w:pPr>
+      <w:r>
+        <w:t xml:space="preserve">3. </w:t>
       </w:r>
       <w:r>
         <w:rPr>
           <w:i/>
           <w:iCs/>
         </w:rPr>
-        <w:t>Hóa chất nguy hiểm</w:t>
-      </w:r>
-      <w:r>
-        <w:t xml:space="preserve"> là hóa chất gây hại cho con người, cơ sở vật chất, tài sản, môi trường và có ít nhất một đặc tính nguy hiểm theo nguyên tắc phân loại do Thủ trưởng cơ quan đầu mối giúp Chính phủ thực hiện quản lý nhà nước ở trung ương về hóa chất (sau đây gọi chung là Thủ trưởng cơ quan quản lý nhà nước ở trung ương về hóa chất) quy định.</w:t>
-      </w:r>
-    </w:p>
-    <w:p>
-      <w:pPr>
-        <w:spacing w:before="120" w:after="280" w:afterAutospacing="1"/>
-      </w:pPr>
-      <w:bookmarkStart w:id="7" w:name="dieu_5_1"/>
-      <w:r>
-        <w:t>5.</w:t>
-      </w:r>
-      <w:bookmarkEnd w:id="7"/>
-      <w:r>
-        <w:t xml:space="preserve"> </w:t>
-      </w:r>
-      <w:bookmarkStart w:id="8" w:name="dieu_5_1_name"/>
+        <w:t>Hỗn hợp chất</w:t>
+      </w:r>
+      <w:r>
+        <w:t xml:space="preserve"> là tập hợp của hai chất hoặc nhiều chất mà giữa chúng không xảy ra phản ứng hóa học trong điều k</w:t>
+      </w:r>
+      <w:r>
+        <w:t>iện bình thường.</w:t>
+      </w:r>
+    </w:p>
+    <w:p>
+      <w:pPr>
+        <w:spacing w:before="120" w:after="280" w:afterAutospacing="1"/>
+      </w:pPr>
+      <w:r>
+        <w:t xml:space="preserve">4. </w:t>
+      </w:r>
       <w:r>
         <w:rPr>
           <w:i/>
           <w:iCs/>
         </w:rPr>
+        <w:t>Hóa chất nguy hiểm</w:t>
+      </w:r>
+      <w:r>
+        <w:t xml:space="preserve"> là hóa chất gây hại cho con người, cơ sở vật chất, tài sản, môi trường và có ít nhất một đặc tính nguy hiểm theo nguyên tắc phân loại do Thủ trưởng cơ quan đầu mối giúp Chính phủ thực hiện quản lý nhà nước ở trung ươn</w:t>
+      </w:r>
+      <w:r>
+        <w:t>g về hóa chất (sau đây gọi chung là Thủ trưởng cơ quan quản lý nhà nước ở trung ương về hóa chất) quy định.</w:t>
+      </w:r>
+    </w:p>
+    <w:p>
+      <w:pPr>
+        <w:spacing w:before="120" w:after="280" w:afterAutospacing="1"/>
+      </w:pPr>
+      <w:bookmarkStart w:id="7" w:name="dieu_5_1"/>
+      <w:r>
+        <w:t>5.</w:t>
+      </w:r>
+      <w:bookmarkEnd w:id="7"/>
+      <w:r>
+        <w:t xml:space="preserve"> </w:t>
+      </w:r>
+      <w:bookmarkStart w:id="8" w:name="dieu_5_1_name"/>
+      <w:r>
+        <w:rPr>
+          <w:i/>
+          <w:iCs/>
+        </w:rPr>
         <w:t>Chất độc</w:t>
       </w:r>
       <w:bookmarkEnd w:id="8"/>
@@ -440,7 +468,10 @@
       </w:r>
       <w:bookmarkStart w:id="9" w:name="dieu_5_1_name_name"/>
       <w:r>
-        <w:t>là hóa chất mà thông qua tác động hóa học của nó lên các quá trình sống có thể gây tử vong, mất năng lực tạm thời hoặc gây tổn thương vĩnh viễn cho con người, theo các tiêu chí cụ thể do Chính phủ quy định.</w:t>
+        <w:t>là hóa chất mà thông qua tác động hóa học của nó lên các quá trình sống có thể gây tử vong, mất năng lực tạm thời hoặc gây tổn thương vĩ</w:t>
+      </w:r>
+      <w:r>
+        <w:t>nh viễn cho con người, theo các tiêu chí cụ thể do Chính phủ quy định.</w:t>
       </w:r>
       <w:bookmarkEnd w:id="9"/>
     </w:p>
@@ -460,7 +491,10 @@
         <w:t>Sản phẩm, hàng hóa chứa hóa chất nguy hiểm</w:t>
       </w:r>
       <w:r>
-        <w:t xml:space="preserve"> là sản phẩm, hàng hóa trong điều kiện sử dụng hợp lý và đúng mục đích vẫn tiềm ẩn khả năng gây hại cho con người, cơ sở vật chất, tài sản, môi trường do thành phần hóa học trong sản phẩm, hàng hóa.</w:t>
+        <w:t xml:space="preserve"> là sản phẩm, hàng hóa trong điều kiện sử dụng hợp lý và đúng mục đích vẫn tiềm ẩn khả năng gây hại cho con người, cơ sở vật chất, tài sản, </w:t>
+      </w:r>
+      <w:r>
+        <w:t>môi trường do thành phần hóa học trong sản phẩm, hàng hóa.</w:t>
       </w:r>
     </w:p>
     <w:p>
@@ -493,174 +527,212 @@
           <w:i/>
           <w:iCs/>
         </w:rPr>
-        <w:t>Sản phẩm hóa dầu</w:t>
-      </w:r>
-      <w:r>
-        <w:t xml:space="preserve"> là sản phẩm hóa chất của quá trình lọc dầu, chế biến dầu mỏ, khí tự nhiên, khí dầu mỏ, than đá hoặc sản phẩm được tạo ra thông qua phản ứng hóa học từ nguồn nguyên liệu là sản phẩm của quá trình lọc dầu, chế biến dầu mỏ, khí tự nhiên, khí dầu mỏ, than đá. Sản phẩm hóa dầu không bao gồm sản phẩm được sử dụng làm nhiên liệu hoặc để tạo ra năng lượng.</w:t>
-      </w:r>
-    </w:p>
-    <w:p>
-      <w:pPr>
-        <w:spacing w:before="120" w:after="280" w:afterAutospacing="1"/>
-      </w:pPr>
-      <w:r>
-        <w:t xml:space="preserve">9. </w:t>
+        <w:t>Sản phẩm hó</w:t>
       </w:r>
       <w:r>
         <w:rPr>
           <w:i/>
           <w:iCs/>
         </w:rPr>
-        <w:t>Sản phẩm hóa dược</w:t>
-      </w:r>
-      <w:r>
-        <w:t xml:space="preserve"> là hóa chất được sử dụng làm nguyên liệu làm thuốc và nguyên liệu làm thực phẩm bảo vệ sức khỏe, được tạo ra từ quá trình hóa học, quá trình chiết xuất hợp chất thiên nhiên, quá trình công nghệ sinh học.</w:t>
-      </w:r>
-    </w:p>
-    <w:p>
-      <w:pPr>
-        <w:spacing w:before="120" w:after="280" w:afterAutospacing="1"/>
-      </w:pPr>
-      <w:r>
-        <w:t xml:space="preserve">10. </w:t>
+        <w:t>a dầu</w:t>
+      </w:r>
+      <w:r>
+        <w:t xml:space="preserve"> là sản phẩm hóa chất của quá trình lọc dầu, chế biến dầu mỏ, khí tự nhiên, khí dầu mỏ, than đá hoặc sản phẩm được tạo ra thông qua phản ứng hóa học từ nguồn nguyên liệu là sản phẩm của quá trình lọc dầu, chế biến dầu mỏ, khí tự nhiên, khí dầu mỏ, tha</w:t>
+      </w:r>
+      <w:r>
+        <w:t>n đá. Sản phẩm hóa dầu không bao gồm sản phẩm được sử dụng làm nhiên liệu hoặc để tạo ra năng lượng.</w:t>
+      </w:r>
+    </w:p>
+    <w:p>
+      <w:pPr>
+        <w:spacing w:before="120" w:after="280" w:afterAutospacing="1"/>
+      </w:pPr>
+      <w:r>
+        <w:t xml:space="preserve">9. </w:t>
       </w:r>
       <w:r>
         <w:rPr>
           <w:i/>
           <w:iCs/>
         </w:rPr>
-        <w:t>Sản phẩm cao su</w:t>
-      </w:r>
-      <w:r>
-        <w:t xml:space="preserve"> gồm cao su tổng hợp; sản phẩm được sản xuất từ cao su thiên nhiên, cao su tổng hợp có yêu cầu kỹ thuật riêng biệt về khuôn mẫu và tính năng.</w:t>
-      </w:r>
-    </w:p>
-    <w:p>
-      <w:pPr>
-        <w:spacing w:before="120" w:after="280" w:afterAutospacing="1"/>
-      </w:pPr>
-      <w:r>
-        <w:t xml:space="preserve">11. </w:t>
+        <w:t>Sản phẩm hóa dược</w:t>
+      </w:r>
+      <w:r>
+        <w:t xml:space="preserve"> là hóa chất được sử dụng làm nguyên liệu làm thuốc và nguyên liệu làm thực phẩm bảo vệ sức khỏe, được tạo ra từ quá trình hóa học, quá</w:t>
+      </w:r>
+      <w:r>
+        <w:t xml:space="preserve"> trình chiết xuất hợp chất thiên nhiên, quá trình công nghệ sinh học.</w:t>
+      </w:r>
+    </w:p>
+    <w:p>
+      <w:pPr>
+        <w:spacing w:before="120" w:after="280" w:afterAutospacing="1"/>
+      </w:pPr>
+      <w:r>
+        <w:t xml:space="preserve">10. </w:t>
       </w:r>
       <w:r>
         <w:rPr>
           <w:i/>
           <w:iCs/>
         </w:rPr>
-        <w:t>Dự án hóa chất</w:t>
-      </w:r>
-      <w:r>
-        <w:t xml:space="preserve"> là dự án đầu tư xây dựng được hình thành và thực hiện với mục tiêu chính để tiến hành hoạt động sản xuất, tồn trữ hóa chất, sản phẩm của ngành công nghiệp hóa chất.</w:t>
-      </w:r>
-    </w:p>
-    <w:p>
-      <w:pPr>
-        <w:spacing w:before="120" w:after="280" w:afterAutospacing="1"/>
-      </w:pPr>
-      <w:r>
-        <w:t xml:space="preserve">12. </w:t>
+        <w:t>Sản phẩm cao su</w:t>
+      </w:r>
+      <w:r>
+        <w:t xml:space="preserve"> gồm cao su tổng hợp; sản phẩm được sản xuất từ cao su thiên nhiên, cao su tổng hợp có yêu cầu kỹ thuật riêng biệt về khuôn mẫu và tính năng.</w:t>
+      </w:r>
+    </w:p>
+    <w:p>
+      <w:pPr>
+        <w:spacing w:before="120" w:after="280" w:afterAutospacing="1"/>
+      </w:pPr>
+      <w:r>
+        <w:t xml:space="preserve">11. </w:t>
       </w:r>
       <w:r>
         <w:rPr>
           <w:i/>
           <w:iCs/>
         </w:rPr>
-        <w:t>Cơ sở hóa chất</w:t>
-      </w:r>
-      <w:r>
-        <w:t xml:space="preserve"> là địa điểm diễn ra một hoặc nhiều hoạt động sản xuất hóa chất, kinh doanh hóa chất, tồn trữ hóa chất, sử dụng hóa chất, xử lý chất thải hóa chất.</w:t>
-      </w:r>
-    </w:p>
-    <w:p>
-      <w:pPr>
-        <w:spacing w:before="120" w:after="280" w:afterAutospacing="1"/>
-      </w:pPr>
-      <w:r>
-        <w:t xml:space="preserve">13. </w:t>
+        <w:t>Dự án hóa chất</w:t>
+      </w:r>
+      <w:r>
+        <w:t xml:space="preserve"> là dự </w:t>
+      </w:r>
+      <w:r>
+        <w:t>án đầu tư xây dựng được hình thành và thực hiện với mục tiêu chính để tiến hành hoạt động sản xuất, tồn trữ hóa chất, sản phẩm của ngành công nghiệp hóa chất.</w:t>
+      </w:r>
+    </w:p>
+    <w:p>
+      <w:pPr>
+        <w:spacing w:before="120" w:after="280" w:afterAutospacing="1"/>
+      </w:pPr>
+      <w:r>
+        <w:t xml:space="preserve">12. </w:t>
       </w:r>
       <w:r>
         <w:rPr>
           <w:i/>
           <w:iCs/>
         </w:rPr>
-        <w:t>Công trình hóa chất</w:t>
-      </w:r>
-      <w:r>
-        <w:t xml:space="preserve"> là một hoặc tập hợp nhiều công trình xây dựng, dây chuyền công nghệ để tiến hành hoạt động sản xuất, tồn trữ hóa chất, sản phẩm của ngành công nghiệp hóa chất.</w:t>
-      </w:r>
-    </w:p>
-    <w:p>
-      <w:pPr>
-        <w:spacing w:before="120" w:after="280" w:afterAutospacing="1"/>
-      </w:pPr>
-      <w:r>
-        <w:t xml:space="preserve">14. </w:t>
+        <w:t>Cơ sở hóa chất</w:t>
+      </w:r>
+      <w:r>
+        <w:t xml:space="preserve"> là địa điểm diễn ra một hoặc nhiều hoạt động sản xuất hóa chất, kinh doanh hóa</w:t>
+      </w:r>
+      <w:r>
+        <w:t xml:space="preserve"> chất, tồn trữ hóa chất, sử dụng hóa chất, xử lý chất thải hóa chất.</w:t>
+      </w:r>
+    </w:p>
+    <w:p>
+      <w:pPr>
+        <w:spacing w:before="120" w:after="280" w:afterAutospacing="1"/>
+      </w:pPr>
+      <w:r>
+        <w:t xml:space="preserve">13. </w:t>
       </w:r>
       <w:r>
         <w:rPr>
           <w:i/>
           <w:iCs/>
         </w:rPr>
-        <w:t>Tổ hợp công trình hóa chất</w:t>
-      </w:r>
-      <w:r>
-        <w:t xml:space="preserve"> là một tập hợp nhiều công trình hóa chất hoặc công trình có hoạt động sử dụng hóa chất, thuộc một dự án hoặc nhiều dự án khác nhau, có mối liên hệ về công nghệ, nguyên liệu, nhiên liệu, sản phẩm.</w:t>
-      </w:r>
-    </w:p>
-    <w:p>
-      <w:pPr>
-        <w:spacing w:before="120" w:after="280" w:afterAutospacing="1"/>
-      </w:pPr>
-      <w:bookmarkStart w:id="10" w:name="khoan_15_2"/>
-      <w:r>
-        <w:t xml:space="preserve">15. </w:t>
+        <w:t>Công trình hóa chất</w:t>
+      </w:r>
+      <w:r>
+        <w:t xml:space="preserve"> là một hoặc tập hợp nhiều công trình xây dựng, dây chuyền công nghệ để tiến hành hoạt động sản xuất, tồn trữ hóa chất, sản phẩm của ngành công nghiệp hóa chất.</w:t>
+      </w:r>
+    </w:p>
+    <w:p>
+      <w:pPr>
+        <w:spacing w:before="120" w:after="280" w:afterAutospacing="1"/>
+      </w:pPr>
+      <w:r>
+        <w:t>14.</w:t>
+      </w:r>
+      <w:r>
+        <w:t xml:space="preserve"> </w:t>
       </w:r>
       <w:r>
         <w:rPr>
           <w:i/>
           <w:iCs/>
         </w:rPr>
-        <w:t>Khu công nghiệp chuyên ngành hóa chất</w:t>
-      </w:r>
-      <w:r>
-        <w:t xml:space="preserve"> là khu công nghiệp chuyên sản xuất và cung ứng dịch vụ cho dự án hóa chất, công trình hóa chất; có diện tích đất công nghiệp đạt tỷ lệ tối thiểu theo quy định của Chính phủ được sử dụng để thu hút dự án hóa chất, công trình hóa chất và dự án sử dụng sản phẩm của ngành công nghiệp hóa chất được sản xuất trong khu công nghiệp làm nguyên liệu, dung môi, chất xúc tác trong quá trình sản xuất.</w:t>
-      </w:r>
-      <w:bookmarkEnd w:id="10"/>
-    </w:p>
-    <w:p>
-      <w:pPr>
-        <w:spacing w:before="120" w:after="280" w:afterAutospacing="1"/>
-      </w:pPr>
-      <w:r>
-        <w:t xml:space="preserve">16. </w:t>
+        <w:t>Tổ hợp công trình hóa chất</w:t>
+      </w:r>
+      <w:r>
+        <w:t xml:space="preserve"> là một tập hợp nhiều công trình hóa chất hoặc công trình có hoạt động sử dụng hóa chất, thuộc một dự án hoặc nhiều dự án khác nhau, có mối liên hệ về công nghệ, nguyên liệu, nhiên liệu, sản phẩm.</w:t>
+      </w:r>
+    </w:p>
+    <w:p>
+      <w:pPr>
+        <w:spacing w:before="120" w:after="280" w:afterAutospacing="1"/>
+      </w:pPr>
+      <w:bookmarkStart w:id="10" w:name="khoan_15_2"/>
+      <w:r>
+        <w:t xml:space="preserve">15. </w:t>
       </w:r>
       <w:r>
         <w:rPr>
           <w:i/>
           <w:iCs/>
         </w:rPr>
-        <w:t>Hoạt động hóa chất</w:t>
-      </w:r>
-      <w:r>
-        <w:t xml:space="preserve"> gồm hoạt động nghiên cứu hóa chất, thử nghiệm hóa chất, sản xuất hóa chất, kinh doanh hóa chất, vận chuyển hóa chất, tồn trữ hóa chất, sử dụng hóa chất, xử lý chất thải hóa chất, tiêu hủy hóa chất, thải bỏ hóa chất.</w:t>
-      </w:r>
-    </w:p>
-    <w:p>
-      <w:pPr>
-        <w:spacing w:before="120" w:after="280" w:afterAutospacing="1"/>
-      </w:pPr>
-      <w:r>
-        <w:t xml:space="preserve">17. </w:t>
+        <w:t>Khu công nghiệp chuyên ngành</w:t>
       </w:r>
       <w:r>
         <w:rPr>
           <w:i/>
           <w:iCs/>
         </w:rPr>
+        <w:t xml:space="preserve"> hóa chất</w:t>
+      </w:r>
+      <w:r>
+        <w:t xml:space="preserve"> là khu công nghiệp chuyên sản xuất và cung ứng dịch vụ cho dự án hóa chất, công trình hóa chất; có diện tích đất công nghiệp đạt tỷ lệ tối thiểu theo quy định của Chính phủ được sử dụng để thu hút dự án hóa chất, công trình hóa chất và dự án sử d</w:t>
+      </w:r>
+      <w:r>
+        <w:t>ụng sản phẩm của ngành công nghiệp hóa chất được sản xuất trong khu công nghiệp làm nguyên liệu, dung môi, chất xúc tác trong quá trình sản xuất.</w:t>
+      </w:r>
+      <w:bookmarkEnd w:id="10"/>
+    </w:p>
+    <w:p>
+      <w:pPr>
+        <w:spacing w:before="120" w:after="280" w:afterAutospacing="1"/>
+      </w:pPr>
+      <w:r>
+        <w:t xml:space="preserve">16. </w:t>
+      </w:r>
+      <w:r>
+        <w:rPr>
+          <w:i/>
+          <w:iCs/>
+        </w:rPr>
+        <w:t>Hoạt động hóa chất</w:t>
+      </w:r>
+      <w:r>
+        <w:t xml:space="preserve"> gồm hoạt động nghiên cứu hóa chất, thử nghiệm hóa chất, sản xuất hóa chất, kinh doanh h</w:t>
+      </w:r>
+      <w:r>
+        <w:t>óa chất, vận chuyển hóa chất, tồn trữ hóa chất, sử dụng hóa chất, xử lý chất thải hóa chất, tiêu hủy hóa chất, thải bỏ hóa chất.</w:t>
+      </w:r>
+    </w:p>
+    <w:p>
+      <w:pPr>
+        <w:spacing w:before="120" w:after="280" w:afterAutospacing="1"/>
+      </w:pPr>
+      <w:r>
+        <w:t xml:space="preserve">17. </w:t>
+      </w:r>
+      <w:r>
+        <w:rPr>
+          <w:i/>
+          <w:iCs/>
+        </w:rPr>
         <w:t>Sản xuất hóa chất</w:t>
       </w:r>
       <w:r>
-        <w:t xml:space="preserve"> gồm việc tạo ra hóa chất thông qua quá trình hóa học, quá trình công nghệ sinh học, pha chế, trích ly, cô đặc, chưng cất, chiết xuất, tinh chế hóa chất; gia công hóa chất; san chiết hóa chất. Sản xuất hóa chất không gồm hoạt động phát thải hóa chất không chủ đích.</w:t>
+        <w:t xml:space="preserve"> gồm việc tạo ra hóa chất thông qua quá trình hóa học, quá trình công nghệ sinh học, pha chế, trích ly, cô đặc, chưng cất, chiết xuất, tinh chế hóa chất; gia công hóa chất; san chiết hóa chất. Sản xuất hóa chất không gồm hoạt động phát thải hóa chất không </w:t>
+      </w:r>
+      <w:r>
+        <w:t>chủ đích.</w:t>
       </w:r>
     </w:p>
     <w:p>
@@ -715,7 +787,10 @@
         <w:t>Dịch vụ tồn trữ hóa chất</w:t>
       </w:r>
       <w:r>
-        <w:t xml:space="preserve"> là hoạt động cho thuê cơ sở vật chất để tồn trữ hóa chất cho tổ chức, cá nhân khác.</w:t>
+        <w:t xml:space="preserve"> là hoạt động cho thuê cơ sở vật chất để tồn trữ hóa chất </w:t>
+      </w:r>
+      <w:r>
+        <w:t>cho tổ chức, cá nhân khác.</w:t>
       </w:r>
     </w:p>
     <w:p>
@@ -751,7 +826,10 @@
         <w:t>An toàn hóa chất</w:t>
       </w:r>
       <w:r>
-        <w:t xml:space="preserve"> là việc áp dụng quy định, biện pháp nhằm mục tiêu không xảy ra ảnh hưởng tiêu cực đối với con người, cơ sở vật chất, tài sản, môi trường trong hoạt động hóa chất.</w:t>
+        <w:t xml:space="preserve"> </w:t>
+      </w:r>
+      <w:r>
+        <w:t>là việc áp dụng quy định, biện pháp nhằm mục tiêu không xảy ra ảnh hưởng tiêu cực đối với con người, cơ sở vật chất, tài sản, môi trường trong hoạt động hóa chất.</w:t>
       </w:r>
     </w:p>
     <w:p>
@@ -769,7 +847,10 @@
         <w:t>An ninh hóa chất</w:t>
       </w:r>
       <w:r>
-        <w:t xml:space="preserve"> là việc áp dụng quy định, biện pháp nhằm mục tiêu ngăn chặn việc sở hữu bất hợp pháp và sử dụng sai mục đích hóa chất, thiết bị hóa học để duy trì trạng thái ổn định, an toàn, không có dấu hiệu nguy hiểm, không đe dọa sự tồn tại và phát triển bình thường của tổ chức, cá nhân hoặc của xã hội.</w:t>
+        <w:t xml:space="preserve"> là việc áp dụng quy định, biện pháp nhằm mục tiêu ngăn chặn việc sở hữu </w:t>
+      </w:r>
+      <w:r>
+        <w:t>bất hợp pháp và sử dụng sai mục đích hóa chất, thiết bị hóa học để duy trì trạng thái ổn định, an toàn, không có dấu hiệu nguy hiểm, không đe dọa sự tồn tại và phát triển bình thường của tổ chức, cá nhân hoặc của xã hội.</w:t>
       </w:r>
     </w:p>
     <w:p>
@@ -787,7 +868,10 @@
         <w:t>Sự cố hóa chất</w:t>
       </w:r>
       <w:r>
-        <w:t xml:space="preserve"> là tình trạng cháy, nổ, rò rỉ, phát tán hóa chất gây hại hoặc có nguy cơ gây hại cho con người, cơ sở vật chất, tài sản, môi trường.</w:t>
+        <w:t xml:space="preserve"> là tình trạng ch</w:t>
+      </w:r>
+      <w:r>
+        <w:t>áy, nổ, rò rỉ, phát tán hóa chất gây hại hoặc có nguy cơ gây hại cho con người, cơ sở vật chất, tài sản, môi trường.</w:t>
       </w:r>
     </w:p>
     <w:p>
@@ -809,7 +893,10 @@
         <w:spacing w:before="120" w:after="280" w:afterAutospacing="1"/>
       </w:pPr>
       <w:r>
-        <w:t>1. Chiếm đoạt hóa chất; sản xuất, kinh doanh, vận chuyển, tồn trữ, sử dụng, mua, bán, trao đổi, tặng cho, gửi, mượn, cho mượn, thuê, cho thuê, cầm cố hóa chất trái pháp luật.</w:t>
+        <w:t>1. Chiếm đoạt hóa chất; sản xuất, kinh doanh, vận chuyển, tồn trữ, sử dụng, mua, bán, trao đổi, tặng cho,</w:t>
+      </w:r>
+      <w:r>
+        <w:t xml:space="preserve"> gửi, mượn, cho mượn, thuê, cho thuê, cầm cố hóa chất trái pháp luật.</w:t>
       </w:r>
     </w:p>
     <w:p>
@@ -825,23 +912,32 @@
         <w:spacing w:before="120" w:after="280" w:afterAutospacing="1"/>
       </w:pPr>
       <w:r>
-        <w:t>3. Không cung cấp hoặc cố ý cung cấp không đầy đủ, không kịp thời, sai lệch thông tin về đặc tính nguy hiểm của hóa chất; sản phẩm, hàng hóa chứa hóa chất nguy hiểm; việc mất, thất thoát hóa chất nguy hiểm; sự cố hóa chất.</w:t>
-      </w:r>
-    </w:p>
-    <w:p>
-      <w:pPr>
-        <w:spacing w:before="120" w:after="280" w:afterAutospacing="1"/>
-      </w:pPr>
-      <w:r>
-        <w:t>4. Sử dụng hóa chất không rõ nguồn gốc, hóa chất không được sử dụng để sản xuất, kinh doanh và bảo quản thực phẩm, thuốc, nguyên liệu làm thuốc, mỹ phẩm, thức ăn chăn nuôi, thức ăn thủy sản, thuốc thú y, thuốc bảo vệ thực vật, phân bón, sản phẩm hóa chất tiêu dùng.</w:t>
-      </w:r>
-    </w:p>
-    <w:p>
-      <w:pPr>
-        <w:spacing w:before="120" w:after="280" w:afterAutospacing="1"/>
-      </w:pPr>
-      <w:r>
-        <w:t>5. Sản xuất, nhập khẩu sản phẩm, hàng hóa có hàm lượng hóa chất nguy hiểm không tuân thủ quy định của Luật này làm ảnh hưởng nghiêm trọng đến con người, cơ sở vật chất, tài sản, môi trường.</w:t>
+        <w:t xml:space="preserve">3. Không cung cấp hoặc </w:t>
+      </w:r>
+      <w:r>
+        <w:t>cố ý cung cấp không đầy đủ, không kịp thời, sai lệch thông tin về đặc tính nguy hiểm của hóa chất; sản phẩm, hàng hóa chứa hóa chất nguy hiểm; việc mất, thất thoát hóa chất nguy hiểm; sự cố hóa chất.</w:t>
+      </w:r>
+    </w:p>
+    <w:p>
+      <w:pPr>
+        <w:spacing w:before="120" w:after="280" w:afterAutospacing="1"/>
+      </w:pPr>
+      <w:r>
+        <w:t>4. Sử dụng hóa chất không rõ nguồn gốc, hóa chất không đ</w:t>
+      </w:r>
+      <w:r>
+        <w:t>ược sử dụng để sản xuất, kinh doanh và bảo quản thực phẩm, thuốc, nguyên liệu làm thuốc, mỹ phẩm, thức ăn chăn nuôi, thức ăn thủy sản, thuốc thú y, thuốc bảo vệ thực vật, phân bón, sản phẩm hóa chất tiêu dùng.</w:t>
+      </w:r>
+    </w:p>
+    <w:p>
+      <w:pPr>
+        <w:spacing w:before="120" w:after="280" w:afterAutospacing="1"/>
+      </w:pPr>
+      <w:r>
+        <w:t>5. Sản xuất, nhập khẩu sản phẩm, hàng hóa có h</w:t>
+      </w:r>
+      <w:r>
+        <w:t>àm lượng hóa chất nguy hiểm không tuân thủ quy định của Luật này làm ảnh hưởng nghiêm trọng đến con người, cơ sở vật chất, tài sản, môi trường.</w:t>
       </w:r>
     </w:p>
     <w:p>
@@ -858,7 +954,10 @@
         <w:spacing w:before="120" w:after="280" w:afterAutospacing="1"/>
       </w:pPr>
       <w:r>
-        <w:t>7. Sản xuất, kinh doanh, sử dụng hóa chất làm ảnh hưởng nghiêm trọng đến con người, cơ sở vật chất, tài sản, môi trường; xâm phạm an ninh quốc gia, an ninh hóa chất, trật tự, an toàn xã hội; quyền và lợi ích hợp pháp của cơ quan, tổ chức, cá nhân.</w:t>
+        <w:t>7. Sản x</w:t>
+      </w:r>
+      <w:r>
+        <w:t>uất, kinh doanh, sử dụng hóa chất làm ảnh hưởng nghiêm trọng đến con người, cơ sở vật chất, tài sản, môi trường; xâm phạm an ninh quốc gia, an ninh hóa chất, trật tự, an toàn xã hội; quyền và lợi ích hợp pháp của cơ quan, tổ chức, cá nhân.</w:t>
       </w:r>
     </w:p>
     <w:p>
@@ -886,7 +985,14 @@
           <w:b/>
           <w:bCs/>
         </w:rPr>
-        <w:t>PHÁT TRIỂN NGÀNH CÔNG NGHIỆP HÓA CHẤT</w:t>
+        <w:t>PHÁT T</w:t>
+      </w:r>
+      <w:r>
+        <w:rPr>
+          <w:b/>
+          <w:bCs/>
+        </w:rPr>
+        <w:t>RIỂN NGÀNH CÔNG NGHIỆP HÓA CHẤT</w:t>
       </w:r>
       <w:bookmarkEnd w:id="13"/>
     </w:p>
@@ -909,7 +1015,13 @@
         <w:spacing w:before="120" w:after="280" w:afterAutospacing="1"/>
       </w:pPr>
       <w:r>
-        <w:t>1. Chiến lược phát triển ngành công nghiệp hóa chất đã được phê duyệt là căn cứ để xây dựng phương hướng phát triển ngành có lợi thế của vùng và phương án phát triển, sắp xếp, lựa chọn, phân bố nguồn lực phát triển trên địa bàn vùng thuộc nội dung của quy hoạch vùng; xây dựng phương hướng phát triển ngành quan trọng trên địa bàn tỉnh, lựa chọn phương án tổ chức hoạt động kinh tế - xã hội và xây dựng phương án phát triển hệ thống khu kinh tế, khu công nghiệp, khu chế xuất, khu công nghệ cao trên địa bàn tỉnh thuộc nội dung của quy hoạch tỉnh; quyết định chủ trương đầu tư hoặc chấp thuận chủ trương đầu tư dự án hóa chất.</w:t>
+        <w:t xml:space="preserve">1. Chiến lược phát triển ngành công nghiệp hóa chất đã được phê duyệt là căn cứ để xây dựng phương hướng phát triển ngành có lợi thế của vùng và phương án phát triển, </w:t>
+      </w:r>
+      <w:r>
+        <w:t>sắp xếp, lựa chọn, phân bố nguồn lực phát triển trên địa bàn vùng thuộc nội dung của quy hoạch vùng; xây dựng phương hướng phát triển ngành quan trọng trên địa bàn tỉnh, lựa chọn phương án tổ chức hoạt động kinh tế - xã hội và xây dựng phương án phát triển</w:t>
+      </w:r>
+      <w:r>
+        <w:t xml:space="preserve"> hệ thống khu kinh tế, khu công nghiệp, khu chế xuất, khu công nghệ cao trên địa bàn tỉnh thuộc nội dung của quy hoạch tỉnh; quyết định chủ trương đầu tư hoặc chấp thuận chủ trương đầu tư dự án hóa chất.</w:t>
       </w:r>
     </w:p>
     <w:p>
@@ -918,7 +1030,10 @@
       </w:pPr>
       <w:bookmarkStart w:id="15" w:name="khoan_2_4"/>
       <w:r>
-        <w:t>2. Chiến lược phát triển ngành công nghiệp hóa chất phải bảo đảm các yêu cầu sau đây:</w:t>
+        <w:t xml:space="preserve">2. Chiến lược phát triển ngành công nghiệp hóa chất </w:t>
+      </w:r>
+      <w:r>
+        <w:t>phải bảo đảm các yêu cầu sau đây:</w:t>
       </w:r>
       <w:bookmarkEnd w:id="15"/>
     </w:p>
@@ -943,7 +1058,10 @@
         <w:spacing w:before="120" w:after="280" w:afterAutospacing="1"/>
       </w:pPr>
       <w:r>
-        <w:t>c) Bảo đảm quốc phòng, an ninh, bảo vệ môi trường và phát triển bền vững.</w:t>
+        <w:t>c) Bảo đảm quốc phòng, an n</w:t>
+      </w:r>
+      <w:r>
+        <w:t>inh, bảo vệ môi trường và phát triển bền vững.</w:t>
       </w:r>
     </w:p>
     <w:p>
@@ -967,15 +1085,21 @@
         <w:spacing w:before="120" w:after="280" w:afterAutospacing="1"/>
       </w:pPr>
       <w:r>
-        <w:t>b) Định hướng hình thành các khu công nghiệp chuyên ngành hóa chất, phù hợp với điều kiện tự nhiên, điều kiện kinh tế - xã hội của các địa phương và đáp ứng yêu cầu an toàn hóa chất;</w:t>
-      </w:r>
-    </w:p>
-    <w:p>
-      <w:pPr>
-        <w:spacing w:before="120" w:after="280" w:afterAutospacing="1"/>
-      </w:pPr>
-      <w:r>
-        <w:t>c) Nhiệm vụ, giải pháp thực hiện quan điểm, mục tiêu, định hướng phát triển ngành công nghiệp hóa chất.</w:t>
+        <w:t>b)</w:t>
+      </w:r>
+      <w:r>
+        <w:t xml:space="preserve"> Định hướng hình thành các khu công nghiệp chuyên ngành hóa chất, phù hợp với điều kiện tự nhiên, điều kiện kinh tế - xã hội của các địa phương và đáp ứng yêu cầu an toàn hóa chất;</w:t>
+      </w:r>
+    </w:p>
+    <w:p>
+      <w:pPr>
+        <w:spacing w:before="120" w:after="280" w:afterAutospacing="1"/>
+      </w:pPr>
+      <w:r>
+        <w:t>c) Nhiệm vụ, giải pháp thực hiện quan điểm, mục tiêu, định hướng phát triển</w:t>
+      </w:r>
+      <w:r>
+        <w:t xml:space="preserve"> ngành công nghiệp hóa chất.</w:t>
       </w:r>
     </w:p>
     <w:p>
@@ -1054,7 +1178,10 @@
         <w:spacing w:before="120" w:after="280" w:afterAutospacing="1"/>
       </w:pPr>
       <w:r>
-        <w:t>a) Tuân thủ quy định tại khoản 1 Điều này;</w:t>
+        <w:t>a) Tuân t</w:t>
+      </w:r>
+      <w:r>
+        <w:t>hủ quy định tại khoản 1 Điều này;</w:t>
       </w:r>
     </w:p>
     <w:p>
@@ -1070,15 +1197,21 @@
         <w:spacing w:before="120" w:after="280" w:afterAutospacing="1"/>
       </w:pPr>
       <w:r>
-        <w:t>c) Xây dựng và thực hiện Kế hoạch phòng ngừa, ứng phó sự cố hóa chất hoặc Biện pháp phòng ngừa, ứng phó sự cố hóa chất theo quy định tại Mục 2 Chương VI của Luật này;</w:t>
-      </w:r>
-    </w:p>
-    <w:p>
-      <w:pPr>
-        <w:spacing w:before="120" w:after="280" w:afterAutospacing="1"/>
-      </w:pPr>
-      <w:r>
-        <w:t>d) Áp dụng bộ nguyên tắc trong thiết kế, lựa chọn công nghệ, thiết bị, quy trình sản xuất, sử dụng và thải bỏ hóa chất nhằm giảm thiểu hoặc loại bỏ việc sử dụng và tạo ra hóa chất nguy hiểm (sau đây gọi là nguyên tắc hóa học xanh).</w:t>
+        <w:t>c) Xây dựng và thực hiện Kế hoạch phòng ngừa,</w:t>
+      </w:r>
+      <w:r>
+        <w:t xml:space="preserve"> ứng phó sự cố hóa chất hoặc Biện pháp phòng ngừa, ứng phó sự cố hóa chất theo quy định tại Mục 2 Chương VI của Luật này;</w:t>
+      </w:r>
+    </w:p>
+    <w:p>
+      <w:pPr>
+        <w:spacing w:before="120" w:after="280" w:afterAutospacing="1"/>
+      </w:pPr>
+      <w:r>
+        <w:t>d) Áp dụng bộ nguyên tắc trong thiết kế, lựa chọn công nghệ, thiết bị, quy trình sản xuất, sử dụng và thải bỏ hóa chất nhằm giảm thiểu</w:t>
+      </w:r>
+      <w:r>
+        <w:t xml:space="preserve"> hoặc loại bỏ việc sử dụng và tạo ra hóa chất nguy hiểm (sau đây gọi là nguyên tắc hóa học xanh).</w:t>
       </w:r>
     </w:p>
     <w:p>
@@ -1094,15 +1227,21 @@
       </w:r>
       <w:bookmarkEnd w:id="20"/>
       <w:r>
-        <w:t>, trong quá trình quyết định chủ trương đầu tư hoặc chấp thuận chủ trương đầu tư, cơ quan có thẩm quyền đánh giá sự phù hợp địa điểm của dự án hóa chất với quy định về khoảng cách an toàn.</w:t>
-      </w:r>
-    </w:p>
-    <w:p>
-      <w:pPr>
-        <w:spacing w:before="120" w:after="280" w:afterAutospacing="1"/>
-      </w:pPr>
-      <w:r>
-        <w:t xml:space="preserve">4. Báo cáo nghiên cứu khả thi đầu tư xây dựng, Báo cáo kinh tế - kỹ thuật đầu tư xây dựng của dự án hóa chất được thực hiện theo quy định của </w:t>
+        <w:t>, trong quá trình qu</w:t>
+      </w:r>
+      <w:r>
+        <w:t>yết định chủ trương đầu tư hoặc chấp thuận chủ trương đầu tư, cơ quan có thẩm quyền đánh giá sự phù hợp địa điểm của dự án hóa chất với quy định về khoảng cách an toàn.</w:t>
+      </w:r>
+    </w:p>
+    <w:p>
+      <w:pPr>
+        <w:spacing w:before="120" w:after="280" w:afterAutospacing="1"/>
+      </w:pPr>
+      <w:r>
+        <w:t>4. Báo cáo nghiên cứu khả thi đầu tư xây dựng, Báo cáo kinh tế - kỹ thuật đầu tư xây dự</w:t>
+      </w:r>
+      <w:r>
+        <w:t xml:space="preserve">ng của dự án hóa chất được thực hiện theo quy định của </w:t>
       </w:r>
       <w:bookmarkStart w:id="21" w:name="tvpllink_mdzzpwjltw_1"/>
       <w:r>
@@ -1126,7 +1265,10 @@
         <w:spacing w:before="120" w:after="280" w:afterAutospacing="1"/>
       </w:pPr>
       <w:r>
-        <w:t>b) Nguyên tắc hóa học xanh đã được áp dụng trong thiết kế và lựa chọn công nghệ, thiết bị.</w:t>
+        <w:t xml:space="preserve">b) Nguyên tắc hóa học xanh đã được áp dụng trong thiết kế và lựa chọn công </w:t>
+      </w:r>
+      <w:r>
+        <w:t>nghệ, thiết bị.</w:t>
       </w:r>
     </w:p>
     <w:p>
@@ -1166,15 +1308,21 @@
         <w:spacing w:before="120" w:after="280" w:afterAutospacing="1"/>
       </w:pPr>
       <w:r>
-        <w:t>a) Sản xuất sản phẩm công nghiệp hóa chất trọng điểm gồm: sản phẩm hóa chất cơ bản thuộc trường hợp quy định tại khoản 2 Điều này; sản phẩm hóa dầu; sản phẩm hóa dược; sản phẩm cao su, trừ sản phẩm săm, lốp; phân bón hàm lượng cao; hydro, amoniac được sản xuất bằng nguồn năng lượng tái tạo;</w:t>
-      </w:r>
-    </w:p>
-    <w:p>
-      <w:pPr>
-        <w:spacing w:before="120" w:after="280" w:afterAutospacing="1"/>
-      </w:pPr>
-      <w:r>
-        <w:t>b) Đầu tư khu công nghiệp chuyên ngành hóa chất;</w:t>
+        <w:t xml:space="preserve">a) Sản xuất sản phẩm công nghiệp hóa chất trọng điểm gồm: sản </w:t>
+      </w:r>
+      <w:r>
+        <w:t>phẩm hóa chất cơ bản thuộc trường hợp quy định tại khoản 2 Điều này; sản phẩm hóa dầu; sản phẩm hóa dược; sản phẩm cao su, trừ sản phẩm săm, lốp; phân bón hàm lượng cao; hydro, amoniac được sản xuất bằng nguồn năng lượng tái tạo;</w:t>
+      </w:r>
+    </w:p>
+    <w:p>
+      <w:pPr>
+        <w:spacing w:before="120" w:after="280" w:afterAutospacing="1"/>
+      </w:pPr>
+      <w:r>
+        <w:t xml:space="preserve">b) Đầu tư khu công nghiệp </w:t>
+      </w:r>
+      <w:r>
+        <w:t>chuyên ngành hóa chất;</w:t>
       </w:r>
     </w:p>
     <w:p>
@@ -1208,7 +1356,10 @@
       </w:pPr>
       <w:bookmarkStart w:id="25" w:name="khoan_2_6"/>
       <w:r>
-        <w:t>2. Chính phủ quy định danh mục hóa chất cơ bản thuộc lĩnh vực công nghiệp hóa chất trọng điểm theo một trong các tiêu chí sau đây:</w:t>
+        <w:t>2</w:t>
+      </w:r>
+      <w:r>
+        <w:t>. Chính phủ quy định danh mục hóa chất cơ bản thuộc lĩnh vực công nghiệp hóa chất trọng điểm theo một trong các tiêu chí sau đây:</w:t>
       </w:r>
       <w:bookmarkEnd w:id="25"/>
     </w:p>
@@ -1217,7 +1368,10 @@
         <w:spacing w:before="120" w:after="280" w:afterAutospacing="1"/>
       </w:pPr>
       <w:r>
-        <w:t>a) Hóa chất cơ bản được sử dụng trong nhiều ngành, lĩnh vực nhưng trong nước chưa sản xuất được hoặc sản xuất trong nước chưa đáp ứng đủ nhu cầu;</w:t>
+        <w:t xml:space="preserve">a) Hóa chất cơ bản được sử dụng trong nhiều ngành, lĩnh vực nhưng trong nước chưa sản xuất được hoặc sản xuất trong nước chưa </w:t>
+      </w:r>
+      <w:r>
+        <w:t>đáp ứng đủ nhu cầu;</w:t>
       </w:r>
     </w:p>
     <w:p>
@@ -1234,7 +1388,10 @@
       </w:pPr>
       <w:bookmarkStart w:id="26" w:name="khoan_3_6"/>
       <w:r>
-        <w:t>3. Dự án đầu tư thuộc lĩnh vực quy định tại các điểm a, b và c khoản 1 Điều này có quy mô vốn đầu tư, tiến độ giải ngân theo quy định của Chính phủ được hưởng các hình thức ưu đãi và hỗ trợ đầu tư đặc biệt theo quy định tại</w:t>
+        <w:t>3. Dự án đầu tư thuộc lĩnh vực quy định tại các điểm a, b và c khoản 1 Điều này có quy mô vốn đầu tư, tiến độ giải ngân theo quy định của Chính phủ được hưởng các hình th</w:t>
+      </w:r>
+      <w:r>
+        <w:t>ức ưu đãi và hỗ trợ đầu tư đặc biệt theo quy định tại</w:t>
       </w:r>
       <w:bookmarkEnd w:id="26"/>
       <w:r>
@@ -1273,7 +1430,10 @@
         <w:spacing w:before="120" w:after="280" w:afterAutospacing="1"/>
       </w:pPr>
       <w:r>
-        <w:t>Hoạt động tư vấn chuyên ngành hóa chất thuộc Danh mục ngành, nghề đầu tư kinh doanh có điều kiện bao gồm:</w:t>
+        <w:t>Hoạt động tư vấn chuyên ngành hóa chất thuộc Danh mục ngành, nghề đầu tư kinh doanh có điều kiện b</w:t>
+      </w:r>
+      <w:r>
+        <w:t>ao gồm:</w:t>
       </w:r>
     </w:p>
     <w:p>
@@ -1289,15 +1449,21 @@
         <w:spacing w:before="120" w:after="280" w:afterAutospacing="1"/>
       </w:pPr>
       <w:r>
-        <w:t>2. Tư vấn lựa chọn công nghệ, thiết bị đối với dự án hóa chất;</w:t>
-      </w:r>
-    </w:p>
-    <w:p>
-      <w:pPr>
-        <w:spacing w:before="120" w:after="280" w:afterAutospacing="1"/>
-      </w:pPr>
-      <w:r>
-        <w:t>3. Tư vấn an toàn, an ninh hóa chất gồm: lập Kế hoạch phòng ngừa, ứng phó sự cố hóa chất, Biện pháp phòng ngừa, ứng phó sự cố hóa chất; tổ chức diễn tập ứng phó sự cố hóa chất; huấn luyện an toàn về chuyên ngành hóa chất; phân loại và ghi nhãn hóa chất; lập phiếu an toàn hóa chất; đăng ký hóa chất mới.</w:t>
+        <w:t>2. Tư vấn lựa chọn công ng</w:t>
+      </w:r>
+      <w:r>
+        <w:t>hệ, thiết bị đối với dự án hóa chất;</w:t>
+      </w:r>
+    </w:p>
+    <w:p>
+      <w:pPr>
+        <w:spacing w:before="120" w:after="280" w:afterAutospacing="1"/>
+      </w:pPr>
+      <w:r>
+        <w:t>3. Tư vấn an toàn, an ninh hóa chất gồm: lập Kế hoạch phòng ngừa, ứng phó sự cố hóa chất, Biện pháp phòng ngừa, ứng phó sự cố hóa chất; tổ chức diễn tập ứng phó sự cố hóa chất; huấn luyện an toàn về chuyên ngành hóa chấ</w:t>
+      </w:r>
+      <w:r>
+        <w:t>t; phân loại và ghi nhãn hóa chất; lập phiếu an toàn hóa chất; đăng ký hóa chất mới.</w:t>
       </w:r>
     </w:p>
     <w:p>
@@ -1343,7 +1509,10 @@
         <w:spacing w:before="120" w:after="280" w:afterAutospacing="1"/>
       </w:pPr>
       <w:r>
-        <w:t>b) Có năng lực hoạt động xây dựng theo quy định của pháp luật về xây dựng;</w:t>
+        <w:t>b) Có năng lực hoạt động xây dựng theo quy định của pháp luật về xây dựn</w:t>
+      </w:r>
+      <w:r>
+        <w:t>g;</w:t>
       </w:r>
     </w:p>
     <w:p>
@@ -1361,7 +1530,10 @@
       <w:bookmarkStart w:id="32" w:name="khoan_2_8"/>
       <w:r>
         <w:lastRenderedPageBreak/>
-        <w:t>2. Tổ chức thực hiện hoạt động tư vấn chuyên ngành hóa chất quy định tại</w:t>
+        <w:t>2. Tổ chức thực h</w:t>
+      </w:r>
+      <w:r>
+        <w:t>iện hoạt động tư vấn chuyên ngành hóa chất quy định tại</w:t>
       </w:r>
       <w:bookmarkEnd w:id="32"/>
       <w:r>
@@ -1394,7 +1566,10 @@
         <w:spacing w:before="120" w:after="280" w:afterAutospacing="1"/>
       </w:pPr>
       <w:r>
-        <w:t>b) Có đội ngũ tư vấn viên đáp ứng điều kiện quy định tại khoản 3 Điều này với số lượng phù hợp;</w:t>
+        <w:t>b) Có đội ngũ tư vấn viên đáp ứng điều kiện quy định tại khoản 3 Điều này với số</w:t>
+      </w:r>
+      <w:r>
+        <w:t xml:space="preserve"> lượng phù hợp;</w:t>
       </w:r>
     </w:p>
     <w:p>
@@ -1427,7 +1602,10 @@
       </w:r>
       <w:bookmarkStart w:id="37" w:name="khoan_3_8_name"/>
       <w:r>
-        <w:t>phải có chứng chỉ tư vấn chuyên ngành hóa chất. Điều kiện để cá nhân được cơ quan có thẩm quyền quy định tại khoản 5 Điều này cấp chứng chỉ tư vấn chuyên ngành hóa chất bao gồm:</w:t>
+        <w:t>phải có chứng chỉ tư vấn chuyên ngành h</w:t>
+      </w:r>
+      <w:r>
+        <w:t>óa chất. Điều kiện để cá nhân được cơ quan có thẩm quyền quy định tại khoản 5 Điều này cấp chứng chỉ tư vấn chuyên ngành hóa chất bao gồm:</w:t>
       </w:r>
       <w:bookmarkEnd w:id="37"/>
     </w:p>
@@ -1444,7 +1622,10 @@
         <w:spacing w:before="120" w:after="280" w:afterAutospacing="1"/>
       </w:pPr>
       <w:r>
-        <w:t>b) Có kinh nghiệm công tác phù hợp trong lĩnh vực liên quan đến hoạt động tư vấn chuyên ngành hóa chất.</w:t>
+        <w:t>b) Có kinh nghiệm công tác phù hợp trong lĩnh vực liên quan đ</w:t>
+      </w:r>
+      <w:r>
+        <w:t>ến hoạt động tư vấn chuyên ngành hóa chất.</w:t>
       </w:r>
     </w:p>
     <w:p>
@@ -1461,7 +1642,10 @@
       </w:pPr>
       <w:bookmarkStart w:id="38" w:name="khoan_5_8"/>
       <w:r>
-        <w:t>5. Chính phủ quy định chi tiết các khoản 1, 2 và 3 Điều này; quy định nội dung chứng chỉ tư vấn chuyên ngành hóa chất; quy định trình tự, thủ tục, thẩm quyền cấp, cấp lại, điều chỉnh, thu hồi chứng chỉ tư vấn chuyên ngành hóa chất.</w:t>
+        <w:t>5. Chính phủ quy định chi tiết các khoản 1, 2 và 3 Điều này; quy định nội dung chứng chỉ tư vấn chuyên ngành hóa chất; quy định trình tự</w:t>
+      </w:r>
+      <w:r>
+        <w:t>, thủ tục, thẩm quyền cấp, cấp lại, điều chỉnh, thu hồi chứng chỉ tư vấn chuyên ngành hóa chất.</w:t>
       </w:r>
       <w:bookmarkEnd w:id="38"/>
     </w:p>
@@ -1520,7 +1704,10 @@
         <w:spacing w:before="120" w:after="280" w:afterAutospacing="1"/>
       </w:pPr>
       <w:r>
-        <w:t>1. Phạm vi, yêu cầu đối với hóa chất có điều kiện được quy định như sau:</w:t>
+        <w:t>1. Phạm vi, yêu cầu</w:t>
+      </w:r>
+      <w:r>
+        <w:t xml:space="preserve"> đối với hóa chất có điều kiện được quy định như sau:</w:t>
       </w:r>
     </w:p>
     <w:p>
@@ -1538,7 +1725,10 @@
         <w:spacing w:before="120" w:after="280" w:afterAutospacing="1"/>
       </w:pPr>
       <w:r>
-        <w:t>b) Hoạt động hóa chất đối với hóa chất có điều kiện phải tuân thủ quy định về an toàn, bảo vệ môi trường quy định tại Luật này và quy định khác của pháp luật có liên quan.</w:t>
+        <w:t>b) Hoạt động hóa chất đối với hóa chất có điều kiện phải tuân</w:t>
+      </w:r>
+      <w:r>
+        <w:t xml:space="preserve"> thủ quy định về an toàn, bảo vệ môi trường quy định tại Luật này và quy định khác của pháp luật có liên quan.</w:t>
       </w:r>
     </w:p>
     <w:p>
@@ -1555,11 +1745,17 @@
       </w:pPr>
       <w:bookmarkStart w:id="43" w:name="diem_a_2_9"/>
       <w:r>
-        <w:t xml:space="preserve">a) Hóa chất cần kiểm soát đặc biệt gồm chất và hỗn hợp chất nguy hiểm thuộc Danh mục hóa chất cần kiểm soát đặc biệt do Chính phủ ban hành, gồm: hóa chất thuộc đối tượng kiểm soát để thực thi điều ước quốc tế về hóa chất mà nước Cộng hòa xã hội chủ nghĩa Việt Nam là thành </w:t>
+        <w:t>a) Hóa chất cần kiểm soát đặc biệt gồm chất và hỗn hợp chất ng</w:t>
+      </w:r>
+      <w:r>
+        <w:t xml:space="preserve">uy hiểm thuộc Danh mục hóa chất cần kiểm soát đặc biệt do Chính phủ ban hành, gồm: hóa chất thuộc đối tượng kiểm soát để thực thi điều ước quốc tế về hóa chất mà nước Cộng hòa xã hội chủ nghĩa Việt Nam là thành </w:t>
       </w:r>
       <w:r>
         <w:lastRenderedPageBreak/>
-        <w:t>viên; hóa chất có khả năng gây hại đến quốc phòng, an ninh, an toàn xã hội, con người, cơ sở vật chất, tài sản, môi trường;</w:t>
+        <w:t>viên; hóa chất có khả năng gây hại đến quốc p</w:t>
+      </w:r>
+      <w:r>
+        <w:t>hòng, an ninh, an toàn xã hội, con người, cơ sở vật chất, tài sản, môi trường;</w:t>
       </w:r>
       <w:bookmarkEnd w:id="43"/>
     </w:p>
@@ -1568,15 +1764,21 @@
         <w:spacing w:before="120" w:after="280" w:afterAutospacing="1"/>
       </w:pPr>
       <w:r>
-        <w:t>b) Hoạt động hóa chất đối với hóa chất cần kiểm soát đặc biệt phải tuân thủ quy định về an toàn, bảo vệ môi trường quy định tại Luật này và quy định khác của pháp luật có liên quan; có lĩnh vực, loại hình, quy mô, thời hạn phù hợp với giấy phép sản xuất, kinh doanh; được kiểm soát về mục đích sử dụng;</w:t>
-      </w:r>
-    </w:p>
-    <w:p>
-      <w:pPr>
-        <w:spacing w:before="120" w:after="280" w:afterAutospacing="1"/>
-      </w:pPr>
-      <w:r>
-        <w:t>c) Tổ chức, cá nhân sản xuất, kinh doanh, tồn trữ, vận chuyển, sử dụng hóa chất cần kiểm soát đặc biệt có nghĩa vụ kiểm soát nghiêm ngặt số lượng; phòng, chống thất thoát, sự cố hóa chất; tuân thủ điều ước quốc tế về hóa chất mà nước Cộng hòa xã hội chủ nghĩa Việt Nam là thành viên.</w:t>
+        <w:t>b) Hoạt động hóa chất đối với hóa chất cần kiểm soát đặc biệt phải tuân thủ quy định về an toàn, bảo vệ môi trường quy định tại Luật này và quy định khác của pháp luật có liên q</w:t>
+      </w:r>
+      <w:r>
+        <w:t>uan; có lĩnh vực, loại hình, quy mô, thời hạn phù hợp với giấy phép sản xuất, kinh doanh; được kiểm soát về mục đích sử dụng;</w:t>
+      </w:r>
+    </w:p>
+    <w:p>
+      <w:pPr>
+        <w:spacing w:before="120" w:after="280" w:afterAutospacing="1"/>
+      </w:pPr>
+      <w:r>
+        <w:t>c) Tổ chức, cá nhân sản xuất, kinh doanh, tồn trữ, vận chuyển, sử dụng hóa chất cần kiểm soát đặc biệt có nghĩa vụ kiểm soát nghiê</w:t>
+      </w:r>
+      <w:r>
+        <w:t>m ngặt số lượng; phòng, chống thất thoát, sự cố hóa chất; tuân thủ điều ước quốc tế về hóa chất mà nước Cộng hòa xã hội chủ nghĩa Việt Nam là thành viên.</w:t>
       </w:r>
     </w:p>
     <w:p>
@@ -1592,7 +1794,10 @@
         <w:spacing w:before="120" w:after="280" w:afterAutospacing="1"/>
       </w:pPr>
       <w:r>
-        <w:t xml:space="preserve">a) Hóa chất cấm là hóa chất nguy hiểm được quy định tại Danh mục hóa chất, khoáng vật cấm ban hành theo quy định của </w:t>
+        <w:t xml:space="preserve">a) Hóa chất cấm là hóa chất nguy hiểm </w:t>
+      </w:r>
+      <w:r>
+        <w:t xml:space="preserve">được quy định tại Danh mục hóa chất, khoáng vật cấm ban hành theo quy định của </w:t>
       </w:r>
       <w:bookmarkStart w:id="44" w:name="tvpllink_gwozgqnrqo_3"/>
       <w:r>
@@ -1636,7 +1841,10 @@
       </w:r>
       <w:bookmarkStart w:id="47" w:name="tc_5"/>
       <w:r>
-        <w:t>điểm a khoản 5 Điều 12 của Luật này</w:t>
+        <w:t>điểm a khoản 5 Đ</w:t>
+      </w:r>
+      <w:r>
+        <w:t>iều 12 của Luật này</w:t>
       </w:r>
       <w:bookmarkEnd w:id="47"/>
       <w:r>
@@ -1656,7 +1864,10 @@
         <w:spacing w:before="120" w:after="280" w:afterAutospacing="1"/>
       </w:pPr>
       <w:r>
-        <w:t>đ) Tổ chức, cá nhân không được tạm nhập, tái xuất, tạm xuất, tái nhập, chuyển khẩu, quá cảnh hóa chất cấm.</w:t>
+        <w:t>đ) Tổ chức, cá nhân không được</w:t>
+      </w:r>
+      <w:r>
+        <w:t xml:space="preserve"> tạm nhập, tái xuất, tạm xuất, tái nhập, chuyển khẩu, quá cảnh hóa chất cấm.</w:t>
       </w:r>
     </w:p>
     <w:p>
@@ -1694,7 +1905,10 @@
         <w:spacing w:before="120" w:after="280" w:afterAutospacing="1"/>
       </w:pPr>
       <w:r>
-        <w:t>b) Có đầy đủ tài liệu pháp lý, tài liệu an toàn, cơ sở vật chất - kỹ thuật, năng lực chuyên môn đáp ứng yêu cầu để thực hiện hoạt động sản xuất hóa chất;</w:t>
+        <w:t xml:space="preserve">b) Có đầy đủ tài liệu pháp lý, tài </w:t>
+      </w:r>
+      <w:r>
+        <w:t>liệu an toàn, cơ sở vật chất - kỹ thuật, năng lực chuyên môn đáp ứng yêu cầu để thực hiện hoạt động sản xuất hóa chất;</w:t>
       </w:r>
     </w:p>
     <w:p>
@@ -1718,7 +1932,10 @@
         <w:spacing w:before="120" w:after="280" w:afterAutospacing="1"/>
       </w:pPr>
       <w:r>
-        <w:t>d) Tổ chức sản xuất hóa chất có điều kiện, hóa chất cần kiểm soát đặc biệt, hóa chất cấm phải có Giấy chứng nhận đủ điều kiện sản xuất hóa chất có điều kiện, Giấy phép sản xuất hóa chất cần kiểm soát đặc biệt, Giấy phép sản xuất hóa chất cấm quy định tại các khoản 2, 3 và 4 Điều này.</w:t>
+        <w:t xml:space="preserve">d) Tổ chức sản xuất hóa chất có điều kiện, hóa chất cần kiểm soát đặc biệt, hóa </w:t>
+      </w:r>
+      <w:r>
+        <w:t>chất cấm phải có Giấy chứng nhận đủ điều kiện sản xuất hóa chất có điều kiện, Giấy phép sản xuất hóa chất cần kiểm soát đặc biệt, Giấy phép sản xuất hóa chất cấm quy định tại các khoản 2, 3 và 4 Điều này.</w:t>
       </w:r>
     </w:p>
     <w:p>
@@ -1728,7 +1945,10 @@
       <w:bookmarkStart w:id="50" w:name="khoan_2_10"/>
       <w:r>
         <w:lastRenderedPageBreak/>
-        <w:t>2. Giấy chứng nhận đủ điều kiện sản xuất hóa chất có điều kiện do Ủy ban nhân dân cấp tỉnh cấp khi tổ chức sản xuất hóa chất đáp ứng các điều kiện quy định tại khoản 1 Điều này và phải tuân thủ yêu cầu quy định tại</w:t>
+        <w:t>2. Giấy chứng nhận đủ điều kiện sản xuất hóa chất c</w:t>
+      </w:r>
+      <w:r>
+        <w:t>ó điều kiện do Ủy ban nhân dân cấp tỉnh cấp khi tổ chức sản xuất hóa chất đáp ứng các điều kiện quy định tại khoản 1 Điều này và phải tuân thủ yêu cầu quy định tại</w:t>
       </w:r>
       <w:bookmarkEnd w:id="50"/>
       <w:r>
@@ -1748,7 +1968,10 @@
         <w:spacing w:before="120" w:after="280" w:afterAutospacing="1"/>
       </w:pPr>
       <w:r>
-        <w:t>Giấy chứng nhận đủ điều kiện sản xuất hóa chất có điều kiện có thời hạn 05 năm kể từ ngày cấp. Ủy ban nhân dân cấp tỉnh thực hiện cấp lại, điều chỉnh, thu hồi Giấy chứng nhận đủ điều kiện sản xuất hóa chất có điều kiện.</w:t>
+        <w:t>Giấy chứng nhận đủ điều kiện sản xuất hóa chất có điều k</w:t>
+      </w:r>
+      <w:r>
+        <w:t>iện có thời hạn 05 năm kể từ ngày cấp. Ủy ban nhân dân cấp tỉnh thực hiện cấp lại, điều chỉnh, thu hồi Giấy chứng nhận đủ điều kiện sản xuất hóa chất có điều kiện.</w:t>
       </w:r>
     </w:p>
     <w:p>
@@ -1757,7 +1980,10 @@
       </w:pPr>
       <w:bookmarkStart w:id="52" w:name="khoan_3_10"/>
       <w:r>
-        <w:t>3. Giấy phép sản xuất hóa chất cần kiểm soát đặc biệt do Bộ, cơ quan ngang Bộ cấp khi tổ chức sản xuất hóa chất đáp ứng các điều kiện quy định tại khoản 1 Điều này và phải tuân thủ yêu cầu quy định tại</w:t>
+        <w:t>3. Giấy phép sản xuất hóa chất cần kiểm soát đặc biệt do Bộ, cơ quan ngang Bộ cấp khi tổ chứ</w:t>
+      </w:r>
+      <w:r>
+        <w:t>c sản xuất hóa chất đáp ứng các điều kiện quy định tại khoản 1 Điều này và phải tuân thủ yêu cầu quy định tại</w:t>
       </w:r>
       <w:bookmarkEnd w:id="52"/>
       <w:r>
@@ -1777,7 +2003,10 @@
         <w:spacing w:before="120" w:after="280" w:afterAutospacing="1"/>
       </w:pPr>
       <w:r>
-        <w:t>Giấy phép sản xuất hóa chất cần kiểm soát đặc biệt có thời hạn 05 năm kể từ ngày cấp. Bộ, cơ quan ngang Bộ thực hiện cấp lại, điều chỉnh, thu hồi Giấy phép sản xuất hóa chất cần kiểm soát đặc biệt.</w:t>
+        <w:t>Giấy phép sản xuất hóa chất cần kiểm soát đặc biệt có thời hạn 05 năm kể từ ngày cấp. Bộ, cơ quan ngan</w:t>
+      </w:r>
+      <w:r>
+        <w:t>g Bộ thực hiện cấp lại, điều chỉnh, thu hồi Giấy phép sản xuất hóa chất cần kiểm soát đặc biệt.</w:t>
       </w:r>
     </w:p>
     <w:p>
@@ -1798,7 +2027,10 @@
       </w:r>
       <w:bookmarkEnd w:id="55"/>
       <w:r>
-        <w:t xml:space="preserve"> khi tổ chức sản xuất hóa chất đáp ứng các điều kiện quy định tại khoản 1 Điều này và phải tuân thủ quy định tại </w:t>
+        <w:t xml:space="preserve"> khi tổ chức sản xuất hóa</w:t>
+      </w:r>
+      <w:r>
+        <w:t xml:space="preserve"> chất đáp ứng các điều kiện quy định tại khoản 1 Điều này và phải tuân thủ quy định tại </w:t>
       </w:r>
       <w:bookmarkStart w:id="56" w:name="tc_10"/>
       <w:r>
@@ -1823,7 +2055,10 @@
       </w:pPr>
       <w:bookmarkStart w:id="57" w:name="khoan_5_10"/>
       <w:r>
-        <w:t>5. Chính phủ quy định chi tiết Điều này; quy định việc thu hồi Giấy phép sản xuất hóa chất cấm.</w:t>
+        <w:t xml:space="preserve">5. Chính phủ quy định chi tiết Điều này; quy định việc thu hồi </w:t>
+      </w:r>
+      <w:r>
+        <w:t>Giấy phép sản xuất hóa chất cấm.</w:t>
       </w:r>
       <w:bookmarkEnd w:id="57"/>
     </w:p>
@@ -1862,7 +2097,10 @@
         <w:spacing w:before="120" w:after="280" w:afterAutospacing="1"/>
       </w:pPr>
       <w:r>
-        <w:t>b) Có đầy đủ tài liệu pháp lý, tài liệu an toàn, cơ sở vật chất - kỹ thuật, năng lực chuyên môn đáp ứng yêu cầu để thực hiện hoạt động kinh doanh hóa chất;</w:t>
+        <w:t>b) Có đầy đủ tài liệu pháp lý, tài liệu an toàn, cơ sở vật chất - kỹ thuật, năng</w:t>
+      </w:r>
+      <w:r>
+        <w:t xml:space="preserve"> lực chuyên môn đáp ứng yêu cầu để thực hiện hoạt động kinh doanh hóa chất;</w:t>
       </w:r>
     </w:p>
     <w:p>
@@ -1886,7 +2124,10 @@
         <w:spacing w:before="120" w:after="280" w:afterAutospacing="1"/>
       </w:pPr>
       <w:r>
-        <w:t>d) Tổ chức kinh doanh hóa chất có điều kiện, hóa chất cần kiểm soát đặc biệt phải có Giấy chứng nhận đủ điều kiện kinh doanh hóa chất có điều kiện, Giấy phép kinh doanh hóa chất cần kiểm soát đặc biệt quy định tại khoản 2 và khoản 3 Điều này.</w:t>
+        <w:t>d) Tổ chức kinh doanh hóa chất có điều kiện, hóa chất cần kiểm soát đặc biệt phải có Giấy chứng nhận đủ điều kiện kinh doanh hóa c</w:t>
+      </w:r>
+      <w:r>
+        <w:t>hất có điều kiện, Giấy phép kinh doanh hóa chất cần kiểm soát đặc biệt quy định tại khoản 2 và khoản 3 Điều này.</w:t>
       </w:r>
     </w:p>
     <w:p>
@@ -1895,7 +2136,10 @@
       </w:pPr>
       <w:bookmarkStart w:id="60" w:name="khoan_2_11"/>
       <w:r>
-        <w:t>2. Giấy chứng nhận đủ điều kiện kinh doanh hóa chất có điều kiện do Ủy ban nhân dân cấp tỉnh cấp khi tổ chức kinh doanh hóa chất đáp ứng các điều kiện quy định tại khoản 1 Điều này và phải tuân thủ các yêu cầu quy định tại</w:t>
+        <w:t>2. Giấy chứng nhận đủ điều kiện kinh doanh hóa chất có điều kiện do Ủy ban nhân dân cấp tỉnh cấp khi tổ chức kinh doanh hóa chất đáp ứng các đi</w:t>
+      </w:r>
+      <w:r>
+        <w:t>ều kiện quy định tại khoản 1 Điều này và phải tuân thủ các yêu cầu quy định tại</w:t>
       </w:r>
       <w:bookmarkEnd w:id="60"/>
       <w:r>
@@ -1915,7 +2159,10 @@
         <w:spacing w:before="120" w:after="280" w:afterAutospacing="1"/>
       </w:pPr>
       <w:r>
-        <w:t>Giấy chứng nhận đủ điều kiện kinh doanh hóa chất có điều kiện có thời hạn 05 năm kể từ ngày cấp. Ủy ban nhân dân cấp tỉnh thực hiện cấp lại, điều chỉnh, thu hồi Giấy chứng nhận đủ điều kiện kinh doanh hóa chất có điều kiện.</w:t>
+        <w:t>Giấy chứng nhận đủ điều kiện kinh doanh hóa chất có điều kiện có thời hạn 05 năm kể từ ngày cấp. Ủy ban nhân dân cấp tỉnh thực hiện cấp lại,</w:t>
+      </w:r>
+      <w:r>
+        <w:t xml:space="preserve"> điều chỉnh, thu hồi Giấy chứng nhận đủ điều kiện kinh doanh hóa chất có điều kiện.</w:t>
       </w:r>
     </w:p>
     <w:p>
@@ -1925,7 +2172,10 @@
       <w:bookmarkStart w:id="62" w:name="khoan_3_11"/>
       <w:r>
         <w:lastRenderedPageBreak/>
-        <w:t>3. Giấy phép kinh doanh hóa chất cần kiểm soát đặc biệt do Bộ, cơ quan ngang Bộ cấp khi tổ chức kinh doanh hóa chất đáp ứng các điều kiện quy định tại khoản 1 Điều này và phải tuân thủ các yêu cầu quy định tại</w:t>
+        <w:t>3. Giấy phép kinh doanh hóa chất cần kiểm soát đặc biệt do Bộ, cơ quan ngang Bộ cấp khi tổ chức kinh doanh hóa chất đáp ứng các điều kiện quy định tại khoản 1 Điều này và p</w:t>
+      </w:r>
+      <w:r>
+        <w:t>hải tuân thủ các yêu cầu quy định tại</w:t>
       </w:r>
       <w:bookmarkEnd w:id="62"/>
       <w:r>
@@ -1945,7 +2195,10 @@
         <w:spacing w:before="120" w:after="280" w:afterAutospacing="1"/>
       </w:pPr>
       <w:r>
-        <w:t>Giấy phép kinh doanh hóa chất cần kiểm soát đặc biệt có thời hạn 05 năm kể từ ngày cấp. Bộ, cơ quan ngang Bộ thực hiện cấp lại, điều chỉnh, thu hồi Giấy phép kinh doanh hóa chất cần kiểm soát đặc biệt.</w:t>
+        <w:t>Giấy phép kinh doanh hóa chất cần kiểm soát đặc biệt có thời hạn 05 năm kể từ ngày cấp. Bộ, cơ quan ngang Bộ thực hiện cấp lại, điều chỉnh, thu hồi Giấy phép kinh doanh hóa c</w:t>
+      </w:r>
+      <w:r>
+        <w:t>hất cần kiểm soát đặc biệt.</w:t>
       </w:r>
     </w:p>
     <w:p>
@@ -1970,7 +2223,10 @@
       </w:r>
       <w:bookmarkStart w:id="66" w:name="khoan_4_11_name"/>
       <w:r>
-        <w:t>và phải được xác thực dữ liệu về tổ chức, cá nhân mua, bán theo lộ trình thực hiện do Chính phủ quy định.</w:t>
+        <w:t>và phải được xác thực dữ liệu về tổ chức, cá nhân mua, bán the</w:t>
+      </w:r>
+      <w:r>
+        <w:t>o lộ trình thực hiện do Chính phủ quy định.</w:t>
       </w:r>
       <w:bookmarkEnd w:id="66"/>
     </w:p>
@@ -1992,7 +2248,14 @@
           <w:b/>
           <w:bCs/>
         </w:rPr>
-        <w:t>Điều 12. Xuất khẩu, nhập khẩu, tạm nhập, tái xuất, tạm xuất, tái nhập, chuyển khẩu, quá cảnh và hoạt động khác có liên quan đến hoạt động mua bán hàng hóa quốc tế đối với hóa chất</w:t>
+        <w:t xml:space="preserve">Điều 12. Xuất khẩu, nhập khẩu, tạm nhập, tái xuất, tạm xuất, tái nhập, chuyển khẩu, quá cảnh và hoạt động khác có liên quan đến hoạt động mua bán hàng hóa quốc tế đối </w:t>
+      </w:r>
+      <w:r>
+        <w:rPr>
+          <w:b/>
+          <w:bCs/>
+        </w:rPr>
+        <w:t>với hóa chất</w:t>
       </w:r>
       <w:bookmarkEnd w:id="67"/>
     </w:p>
@@ -2005,176 +2268,221 @@
       </w:r>
       <w:bookmarkStart w:id="68" w:name="tvpllink_pugiufdkvo_1"/>
       <w:r>
+        <w:t>Luật Quản lý ngoại th</w:t>
+      </w:r>
+      <w:r>
+        <w:t>ương</w:t>
+      </w:r>
+      <w:bookmarkEnd w:id="68"/>
+      <w:r>
+        <w:t xml:space="preserve"> và quy định khác của pháp luật có liên quan.</w:t>
+      </w:r>
+    </w:p>
+    <w:p>
+      <w:pPr>
+        <w:spacing w:before="120" w:after="280" w:afterAutospacing="1"/>
+      </w:pPr>
+      <w:r>
+        <w:t>2. Các trường hợp được xuất khẩu, nhập khẩu hóa chất có điều kiện bao gồm:</w:t>
+      </w:r>
+    </w:p>
+    <w:p>
+      <w:pPr>
+        <w:spacing w:before="120" w:after="280" w:afterAutospacing="1"/>
+      </w:pPr>
+      <w:r>
+        <w:t>a) Tổ chức sản xuất hóa chất có điều kiện được xuất khẩu hóa chất do chính tổ chức đó sản xuất theo Giấy chứng nhận đủ điều kiện sả</w:t>
+      </w:r>
+      <w:r>
+        <w:t>n xuất hóa chất có điều kiện;</w:t>
+      </w:r>
+    </w:p>
+    <w:p>
+      <w:pPr>
+        <w:spacing w:before="120" w:after="280" w:afterAutospacing="1"/>
+      </w:pPr>
+      <w:r>
+        <w:t>b) Tổ chức kinh doanh hóa chất có điều kiện được xuất khẩu, nhập khẩu hóa chất theo Giấy chứng nhận đủ điều kiện kinh doanh hóa chất có điều kiện để phục vụ mục đích kinh doanh;</w:t>
+      </w:r>
+    </w:p>
+    <w:p>
+      <w:pPr>
+        <w:spacing w:before="120" w:after="280" w:afterAutospacing="1"/>
+      </w:pPr>
+      <w:r>
+        <w:t>c) Tổ chức, cá nhân sử dụng hóa chất được nhập k</w:t>
+      </w:r>
+      <w:r>
+        <w:t>hẩu hóa chất có điều kiện để phục vụ mục đích sử dụng của tổ chức, cá nhân đó.</w:t>
+      </w:r>
+    </w:p>
+    <w:p>
+      <w:pPr>
+        <w:spacing w:before="120" w:after="280" w:afterAutospacing="1"/>
+      </w:pPr>
+      <w:r>
+        <w:t>3. Các trường hợp được xuất khẩu, nhập khẩu hóa chất cần kiểm soát đặc biệt bao gồm:</w:t>
+      </w:r>
+    </w:p>
+    <w:p>
+      <w:pPr>
+        <w:spacing w:before="120" w:after="280" w:afterAutospacing="1"/>
+      </w:pPr>
+      <w:r>
+        <w:t>a) Tổ chức sản xuất hóa chất cần kiểm soát đặc biệt được xuất khẩu hóa chất do chính tổ chức</w:t>
+      </w:r>
+      <w:r>
+        <w:t xml:space="preserve"> đó sản xuất theo Giấy phép sản xuất hóa chất cần kiểm soát đặc biệt và Giấy phép xuất khẩu hóa chất cần kiểm soát đặc biệt;</w:t>
+      </w:r>
+    </w:p>
+    <w:p>
+      <w:pPr>
+        <w:spacing w:before="120" w:after="280" w:afterAutospacing="1"/>
+      </w:pPr>
+      <w:r>
+        <w:t>b) Tổ chức kinh doanh hóa chất cần kiểm soát đặc biệt được xuất khẩu, nhập khẩu hóa chất theo Giấy phép kinh doanh hóa chất cần kiể</w:t>
+      </w:r>
+      <w:r>
+        <w:t>m soát đặc biệt và Giấy phép xuất khẩu hóa chất cần kiểm soát đặc biệt, Giấy phép nhập khẩu hóa chất cần kiểm soát đặc biệt để phục vụ mục đích kinh doanh;</w:t>
+      </w:r>
+    </w:p>
+    <w:p>
+      <w:pPr>
+        <w:spacing w:before="120" w:after="280" w:afterAutospacing="1"/>
+      </w:pPr>
+      <w:r>
+        <w:lastRenderedPageBreak/>
+        <w:t>c) Tổ chức, cá nhân sử dụng hóa chất cần kiểm soát đặc biệt đã thực hiện công bố loại hóa chất và mụ</w:t>
+      </w:r>
+      <w:r>
+        <w:t>c đích sử dụng hóa chất trên Cơ sở dữ liệu chuyên ngành hóa chất được nhập khẩu hóa chất cần kiểm soát đặc biệt theo Giấy phép nhập khẩu hóa chất cần kiểm soát đặc biệt để phục vụ mục đích sử dụng của tổ chức, cá nhân đó.</w:t>
+      </w:r>
+    </w:p>
+    <w:p>
+      <w:pPr>
+        <w:spacing w:before="120" w:after="280" w:afterAutospacing="1"/>
+      </w:pPr>
+      <w:bookmarkStart w:id="69" w:name="khoan_4_12"/>
+      <w:r>
+        <w:t>4. Giấy phép xuất khẩu hóa chất cầ</w:t>
+      </w:r>
+      <w:r>
+        <w:t>n kiểm soát đặc biệt, Giấy phép nhập khẩu hóa chất cần kiểm soát đặc biệt được quy định như sau:</w:t>
+      </w:r>
+      <w:bookmarkEnd w:id="69"/>
+    </w:p>
+    <w:p>
+      <w:pPr>
+        <w:spacing w:before="120" w:after="280" w:afterAutospacing="1"/>
+      </w:pPr>
+      <w:r>
+        <w:t>a) Cơ quan có thẩm quyền có trách nhiệm cấp, cấp lại, điều chỉnh, gia hạn, thu hồi Giấy phép xuất khẩu hóa chất cần kiểm soát đặc biệt, Giấy phép nhập khẩu hóa</w:t>
+      </w:r>
+      <w:r>
+        <w:t xml:space="preserve"> chất cần kiểm soát đặc biệt;</w:t>
+      </w:r>
+    </w:p>
+    <w:p>
+      <w:pPr>
+        <w:spacing w:before="120" w:after="280" w:afterAutospacing="1"/>
+      </w:pPr>
+      <w:r>
+        <w:t>b) Giấy phép xuất khẩu hóa chất cần kiểm soát đặc biệt, Giấy phép nhập khẩu hóa chất cần kiểm soát đặc biệt được cấp cho từng hóa đơn xuất khẩu, hóa đơn nhập khẩu và có thời hạn 06 tháng kể từ ngày cấp;</w:t>
+      </w:r>
+    </w:p>
+    <w:p>
+      <w:pPr>
+        <w:spacing w:before="120" w:after="280" w:afterAutospacing="1"/>
+      </w:pPr>
+      <w:r>
+        <w:t xml:space="preserve">c) Giấy phép xuất khẩu </w:t>
+      </w:r>
+      <w:r>
+        <w:t xml:space="preserve">hóa chất cần kiểm soát đặc biệt, Giấy phép nhập khẩu hóa chất cần kiểm soát đặc biệt được gia hạn trong trường hợp hết thời hạn ghi trong Giấy phép nhưng việc xuất khẩu, nhập khẩu chưa thực hiện được hoặc thực hiện chưa xong. Giấy phép chỉ được gia hạn 01 </w:t>
+      </w:r>
+      <w:r>
+        <w:t>lần và có thời hạn không quá 06 tháng kể từ ngày cấp phép gia hạn.</w:t>
+      </w:r>
+    </w:p>
+    <w:p>
+      <w:pPr>
+        <w:spacing w:before="120" w:after="280" w:afterAutospacing="1"/>
+      </w:pPr>
+      <w:bookmarkStart w:id="70" w:name="khoan_5_12"/>
+      <w:r>
+        <w:t>5. Xuất khẩu, nhập khẩu hóa chất cấm được quy định như sau:</w:t>
+      </w:r>
+      <w:bookmarkEnd w:id="70"/>
+    </w:p>
+    <w:p>
+      <w:pPr>
+        <w:spacing w:before="120" w:after="280" w:afterAutospacing="1"/>
+      </w:pPr>
+      <w:r>
+        <w:t>a) Hoạt động xuất khẩu hóa chất cấm chỉ được thực hiện trong trường hợp tổ chức nhập khẩu hóa chất cấm không sử dụng hết hóa chất</w:t>
+      </w:r>
+      <w:r>
+        <w:t xml:space="preserve"> cấm sau thời hạn sử dụng quy định trong Giấy phép nhập khẩu hóa chất cấm đã được cấp và phải thực hiện theo quy định tại khoản 1 Điều này, điều ước quốc tế mà nước Cộng hòa xã hội chủ nghĩa Việt Nam là thành viên.</w:t>
+      </w:r>
+    </w:p>
+    <w:p>
+      <w:pPr>
+        <w:spacing w:before="120" w:after="280" w:afterAutospacing="1"/>
+      </w:pPr>
+      <w:r>
+        <w:t>Trong trường hợp không xuất khẩu, tổ chức</w:t>
+      </w:r>
+      <w:r>
+        <w:t xml:space="preserve"> nhập khẩu hóa chất cấm thực hiện tiêu hủy hóa chất cấm theo quy định của Luật này, quy định của pháp luật về bảo vệ môi trường, an toàn lao động và quy định khác của pháp luật có liên quan.</w:t>
+      </w:r>
+    </w:p>
+    <w:p>
+      <w:pPr>
+        <w:spacing w:before="120" w:after="280" w:afterAutospacing="1"/>
+      </w:pPr>
+      <w:r>
+        <w:t xml:space="preserve">Tổ chức nhập khẩu hóa chất cấm có nghĩa vụ thông báo đến cơ quan </w:t>
+      </w:r>
+      <w:r>
+        <w:t>cấp Giấy phép nhập khẩu hóa chất cấm để thực hiện xuất khẩu hoặc tiêu hủy sau khi được cơ quan có thẩm quyền chấp thuận;</w:t>
+      </w:r>
+    </w:p>
+    <w:p>
+      <w:pPr>
+        <w:spacing w:before="120" w:after="280" w:afterAutospacing="1"/>
+      </w:pPr>
+      <w:r>
+        <w:t>b) Hoạt động nhập khẩu hóa chất cấm thực hiện theo Giấy phép nhập khẩu hóa chất cấm do cơ quan có thẩm quyền cấp;</w:t>
+      </w:r>
+    </w:p>
+    <w:p>
+      <w:pPr>
+        <w:spacing w:before="120" w:after="280" w:afterAutospacing="1"/>
+      </w:pPr>
+      <w:r>
+        <w:t>c) Tổ chức chỉ được n</w:t>
+      </w:r>
+      <w:r>
+        <w:t xml:space="preserve">hập khẩu hóa chất cấm đúng nội dung được ghi trên Giấy phép nhập khẩu hóa chất cấm theo mục đích quy định tại </w:t>
+      </w:r>
+      <w:bookmarkStart w:id="71" w:name="tvpllink_gwozgqnrqo_5"/>
+      <w:r>
+        <w:t>Luật Đầu tư</w:t>
+      </w:r>
+      <w:bookmarkEnd w:id="71"/>
+      <w:r>
+        <w:t xml:space="preserve">, </w:t>
+      </w:r>
+      <w:bookmarkStart w:id="72" w:name="tvpllink_pugiufdkvo_2"/>
+      <w:r>
         <w:t>Luật Quản lý ngoại thương</w:t>
       </w:r>
-      <w:bookmarkEnd w:id="68"/>
-      <w:r>
-        <w:t xml:space="preserve"> và quy định khác của pháp luật có liên quan.</w:t>
-      </w:r>
-    </w:p>
-    <w:p>
-      <w:pPr>
-        <w:spacing w:before="120" w:after="280" w:afterAutospacing="1"/>
-      </w:pPr>
-      <w:r>
-        <w:t>2. Các trường hợp được xuất khẩu, nhập khẩu hóa chất có điều kiện bao gồm:</w:t>
-      </w:r>
-    </w:p>
-    <w:p>
-      <w:pPr>
-        <w:spacing w:before="120" w:after="280" w:afterAutospacing="1"/>
-      </w:pPr>
-      <w:r>
-        <w:t>a) Tổ chức sản xuất hóa chất có điều kiện được xuất khẩu hóa chất do chính tổ chức đó sản xuất theo Giấy chứng nhận đủ điều kiện sản xuất hóa chất có điều kiện;</w:t>
-      </w:r>
-    </w:p>
-    <w:p>
-      <w:pPr>
-        <w:spacing w:before="120" w:after="280" w:afterAutospacing="1"/>
-      </w:pPr>
-      <w:r>
-        <w:t>b) Tổ chức kinh doanh hóa chất có điều kiện được xuất khẩu, nhập khẩu hóa chất theo Giấy chứng nhận đủ điều kiện kinh doanh hóa chất có điều kiện để phục vụ mục đích kinh doanh;</w:t>
-      </w:r>
-    </w:p>
-    <w:p>
-      <w:pPr>
-        <w:spacing w:before="120" w:after="280" w:afterAutospacing="1"/>
-      </w:pPr>
-      <w:r>
-        <w:t>c) Tổ chức, cá nhân sử dụng hóa chất được nhập khẩu hóa chất có điều kiện để phục vụ mục đích sử dụng của tổ chức, cá nhân đó.</w:t>
-      </w:r>
-    </w:p>
-    <w:p>
-      <w:pPr>
-        <w:spacing w:before="120" w:after="280" w:afterAutospacing="1"/>
-      </w:pPr>
-      <w:r>
-        <w:t>3. Các trường hợp được xuất khẩu, nhập khẩu hóa chất cần kiểm soát đặc biệt bao gồm:</w:t>
-      </w:r>
-    </w:p>
-    <w:p>
-      <w:pPr>
-        <w:spacing w:before="120" w:after="280" w:afterAutospacing="1"/>
-      </w:pPr>
-      <w:r>
-        <w:t>a) Tổ chức sản xuất hóa chất cần kiểm soát đặc biệt được xuất khẩu hóa chất do chính tổ chức đó sản xuất theo Giấy phép sản xuất hóa chất cần kiểm soát đặc biệt và Giấy phép xuất khẩu hóa chất cần kiểm soát đặc biệt;</w:t>
-      </w:r>
-    </w:p>
-    <w:p>
-      <w:pPr>
-        <w:spacing w:before="120" w:after="280" w:afterAutospacing="1"/>
-      </w:pPr>
-      <w:r>
-        <w:t>b) Tổ chức kinh doanh hóa chất cần kiểm soát đặc biệt được xuất khẩu, nhập khẩu hóa chất theo Giấy phép kinh doanh hóa chất cần kiểm soát đặc biệt và Giấy phép xuất khẩu hóa chất cần kiểm soát đặc biệt, Giấy phép nhập khẩu hóa chất cần kiểm soát đặc biệt để phục vụ mục đích kinh doanh;</w:t>
-      </w:r>
-    </w:p>
-    <w:p>
-      <w:pPr>
-        <w:spacing w:before="120" w:after="280" w:afterAutospacing="1"/>
-      </w:pPr>
-      <w:r>
-        <w:lastRenderedPageBreak/>
-        <w:t>c) Tổ chức, cá nhân sử dụng hóa chất cần kiểm soát đặc biệt đã thực hiện công bố loại hóa chất và mục đích sử dụng hóa chất trên Cơ sở dữ liệu chuyên ngành hóa chất được nhập khẩu hóa chất cần kiểm soát đặc biệt theo Giấy phép nhập khẩu hóa chất cần kiểm soát đặc biệt để phục vụ mục đích sử dụng của tổ chức, cá nhân đó.</w:t>
-      </w:r>
-    </w:p>
-    <w:p>
-      <w:pPr>
-        <w:spacing w:before="120" w:after="280" w:afterAutospacing="1"/>
-      </w:pPr>
-      <w:bookmarkStart w:id="69" w:name="khoan_4_12"/>
-      <w:r>
-        <w:t>4. Giấy phép xuất khẩu hóa chất cần kiểm soát đặc biệt, Giấy phép nhập khẩu hóa chất cần kiểm soát đặc biệt được quy định như sau:</w:t>
-      </w:r>
-      <w:bookmarkEnd w:id="69"/>
-    </w:p>
-    <w:p>
-      <w:pPr>
-        <w:spacing w:before="120" w:after="280" w:afterAutospacing="1"/>
-      </w:pPr>
-      <w:r>
-        <w:t>a) Cơ quan có thẩm quyền có trách nhiệm cấp, cấp lại, điều chỉnh, gia hạn, thu hồi Giấy phép xuất khẩu hóa chất cần kiểm soát đặc biệt, Giấy phép nhập khẩu hóa chất cần kiểm soát đặc biệt;</w:t>
-      </w:r>
-    </w:p>
-    <w:p>
-      <w:pPr>
-        <w:spacing w:before="120" w:after="280" w:afterAutospacing="1"/>
-      </w:pPr>
-      <w:r>
-        <w:t>b) Giấy phép xuất khẩu hóa chất cần kiểm soát đặc biệt, Giấy phép nhập khẩu hóa chất cần kiểm soát đặc biệt được cấp cho từng hóa đơn xuất khẩu, hóa đơn nhập khẩu và có thời hạn 06 tháng kể từ ngày cấp;</w:t>
-      </w:r>
-    </w:p>
-    <w:p>
-      <w:pPr>
-        <w:spacing w:before="120" w:after="280" w:afterAutospacing="1"/>
-      </w:pPr>
-      <w:r>
-        <w:t>c) Giấy phép xuất khẩu hóa chất cần kiểm soát đặc biệt, Giấy phép nhập khẩu hóa chất cần kiểm soát đặc biệt được gia hạn trong trường hợp hết thời hạn ghi trong Giấy phép nhưng việc xuất khẩu, nhập khẩu chưa thực hiện được hoặc thực hiện chưa xong. Giấy phép chỉ được gia hạn 01 lần và có thời hạn không quá 06 tháng kể từ ngày cấp phép gia hạn.</w:t>
-      </w:r>
-    </w:p>
-    <w:p>
-      <w:pPr>
-        <w:spacing w:before="120" w:after="280" w:afterAutospacing="1"/>
-      </w:pPr>
-      <w:bookmarkStart w:id="70" w:name="khoan_5_12"/>
-      <w:r>
-        <w:t>5. Xuất khẩu, nhập khẩu hóa chất cấm được quy định như sau:</w:t>
-      </w:r>
-      <w:bookmarkEnd w:id="70"/>
-    </w:p>
-    <w:p>
-      <w:pPr>
-        <w:spacing w:before="120" w:after="280" w:afterAutospacing="1"/>
-      </w:pPr>
-      <w:r>
-        <w:t>a) Hoạt động xuất khẩu hóa chất cấm chỉ được thực hiện trong trường hợp tổ chức nhập khẩu hóa chất cấm không sử dụng hết hóa chất cấm sau thời hạn sử dụng quy định trong Giấy phép nhập khẩu hóa chất cấm đã được cấp và phải thực hiện theo quy định tại khoản 1 Điều này, điều ước quốc tế mà nước Cộng hòa xã hội chủ nghĩa Việt Nam là thành viên.</w:t>
-      </w:r>
-    </w:p>
-    <w:p>
-      <w:pPr>
-        <w:spacing w:before="120" w:after="280" w:afterAutospacing="1"/>
-      </w:pPr>
-      <w:r>
-        <w:t>Trong trường hợp không xuất khẩu, tổ chức nhập khẩu hóa chất cấm thực hiện tiêu hủy hóa chất cấm theo quy định của Luật này, quy định của pháp luật về bảo vệ môi trường, an toàn lao động và quy định khác của pháp luật có liên quan.</w:t>
-      </w:r>
-    </w:p>
-    <w:p>
-      <w:pPr>
-        <w:spacing w:before="120" w:after="280" w:afterAutospacing="1"/>
-      </w:pPr>
-      <w:r>
-        <w:t>Tổ chức nhập khẩu hóa chất cấm có nghĩa vụ thông báo đến cơ quan cấp Giấy phép nhập khẩu hóa chất cấm để thực hiện xuất khẩu hoặc tiêu hủy sau khi được cơ quan có thẩm quyền chấp thuận;</w:t>
-      </w:r>
-    </w:p>
-    <w:p>
-      <w:pPr>
-        <w:spacing w:before="120" w:after="280" w:afterAutospacing="1"/>
-      </w:pPr>
-      <w:r>
-        <w:t>b) Hoạt động nhập khẩu hóa chất cấm thực hiện theo Giấy phép nhập khẩu hóa chất cấm do cơ quan có thẩm quyền cấp;</w:t>
-      </w:r>
-    </w:p>
-    <w:p>
-      <w:pPr>
-        <w:spacing w:before="120" w:after="280" w:afterAutospacing="1"/>
-      </w:pPr>
-      <w:r>
-        <w:t xml:space="preserve">c) Tổ chức chỉ được nhập khẩu hóa chất cấm đúng nội dung được ghi trên Giấy phép nhập khẩu hóa chất cấm theo mục đích quy định tại </w:t>
-      </w:r>
-      <w:bookmarkStart w:id="71" w:name="tvpllink_gwozgqnrqo_5"/>
-      <w:r>
-        <w:t>Luật Đầu tư</w:t>
-      </w:r>
-      <w:bookmarkEnd w:id="71"/>
-      <w:r>
-        <w:t xml:space="preserve">, </w:t>
-      </w:r>
-      <w:bookmarkStart w:id="72" w:name="tvpllink_pugiufdkvo_2"/>
-      <w:r>
-        <w:t>Luật Quản lý ngoại thương</w:t>
-      </w:r>
       <w:bookmarkEnd w:id="72"/>
       <w:r>
-        <w:t xml:space="preserve"> và luật khác có liên quan. Hoạt động nhập khẩu hóa chất cấm phải đáp ứng các điều kiện sau đây: có đầy đủ tài liệu pháp lý, cơ sở vật chất - kỹ thuật, năng lực chuyên môn đáp ứng yêu cầu để thực hiện tồn trữ, vận chuyển và sử dụng hóa chất cấm;</w:t>
+        <w:t xml:space="preserve"> và luật khác có liên quan. Hoạt động nhập khẩu hóa chất cấm phải đáp ứng các điều kiện sau đây: có đầy đủ t</w:t>
+      </w:r>
+      <w:r>
+        <w:t>ài liệu pháp lý, cơ sở vật chất - kỹ thuật, năng lực chuyên môn đáp ứng yêu cầu để thực hiện tồn trữ, vận chuyển và sử dụng hóa chất cấm;</w:t>
       </w:r>
     </w:p>
     <w:p>
@@ -2186,7 +2494,10 @@
       </w:r>
       <w:bookmarkStart w:id="73" w:name="tc_15"/>
       <w:r>
-        <w:t>điểm d khoản 3 Điều 9 và khoản 3 Điều 15 của Luật này</w:t>
+        <w:t xml:space="preserve">điểm d khoản </w:t>
+      </w:r>
+      <w:r>
+        <w:t>3 Điều 9 và khoản 3 Điều 15 của Luật này</w:t>
       </w:r>
       <w:bookmarkEnd w:id="73"/>
       <w:r>
@@ -2208,7 +2519,10 @@
       </w:pPr>
       <w:bookmarkStart w:id="74" w:name="khoan_6_12"/>
       <w:r>
-        <w:t>6. Tổ chức, cá nhân nhập khẩu hóa chất phải thực hiện khai báo hóa chất nhập khẩu, trừ các trường hợp sau đây:</w:t>
+        <w:t>6. Tổ chức, cá nhân nhập khẩu hóa chất phải thực hiện khai báo hóa chất nhập khẩu, trừ cá</w:t>
+      </w:r>
+      <w:r>
+        <w:t>c trường hợp sau đây:</w:t>
       </w:r>
       <w:bookmarkEnd w:id="74"/>
     </w:p>
@@ -2233,7 +2547,10 @@
         <w:spacing w:before="120" w:after="280" w:afterAutospacing="1"/>
       </w:pPr>
       <w:r>
-        <w:t>c) Trường hợp miễn trừ khác theo quy định của Chính phủ.</w:t>
+        <w:t>c) Trường hợp miễn trừ khác theo quy đ</w:t>
+      </w:r>
+      <w:r>
+        <w:t>ịnh của Chính phủ.</w:t>
       </w:r>
     </w:p>
     <w:p>
@@ -2263,15 +2580,21 @@
         <w:spacing w:before="120" w:after="280" w:afterAutospacing="1"/>
       </w:pPr>
       <w:r>
-        <w:t>1. Trường hợp xảy ra sự cố trong quá trình vận chuyển hóa chất, người điều khiển phương tiện, chủ hàng, chủ phương tiện có nghĩa vụ áp dụng ngay các biện pháp cần thiết để hạn chế tối đa hậu quả, khắc phục sự cố, bồi thường thiệt hại.</w:t>
-      </w:r>
-    </w:p>
-    <w:p>
-      <w:pPr>
-        <w:spacing w:before="120" w:after="280" w:afterAutospacing="1"/>
-      </w:pPr>
-      <w:r>
-        <w:t xml:space="preserve">2. Tổ chức, cá nhân vận chuyển hóa chất nguy hiểm phải tuân thủ các quy định về vận chuyển hàng hóa nguy hiểm của pháp luật về đường bộ, trật tự, an toàn giao thông đường bộ, đường thủy nội địa, đường sắt, hàng không, hàng hải; yêu cầu quy định tại khoản 1 Điều này, </w:t>
+        <w:t xml:space="preserve">1. Trường hợp xảy ra sự cố trong quá trình vận chuyển hóa chất, người điều khiển phương tiện, chủ hàng, chủ phương tiện có nghĩa vụ áp dụng ngay các biện pháp cần </w:t>
+      </w:r>
+      <w:r>
+        <w:t>thiết để hạn chế tối đa hậu quả, khắc phục sự cố, bồi thường thiệt hại.</w:t>
+      </w:r>
+    </w:p>
+    <w:p>
+      <w:pPr>
+        <w:spacing w:before="120" w:after="280" w:afterAutospacing="1"/>
+      </w:pPr>
+      <w:r>
+        <w:t>2. Tổ chức, cá nhân vận chuyển hóa chất nguy hiểm phải tuân thủ các quy định về vận chuyển hàng hóa nguy hiểm của pháp luật về đường bộ, trật tự, an toàn giao thông đường bộ, đường thủ</w:t>
+      </w:r>
+      <w:r>
+        <w:t xml:space="preserve">y nội địa, đường sắt, hàng không, hàng hải; yêu cầu quy định tại khoản 1 Điều này, </w:t>
       </w:r>
       <w:bookmarkStart w:id="76" w:name="tc_16"/>
       <w:r>
@@ -2279,7 +2602,10 @@
       </w:r>
       <w:bookmarkEnd w:id="76"/>
       <w:r>
-        <w:t xml:space="preserve"> và quy định khác của pháp luật có liên quan. Khi xảy ra sự cố, tổ chức, cá nhân vận chuyển hóa chất nguy hiểm phải thông báo ngay cho Ủy ban nhân dân và Ban chỉ huy phòng thủ dân sự nơi gần nhất.</w:t>
+        <w:t xml:space="preserve"> và quy định khác của pháp luật có liên quan. Khi xảy ra sự cố, tổ chức, cá nhân vận chuyển hóa chất nguy hiểm phải thông báo nga</w:t>
+      </w:r>
+      <w:r>
+        <w:t>y cho Ủy ban nhân dân và Ban chỉ huy phòng thủ dân sự nơi gần nhất.</w:t>
       </w:r>
     </w:p>
     <w:p>
@@ -2303,7 +2629,10 @@
         <w:spacing w:before="120" w:after="280" w:afterAutospacing="1"/>
       </w:pPr>
       <w:r>
-        <w:t xml:space="preserve">4. Hoạt động vận chuyển hóa chất cấm thực hiện theo quy định tại khoản 1, khoản 2 Điều này và </w:t>
+        <w:t>4. Hoạt động vận chuyển hóa c</w:t>
+      </w:r>
+      <w:r>
+        <w:t xml:space="preserve">hất cấm thực hiện theo quy định tại khoản 1, khoản 2 Điều này và </w:t>
       </w:r>
       <w:bookmarkStart w:id="78" w:name="tc_18"/>
       <w:r>
@@ -2319,7 +2648,10 @@
         <w:spacing w:before="120" w:after="280" w:afterAutospacing="1"/>
       </w:pPr>
       <w:r>
-        <w:t>a) Kiểm tra điều kiện an toàn, an ninh hóa chất trước khi xuất phát và sau mỗi lần dừng, đỗ phương tiện vận chuyển hóa chất cấm;</w:t>
+        <w:t>a) Kiểm tra điều kiện an toàn, an ninh hóa chất trước khi xuất phát và sau mỗi lần dừng, đ</w:t>
+      </w:r>
+      <w:r>
+        <w:t>ỗ phương tiện vận chuyển hóa chất cấm;</w:t>
       </w:r>
     </w:p>
     <w:p>
@@ -2335,7 +2667,10 @@
         <w:spacing w:before="120" w:after="280" w:afterAutospacing="1"/>
       </w:pPr>
       <w:r>
-        <w:t>c) Không dừng, đỗ phương tiện vận chuyển hóa chất cấm ở nơi đông người, khu vực dân cư, gần trạm xăng dầu, nơi có công trình quan trọng về quốc phòng, an ninh, kinh tế, văn hóa, ngoại giao. Trường hợp cần dừng, đỗ phương tiện vận chuyển hóa chất cấm qua đêm hoặc do sự cố phải thông báo ngay cho cơ quan quân sự, cơ quan công an nơi gần nhất để phối hợp bảo vệ.</w:t>
+        <w:t>c) Không dừng, đỗ phương tiện vận chuyển hóa chất cấm ở nơi đông người, khu vực dân cư, gần trạm xăng dầu, nơi có công trình qua</w:t>
+      </w:r>
+      <w:r>
+        <w:t>n trọng về quốc phòng, an ninh, kinh tế, văn hóa, ngoại giao. Trường hợp cần dừng, đỗ phương tiện vận chuyển hóa chất cấm qua đêm hoặc do sự cố phải thông báo ngay cho cơ quan quân sự, cơ quan công an nơi gần nhất để phối hợp bảo vệ.</w:t>
       </w:r>
     </w:p>
     <w:p>
@@ -2348,9 +2683,73 @@
           <w:b/>
           <w:bCs/>
         </w:rPr>
-        <w:t>Điều 14. Tồn trữ hóa chất</w:t>
+        <w:t xml:space="preserve">Điều 14. </w:t>
+      </w:r>
+      <w:proofErr w:type="spellStart"/>
+      <w:r>
+        <w:rPr>
+          <w:b/>
+          <w:bCs/>
+        </w:rPr>
+        <w:t>Tồn</w:t>
+      </w:r>
+      <w:proofErr w:type="spellEnd"/>
+      <w:r>
+        <w:rPr>
+          <w:b/>
+          <w:bCs/>
+        </w:rPr>
+        <w:t xml:space="preserve"> </w:t>
+      </w:r>
+      <w:proofErr w:type="spellStart"/>
+      <w:r>
+        <w:rPr>
+          <w:b/>
+          <w:bCs/>
+        </w:rPr>
+        <w:t>trữ</w:t>
+      </w:r>
+      <w:proofErr w:type="spellEnd"/>
+      <w:r>
+        <w:rPr>
+          <w:b/>
+          <w:bCs/>
+        </w:rPr>
+        <w:t xml:space="preserve"> </w:t>
+      </w:r>
+      <w:proofErr w:type="spellStart"/>
+      <w:r>
+        <w:rPr>
+          <w:b/>
+          <w:bCs/>
+        </w:rPr>
+        <w:t>hóa</w:t>
+      </w:r>
+      <w:proofErr w:type="spellEnd"/>
+      <w:r>
+        <w:rPr>
+          <w:b/>
+          <w:bCs/>
+        </w:rPr>
+        <w:t xml:space="preserve"> </w:t>
+      </w:r>
+      <w:proofErr w:type="spellStart"/>
+      <w:r>
+        <w:rPr>
+          <w:b/>
+          <w:bCs/>
+        </w:rPr>
+        <w:t>c</w:t>
+      </w:r>
+      <w:r>
+        <w:rPr>
+          <w:b/>
+          <w:bCs/>
+        </w:rPr>
+        <w:t>hất</w:t>
       </w:r>
       <w:bookmarkEnd w:id="79"/>
+      <w:proofErr w:type="spellEnd"/>
     </w:p>
     <w:p>
       <w:pPr>
@@ -2398,15 +2797,21 @@
         <w:spacing w:before="120" w:after="280" w:afterAutospacing="1"/>
       </w:pPr>
       <w:r>
-        <w:t>b) Có thông tin cảnh báo cần thiết tại nơi tồn trữ hóa chất nguy hiểm, nội quy về an toàn hóa chất, có hệ thống báo hiệu phù hợp với mức độ nguy hiểm của hóa chất tại khu vực tồn trữ hóa chất nguy hiểm. Trường hợp hóa chất có nhiều đặc tính nguy hiểm khác nhau thì biểu trưng cảnh báo phải thể hiện đầy đủ các đặc tính nguy hiểm đó;</w:t>
-      </w:r>
-    </w:p>
-    <w:p>
-      <w:pPr>
-        <w:spacing w:before="120" w:after="280" w:afterAutospacing="1"/>
-      </w:pPr>
-      <w:r>
-        <w:t>c) Có trang thiết bị, phương tiện ứng cứu sự cố phù hợp với đặc tính nguy hiểm của hóa chất.</w:t>
+        <w:t>b) Có thông tin cảnh báo cần thiết tại nơi tồn trữ hóa chất nguy hiểm, nội quy về an toàn hóa chất, c</w:t>
+      </w:r>
+      <w:r>
+        <w:t>ó hệ thống báo hiệu phù hợp với mức độ nguy hiểm của hóa chất tại khu vực tồn trữ hóa chất nguy hiểm. Trường hợp hóa chất có nhiều đặc tính nguy hiểm khác nhau thì biểu trưng cảnh báo phải thể hiện đầy đủ các đặc tính nguy hiểm đó;</w:t>
+      </w:r>
+    </w:p>
+    <w:p>
+      <w:pPr>
+        <w:spacing w:before="120" w:after="280" w:afterAutospacing="1"/>
+      </w:pPr>
+      <w:r>
+        <w:t>c) Có trang thiết bị, ph</w:t>
+      </w:r>
+      <w:r>
+        <w:t>ương tiện ứng cứu sự cố phù hợp với đặc tính nguy hiểm của hóa chất.</w:t>
       </w:r>
     </w:p>
     <w:p>
@@ -2438,7 +2843,10 @@
         <w:spacing w:before="120" w:after="280" w:afterAutospacing="1"/>
       </w:pPr>
       <w:r>
-        <w:t>b) Tổ chức, cá nhân phải có kho chứa để thực hiện tồn trữ hóa chất có điều kiện hoặc sử dụng dịch vụ tồn trữ hóa chất của tổ chức được cơ quan có thẩm quyền cấp Giấy chứng nhận đủ điều kiện hoạt động dịch vụ tồn trữ hóa chất theo quy định tại khoản 5 Điều này.</w:t>
+        <w:t>b) T</w:t>
+      </w:r>
+      <w:r>
+        <w:t>ổ chức, cá nhân phải có kho chứa để thực hiện tồn trữ hóa chất có điều kiện hoặc sử dụng dịch vụ tồn trữ hóa chất của tổ chức được cơ quan có thẩm quyền cấp Giấy chứng nhận đủ điều kiện hoạt động dịch vụ tồn trữ hóa chất theo quy định tại khoản 5 Điều này.</w:t>
       </w:r>
     </w:p>
     <w:p>
@@ -2472,15 +2880,21 @@
         <w:spacing w:before="120" w:after="280" w:afterAutospacing="1"/>
       </w:pPr>
       <w:r>
-        <w:t>b) Hóa chất cần kiểm soát đặc biệt phải được quản lý; tồn trữ bảo đảm an toàn; phòng, chống thất thoát, hư hỏng;</w:t>
-      </w:r>
-    </w:p>
-    <w:p>
-      <w:pPr>
-        <w:spacing w:before="120" w:after="280" w:afterAutospacing="1"/>
-      </w:pPr>
-      <w:r>
-        <w:t>c) Tổ chức, cá nhân phải có kho chứa để thực hiện tồn trữ hóa chất cần kiểm soát đặc biệt hoặc sử dụng dịch vụ tồn trữ hóa chất của tổ chức được cơ quan có thẩm quyền cấp Giấy chứng nhận đủ điều kiện hoạt động dịch vụ tồn trữ hóa chất theo quy định tại khoản 5 Điều này.</w:t>
+        <w:t>b) Hóa chất cần kiểm soát đặc biệt phải được</w:t>
+      </w:r>
+      <w:r>
+        <w:t xml:space="preserve"> quản lý; tồn trữ bảo đảm an toàn; phòng, chống thất thoát, hư hỏng;</w:t>
+      </w:r>
+    </w:p>
+    <w:p>
+      <w:pPr>
+        <w:spacing w:before="120" w:after="280" w:afterAutospacing="1"/>
+      </w:pPr>
+      <w:r>
+        <w:t xml:space="preserve">c) Tổ chức, cá nhân phải có kho chứa để thực hiện tồn trữ hóa chất cần kiểm soát đặc biệt hoặc sử dụng dịch vụ tồn trữ hóa chất của tổ chức được cơ quan có thẩm quyền cấp Giấy chứng nhận </w:t>
+      </w:r>
+      <w:r>
+        <w:t>đủ điều kiện hoạt động dịch vụ tồn trữ hóa chất theo quy định tại khoản 5 Điều này.</w:t>
       </w:r>
     </w:p>
     <w:p>
@@ -2514,7 +2928,10 @@
         <w:spacing w:before="120" w:after="280" w:afterAutospacing="1"/>
       </w:pPr>
       <w:r>
-        <w:t>b) Hóa chất cấm phải được quản lý; tồn trữ bảo đảm an toàn; phòng, chống thất thoát, hư hỏng;</w:t>
+        <w:t>b) Hóa ch</w:t>
+      </w:r>
+      <w:r>
+        <w:t>ất cấm phải được quản lý; tồn trữ bảo đảm an toàn; phòng, chống thất thoát, hư hỏng;</w:t>
       </w:r>
     </w:p>
     <w:p>
@@ -2534,7 +2951,10 @@
       </w:r>
       <w:bookmarkStart w:id="88" w:name="tc_25"/>
       <w:r>
-        <w:t>điểm d khoản 3 Điều 9 của Luật này</w:t>
+        <w:t xml:space="preserve">điểm </w:t>
+      </w:r>
+      <w:r>
+        <w:t>d khoản 3 Điều 9 của Luật này</w:t>
       </w:r>
       <w:bookmarkEnd w:id="88"/>
       <w:r>
@@ -2555,7 +2975,10 @@
         <w:spacing w:before="120" w:after="280" w:afterAutospacing="1"/>
       </w:pPr>
       <w:r>
-        <w:t xml:space="preserve">a) Đáp ứng yêu cầu tại khoản 1 Điều này, </w:t>
+        <w:t xml:space="preserve">a) </w:t>
+      </w:r>
+      <w:r>
+        <w:t xml:space="preserve">Đáp ứng yêu cầu tại khoản 1 Điều này, </w:t>
       </w:r>
       <w:bookmarkStart w:id="89" w:name="tc_26"/>
       <w:r>
@@ -2579,7 +3002,10 @@
         <w:spacing w:before="120" w:after="280" w:afterAutospacing="1"/>
       </w:pPr>
       <w:r>
-        <w:t>6. Giấy chứng nhận đủ điều kiện hoạt động dịch vụ tồn trữ hóa chất có thời hạn 05 năm kể từ ngày cấp.</w:t>
+        <w:t xml:space="preserve">6. Giấy chứng nhận đủ </w:t>
+      </w:r>
+      <w:r>
+        <w:t>điều kiện hoạt động dịch vụ tồn trữ hóa chất có thời hạn 05 năm kể từ ngày cấp.</w:t>
       </w:r>
     </w:p>
     <w:p>
@@ -2588,7 +3014,10 @@
       </w:pPr>
       <w:bookmarkStart w:id="90" w:name="khoan_7_14"/>
       <w:r>
-        <w:t>7. Chính phủ quy định chi tiết điểm b và điểm c khoản 1 Điều này; quy định nội dung Giấy chứng nhận đủ điều kiện hoạt động dịch vụ tồn trữ hóa chất; quy định điều kiện, trình tự, thủ tục, thẩm quyền cấp, cấp lại, điều chỉnh, thu hồi Giấy chứng nhận đủ điều kiện hoạt động dịch vụ tồn trữ hóa chất.</w:t>
+        <w:t xml:space="preserve">7. Chính phủ quy định chi tiết điểm b và điểm c khoản 1 Điều này; quy định nội dung Giấy chứng nhận đủ điều kiện hoạt động dịch vụ tồn trữ hóa chất; quy định điều kiện, </w:t>
+      </w:r>
+      <w:r>
+        <w:t>trình tự, thủ tục, thẩm quyền cấp, cấp lại, điều chỉnh, thu hồi Giấy chứng nhận đủ điều kiện hoạt động dịch vụ tồn trữ hóa chất.</w:t>
       </w:r>
       <w:bookmarkEnd w:id="90"/>
     </w:p>
@@ -2611,7 +3040,10 @@
         <w:spacing w:before="120" w:after="280" w:afterAutospacing="1"/>
       </w:pPr>
       <w:r>
-        <w:t xml:space="preserve">1. Tổ chức, cá nhân sử dụng hóa chất phải bảo đảm các điều kiện về an ninh, trật tự, phòng cháy và chữa cháy, an toàn thực phẩm, bảo vệ môi trường và tuân thủ yêu cầu về bảo đảm an toàn trong hoạt động sử dụng hóa chất quy định tại </w:t>
+        <w:t>1. Tổ chức, cá nhân sử dụng hóa chất phải bảo đảm các điều kiện về an ninh, trật tự, phòng cháy và ch</w:t>
+      </w:r>
+      <w:r>
+        <w:t xml:space="preserve">ữa cháy, an toàn thực phẩm, bảo vệ môi trường và tuân thủ yêu cầu về bảo đảm an toàn trong hoạt động sử dụng hóa chất quy định tại </w:t>
       </w:r>
       <w:bookmarkStart w:id="92" w:name="tc_27"/>
       <w:r>
@@ -2635,7 +3067,10 @@
         <w:spacing w:before="120" w:after="280" w:afterAutospacing="1"/>
       </w:pPr>
       <w:r>
-        <w:t xml:space="preserve">a) Hoạt động sử dụng hóa chất cần kiểm soát đặc biệt thực hiện theo quy định tại khoản 1 và khoản 4 Điều này, </w:t>
+        <w:t>a) Hoạt động sử dụng hóa chất cần kiể</w:t>
+      </w:r>
+      <w:r>
+        <w:t xml:space="preserve">m soát đặc biệt thực hiện theo quy định tại khoản 1 và khoản 4 Điều này, </w:t>
       </w:r>
       <w:bookmarkStart w:id="93" w:name="tc_28"/>
       <w:r>
@@ -2652,7 +3087,10 @@
       </w:pPr>
       <w:bookmarkStart w:id="94" w:name="diem_b_2_15"/>
       <w:r>
-        <w:t>b) Tổ chức, cá nhân sử dụng hóa chất cần kiểm soát đặc biệt có nghĩa vụ công bố loại hóa chất và mục đích sử dụng hóa chất trên Cơ sở dữ liệu chuyên ngành hóa chất trước khi sử dụng lần đầu hoặc trước khi thay đổi mục đích sử dụng.</w:t>
+        <w:t xml:space="preserve">b) Tổ chức, cá nhân sử dụng hóa chất cần kiểm soát đặc biệt có nghĩa vụ công bố loại hóa chất và mục đích sử dụng hóa chất trên Cơ sở dữ </w:t>
+      </w:r>
+      <w:r>
+        <w:t>liệu chuyên ngành hóa chất trước khi sử dụng lần đầu hoặc trước khi thay đổi mục đích sử dụng.</w:t>
       </w:r>
       <w:bookmarkEnd w:id="94"/>
     </w:p>
@@ -2669,7 +3107,10 @@
         <w:spacing w:before="120" w:after="280" w:afterAutospacing="1"/>
       </w:pPr>
       <w:r>
-        <w:t xml:space="preserve">a) Tổ chức sử dụng hóa chất cấm phải được thành lập theo quy định của pháp luật; có hoạt động đặc biệt sử dụng hóa chất cấm theo mục đích quy định tại </w:t>
+        <w:t>a) Tổ chức sử dụng hóa chất cấm phải được thành lập theo quy định của pháp luật; có hoạt động đặc biệt sử dụng hóa</w:t>
+      </w:r>
+      <w:r>
+        <w:t xml:space="preserve"> chất cấm theo mục đích quy định tại </w:t>
       </w:r>
       <w:bookmarkStart w:id="95" w:name="tvpllink_gwozgqnrqo_6"/>
       <w:r>
@@ -2710,7 +3151,10 @@
       </w:pPr>
       <w:bookmarkStart w:id="98" w:name="khoan_4_15"/>
       <w:r>
-        <w:t>4. Theo yêu cầu quản lý, Bộ trưởng, Thủ trưởng cơ quan ngang Bộ quy định về hóa chất không được sử dụng trong phạm vi ngành, lĩnh vực được phân công.</w:t>
+        <w:t>4. Theo yêu cầu quản lý, Bộ trưởng, Th</w:t>
+      </w:r>
+      <w:r>
+        <w:t>ủ trưởng cơ quan ngang Bộ quy định về hóa chất không được sử dụng trong phạm vi ngành, lĩnh vực được phân công.</w:t>
       </w:r>
       <w:bookmarkEnd w:id="98"/>
     </w:p>
@@ -2742,15 +3186,24 @@
         <w:spacing w:before="120" w:after="280" w:afterAutospacing="1"/>
       </w:pPr>
       <w:r>
-        <w:t>1. Tổ chức, cá nhân thực hiện hoạt động hóa chất phải xử lý chất thải, bao bì, thiết bị chứa hóa chất thải bỏ từ hoạt động hóa chất và các vật dụng khác có liên quan đến quá trình sử dụng có chứa yếu tố độc hại, dễ cháy, dễ nổ, gây ăn mòn, gây nhiễm độc hoặc có đặc tính nguy hại dễ gây ô nhiễm môi trường và các đặc tính nguy hại khác theo quy định của Luật này, quy định của pháp luật về bảo vệ môi trường, an toàn lao động và quy định khác của pháp luật có liên quan.</w:t>
-      </w:r>
-    </w:p>
-    <w:p>
-      <w:pPr>
-        <w:spacing w:before="120" w:after="280" w:afterAutospacing="1"/>
-      </w:pPr>
-      <w:r>
-        <w:t xml:space="preserve">2. Tổ chức, cá nhân xử lý chất thải công nghiệp từ hoạt động hóa chất phải thực hiện quy định tại khoản 1 Điều này và </w:t>
+        <w:t>1. Tổ chức, cá nhân thực hiện hoạt động h</w:t>
+      </w:r>
+      <w:r>
+        <w:t>óa chất phải xử lý chất thải, bao bì, thiết bị chứa hóa chất thải bỏ từ hoạt động hóa chất và các vật dụng khác có liên quan đến quá trình sử dụng có chứa yếu tố độc hại, dễ cháy, dễ nổ, gây ăn mòn, gây nhiễm độc hoặc có đặc tính nguy hại dễ gây ô nhiễm mô</w:t>
+      </w:r>
+      <w:r>
+        <w:t>i trường và các đặc tính nguy hại khác theo quy định của Luật này, quy định của pháp luật về bảo vệ môi trường, an toàn lao động và quy định khác của pháp luật có liên quan.</w:t>
+      </w:r>
+    </w:p>
+    <w:p>
+      <w:pPr>
+        <w:spacing w:before="120" w:after="280" w:afterAutospacing="1"/>
+      </w:pPr>
+      <w:r>
+        <w:t>2. Tổ chức, cá nhân xử lý chất thải công nghiệp từ hoạt động hóa chất phải thực hi</w:t>
+      </w:r>
+      <w:r>
+        <w:t xml:space="preserve">ện quy định tại khoản 1 Điều này và </w:t>
       </w:r>
       <w:bookmarkStart w:id="100" w:name="tc_30"/>
       <w:r>
@@ -2780,7 +3233,10 @@
         <w:spacing w:before="120" w:after="280" w:afterAutospacing="1"/>
       </w:pPr>
       <w:r>
-        <w:t>1. Tổ chức kinh doanh hóa chất thuộc Danh mục hóa chất cần kiểm soát đặc biệt phải lập phiếu kiểm soát mua, bán hóa chất cần kiểm soát đặc biệt cho từng lần giao hàng.</w:t>
+        <w:t>1. Tổ chức kinh doanh hóa chất thuộc Danh mục hóa chất cần kiểm soát đặc biệt phải lập phiếu kiểm soát mua, bán hóa chất cần kiểm soát đặc</w:t>
+      </w:r>
+      <w:r>
+        <w:t xml:space="preserve"> biệt cho từng lần giao hàng.</w:t>
       </w:r>
     </w:p>
     <w:p>
@@ -2804,15 +3260,21 @@
         <w:spacing w:before="120" w:after="280" w:afterAutospacing="1"/>
       </w:pPr>
       <w:r>
-        <w:t>b) Tổ chức, cá nhân sử dụng hóa chất cần kiểm soát đặc biệt đã thực hiện công bố loại hóa chất và mục đích sử dụng hóa chất trên Cơ sở dữ liệu chuyên ngành hóa chất.</w:t>
-      </w:r>
-    </w:p>
-    <w:p>
-      <w:pPr>
-        <w:spacing w:before="120" w:after="280" w:afterAutospacing="1"/>
-      </w:pPr>
-      <w:r>
-        <w:t>3. Thủ trưởng cơ quan quản lý nhà nước ở trung ương về hóa chất quy định biểu mẫu, thời hạn, phương thức và lộ trình thực hiện lập phiếu kiểm soát mua, bán hóa chất cần kiểm soát đặc biệt trên Cơ sở dữ liệu chuyên ngành hóa chất.</w:t>
+        <w:t>b) Tổ ch</w:t>
+      </w:r>
+      <w:r>
+        <w:t>ức, cá nhân sử dụng hóa chất cần kiểm soát đặc biệt đã thực hiện công bố loại hóa chất và mục đích sử dụng hóa chất trên Cơ sở dữ liệu chuyên ngành hóa chất.</w:t>
+      </w:r>
+    </w:p>
+    <w:p>
+      <w:pPr>
+        <w:spacing w:before="120" w:after="280" w:afterAutospacing="1"/>
+      </w:pPr>
+      <w:r>
+        <w:t xml:space="preserve">3. Thủ trưởng cơ quan quản lý nhà nước ở trung ương về hóa chất quy định biểu mẫu, thời hạn, </w:t>
+      </w:r>
+      <w:r>
+        <w:t>phương thức và lộ trình thực hiện lập phiếu kiểm soát mua, bán hóa chất cần kiểm soát đặc biệt trên Cơ sở dữ liệu chuyên ngành hóa chất.</w:t>
       </w:r>
     </w:p>
     <w:p>
@@ -2825,7 +3287,14 @@
           <w:b/>
           <w:bCs/>
         </w:rPr>
-        <w:t>Điều 18. Miễn cấp Giấy chứng nhận đủ điều kiện sản xuất, kinh doanh hóa chất có điều kiện; Giấy phép sản xuất, kinh doanh, xuất khẩu, nhập khẩu hóa chất cần kiểm soát đặc biệt; Giấy phép sản xuất, nhập khẩu hóa chất cấm; Giấy chứng nhận đủ điều kiện hoạt động dịch vụ tồn trữ hóa chất</w:t>
+        <w:t>Điều 18. Miễn cấp Giấy chứng nhận đủ điều kiện sản xuất, kinh doanh hóa chất có điều kiện; Giấy phép sản xuất, kinh doa</w:t>
+      </w:r>
+      <w:r>
+        <w:rPr>
+          <w:b/>
+          <w:bCs/>
+        </w:rPr>
+        <w:t>nh, xuất khẩu, nhập khẩu hóa chất cần kiểm soát đặc biệt; Giấy phép sản xuất, nhập khẩu hóa chất cấm; Giấy chứng nhận đủ điều kiện hoạt động dịch vụ tồn trữ hóa chất</w:t>
       </w:r>
       <w:bookmarkEnd w:id="102"/>
     </w:p>
@@ -2835,7 +3304,10 @@
       </w:pPr>
       <w:bookmarkStart w:id="103" w:name="khoan_1_18"/>
       <w:r>
-        <w:t>1. Các trường hợp được miễn cấp Giấy chứng nhận đủ điều kiện sản xuất, kinh doanh hóa chất có điều kiện; Giấy phép sản xuất, kinh doanh, xuất khẩu, nhập khẩu hóa chất cần kiểm soát đặc biệt; Giấy phép sản xuất, nhập khẩu hóa chất cấm; Giấy chứng nhận đủ điều kiện hoạt động dịch vụ tồn trữ hóa chất bao gồm:</w:t>
+        <w:t>1. Các trường hợp được miễn cấp Giấy chứng nhận đủ điều kiện sản xuất, kinh doanh hóa chất</w:t>
+      </w:r>
+      <w:r>
+        <w:t xml:space="preserve"> có điều kiện; Giấy phép sản xuất, kinh doanh, xuất khẩu, nhập khẩu hóa chất cần kiểm soát đặc biệt; Giấy phép sản xuất, nhập khẩu hóa chất cấm; Giấy chứng nhận đủ điều kiện hoạt động dịch vụ tồn trữ hóa chất bao gồm:</w:t>
       </w:r>
       <w:bookmarkEnd w:id="103"/>
     </w:p>
@@ -2844,7 +3316,10 @@
         <w:spacing w:before="120" w:after="280" w:afterAutospacing="1"/>
       </w:pPr>
       <w:r>
-        <w:t xml:space="preserve">a) Hỗn hợp chất có chứa chất thuộc danh mục do Chính phủ ban hành theo quy định tại </w:t>
+        <w:t>a) Hỗn hợp chất có chứa chất thuộc dan</w:t>
+      </w:r>
+      <w:r>
+        <w:t xml:space="preserve">h mục do Chính phủ ban hành theo quy định tại </w:t>
       </w:r>
       <w:bookmarkStart w:id="104" w:name="tc_31"/>
       <w:r>
@@ -2860,7 +3335,10 @@
         <w:spacing w:before="120" w:after="280" w:afterAutospacing="1"/>
       </w:pPr>
       <w:r>
-        <w:t>b) Trường hợp san chiết, pha chế hóa chất nhằm phục vụ trực tiếp cho hoạt động sản xuất nội bộ của tổ chức thực hiện việc san chiết, pha chế;</w:t>
+        <w:t>b) Trường hợp san chiết, pha chế hóa chất nhằm phục vụ trực tiếp cho hoạt động sản xuất nội bộ của tổ chức thực hiện vi</w:t>
+      </w:r>
+      <w:r>
+        <w:t>ệc san chiết, pha chế;</w:t>
       </w:r>
     </w:p>
     <w:p>
@@ -2892,7 +3370,14 @@
           <w:b/>
           <w:bCs/>
         </w:rPr>
-        <w:t>Điều 19. Thu hồi Giấy chứng nhận đủ điều kiện sản xuất, kinh doanh hóa chất có điều kiện; Giấy phép sản xuất, kinh doanh, xuất khẩu, nhập khẩu hóa chất cần kiểm soát đặc biệt; Giấy phép sản xuất, nhập khẩu hóa chất cấm; Giấy chứng nhận đủ điều kiện hoạt động dịch vụ tồn trữ hóa chất</w:t>
+        <w:t>Điều 19. Thu hồi Giấy chứng nhận đủ điều kiện sản xuất, kinh doanh hóa chất có điều kiện; Giấy phép sản xuất, kinh doanh, xuất khẩu, nhậ</w:t>
+      </w:r>
+      <w:r>
+        <w:rPr>
+          <w:b/>
+          <w:bCs/>
+        </w:rPr>
+        <w:t>p khẩu hóa chất cần kiểm soát đặc biệt; Giấy phép sản xuất, nhập khẩu hóa chất cấm; Giấy chứng nhận đủ điều kiện hoạt động dịch vụ tồn trữ hóa chất</w:t>
       </w:r>
       <w:bookmarkEnd w:id="106"/>
     </w:p>
@@ -2902,7 +3387,10 @@
       </w:pPr>
       <w:bookmarkStart w:id="107" w:name="khoan_1_19"/>
       <w:r>
-        <w:t>1. Giấy chứng nhận đủ điều kiện sản xuất, kinh doanh hóa chất có điều kiện; Giấy phép sản xuất, kinh doanh, xuất khẩu, nhập khẩu hóa chất cần kiểm soát đặc biệt; Giấy phép sản xuất, nhập khẩu hóa chất cấm; Giấy chứng nhận đủ điều kiện hoạt động dịch vụ tồn trữ hóa chất bị thu hồi trong các trường hợp sau đây:</w:t>
+        <w:t xml:space="preserve">1. Giấy chứng nhận đủ điều kiện sản xuất, kinh doanh hóa chất có điều kiện; Giấy phép sản xuất, kinh doanh, </w:t>
+      </w:r>
+      <w:r>
+        <w:t>xuất khẩu, nhập khẩu hóa chất cần kiểm soát đặc biệt; Giấy phép sản xuất, nhập khẩu hóa chất cấm; Giấy chứng nhận đủ điều kiện hoạt động dịch vụ tồn trữ hóa chất bị thu hồi trong các trường hợp sau đây:</w:t>
       </w:r>
       <w:bookmarkEnd w:id="107"/>
     </w:p>
@@ -2911,15 +3399,21 @@
         <w:spacing w:before="120" w:after="280" w:afterAutospacing="1"/>
       </w:pPr>
       <w:r>
-        <w:t>a) Tổ chức được cấp giấy phép, giấy chứng nhận tự chấm dứt hoạt động hóa chất và có văn bản đề nghị thu hồi gửi cơ quan cấp giấy phép, giấy chứng nhận;</w:t>
-      </w:r>
-    </w:p>
-    <w:p>
-      <w:pPr>
-        <w:spacing w:before="120" w:after="280" w:afterAutospacing="1"/>
-      </w:pPr>
-      <w:r>
-        <w:t>b) Giấy chứng nhận đăng ký doanh nghiệp, Giấy chứng nhận đăng ký hộ kinh doanh hoặc giấy tờ có giá trị pháp lý tương đương bị thu hồi hoặc tổ chức giải thể, phá sản theo quy định của pháp luật; cá nhân chết hoặc bị Tòa án tuyên bố là đã chết;</w:t>
+        <w:t xml:space="preserve">a) Tổ chức được cấp giấy phép, giấy chứng nhận tự </w:t>
+      </w:r>
+      <w:r>
+        <w:t>chấm dứt hoạt động hóa chất và có văn bản đề nghị thu hồi gửi cơ quan cấp giấy phép, giấy chứng nhận;</w:t>
+      </w:r>
+    </w:p>
+    <w:p>
+      <w:pPr>
+        <w:spacing w:before="120" w:after="280" w:afterAutospacing="1"/>
+      </w:pPr>
+      <w:r>
+        <w:t>b) Giấy chứng nhận đăng ký doanh nghiệp, Giấy chứng nhận đăng ký hộ kinh doanh hoặc giấy tờ có giá trị pháp lý tương đương bị thu hồi hoặc tổ chức giải th</w:t>
+      </w:r>
+      <w:r>
+        <w:t>ể, phá sản theo quy định của pháp luật; cá nhân chết hoặc bị Tòa án tuyên bố là đã chết;</w:t>
       </w:r>
     </w:p>
     <w:p>
@@ -2935,7 +3429,10 @@
         <w:spacing w:before="120" w:after="280" w:afterAutospacing="1"/>
       </w:pPr>
       <w:r>
-        <w:t>d) Giấy phép, giấy chứng nhận được cấp không đúng thẩm quyền, đối tượng hoặc có nội dung trái quy định của pháp luật;</w:t>
+        <w:t>d) Giấy phép, giấy chứng nhận được cấp không đúng t</w:t>
+      </w:r>
+      <w:r>
+        <w:t>hẩm quyền, đối tượng hoặc có nội dung trái quy định của pháp luật;</w:t>
       </w:r>
     </w:p>
     <w:p>
@@ -2951,7 +3448,10 @@
         <w:spacing w:before="120" w:after="280" w:afterAutospacing="1"/>
       </w:pPr>
       <w:r>
-        <w:t>e) Không khắc phục kịp thời theo yêu cầu của cơ quan nhà nước có thẩm quyền để đáp ứng đầy đủ các điều kiện trong quá trình hoạt động hóa chất;</w:t>
+        <w:t>e) Không khắc phục kịp thời theo yêu cầu của cơ quan</w:t>
+      </w:r>
+      <w:r>
+        <w:t xml:space="preserve"> nhà nước có thẩm quyền để đáp ứng đầy đủ các điều kiện trong quá trình hoạt động hóa chất;</w:t>
       </w:r>
     </w:p>
     <w:p>
@@ -2968,7 +3468,10 @@
       </w:pPr>
       <w:bookmarkStart w:id="108" w:name="khoan_2_19"/>
       <w:r>
-        <w:t>2. Chính phủ quy định trình tự, thủ tục thu hồi giấy phép, giấy chứng nhận quy định tại khoản 1 Điều này.</w:t>
+        <w:t>2. Chính phủ quy định trình tự, thủ tục thu hồi giấy phép, giấy chứng nhận quy định tại khoản 1 Điều nà</w:t>
+      </w:r>
+      <w:r>
+        <w:t>y.</w:t>
       </w:r>
       <w:bookmarkEnd w:id="108"/>
     </w:p>
@@ -3027,7 +3530,10 @@
         <w:spacing w:before="120" w:after="280" w:afterAutospacing="1"/>
       </w:pPr>
       <w:r>
-        <w:t>1. Hóa chất mới là chất chưa có trong Danh mục hóa chất quốc gia và danh mục hóa chất nước ngoài được cơ quan nhà nước có thẩm quyền của Việt Nam thừa nhận. Hóa chất mới chỉ được đưa vào sử dụng, lưu thông trên thị trường sau khi được đăng ký với cơ quan nhà nước có thẩm quyền.</w:t>
+        <w:t>1. Hóa chất mới là chất chưa có trong Danh mục hóa chất quốc gia và danh mục hóa chất nước ngoài được cơ quan nhà nước có thẩm quyền của Việt Nam thừa nhận. Hóa chất mới chỉ được đưa vào sử dụn</w:t>
+      </w:r>
+      <w:r>
+        <w:t>g, lưu thông trên thị trường sau khi được đăng ký với cơ quan nhà nước có thẩm quyền.</w:t>
       </w:r>
     </w:p>
     <w:p>
@@ -3054,7 +3560,10 @@
         <w:spacing w:before="120" w:after="280" w:afterAutospacing="1"/>
       </w:pPr>
       <w:r>
-        <w:t xml:space="preserve">b) Kết quả đánh giá hóa chất mới gồm thông tin về tính chất vật lý, hóa học và đặc tính nguy hiểm của hóa chất được cung cấp bởi tổ chức đánh giá hóa chất mới quy định tại </w:t>
+        <w:t xml:space="preserve">b) Kết quả đánh giá hóa chất mới gồm thông tin về tính chất vật lý, hóa học và đặc tính nguy hiểm </w:t>
+      </w:r>
+      <w:r>
+        <w:t xml:space="preserve">của hóa chất được cung cấp bởi tổ chức đánh giá hóa chất mới quy định tại </w:t>
       </w:r>
       <w:bookmarkStart w:id="113" w:name="tc_32"/>
       <w:r>
@@ -3070,7 +3579,10 @@
         <w:spacing w:before="120" w:after="280" w:afterAutospacing="1"/>
       </w:pPr>
       <w:r>
-        <w:t>Hồ sơ đăng ký hóa chất mới sử dụng cho mục đích nghiên cứu khoa học, quốc phòng, an ninh, phòng, chống thiên tai, dịch bệnh, thông tin quy định tại điểm này được bổ sung trong thời hạn 05 năm kể từ ngày đăng ký.</w:t>
+        <w:t>Hồ sơ đăng ký hóa chất mới sử dụng cho mục đích nghiên cứu khoa học, quốc phòng, an ninh, phòng, chống thiên tai, dịch bệnh, thông tin quy định tại điểm này đượ</w:t>
+      </w:r>
+      <w:r>
+        <w:t>c bổ sung trong thời hạn 05 năm kể từ ngày đăng ký.</w:t>
       </w:r>
     </w:p>
     <w:p>
@@ -3079,7 +3591,10 @@
       </w:pPr>
       <w:bookmarkStart w:id="114" w:name="khoan_3_20"/>
       <w:r>
-        <w:t>3. Chính phủ quy định lộ trình xây dựng Danh mục hóa chất quốc gia và thừa nhận danh mục hóa chất nước ngoài; quy định trình tự, thủ tục đăng ký hóa chất mới quy định tại khoản 1 Điều này; quy định chi tiết khoản 2 Điều này.</w:t>
+        <w:t>3. Chính phủ quy định lộ trình xây dựng Danh mục hóa chất quốc gia và thừa nhận danh mục hóa chất nước ngoài; quy định trình tự, thủ tục đăng ký hóa chất mới quy định tại khoản 1 Điều này; quy định chi ti</w:t>
+      </w:r>
+      <w:r>
+        <w:t>ết khoản 2 Điều này.</w:t>
       </w:r>
       <w:bookmarkEnd w:id="114"/>
     </w:p>
@@ -3120,15 +3635,21 @@
         <w:spacing w:before="120" w:after="280" w:afterAutospacing="1"/>
       </w:pPr>
       <w:r>
-        <w:t>b) Tổ chức thử nghiệm của nước ngoài được quốc gia là thành viên của Tổ chức hợp tác và phát triển kinh tế (OECD) thừa nhận về đánh giá hóa chất;</w:t>
-      </w:r>
-    </w:p>
-    <w:p>
-      <w:pPr>
-        <w:spacing w:before="120" w:after="280" w:afterAutospacing="1"/>
-      </w:pPr>
-      <w:r>
-        <w:t>c) Tổ chức thử nghiệm của quốc gia đã ký kết với nước Cộng hòa xã hội chủ nghĩa Việt Nam về thỏa thuận thừa nhận lẫn nhau kết quả đánh giá sự phù hợp.</w:t>
+        <w:t>b) Tổ chức thử nghiệm của nước ngoà</w:t>
+      </w:r>
+      <w:r>
+        <w:t>i được quốc gia là thành viên của Tổ chức hợp tác và phát triển kinh tế (OECD) thừa nhận về đánh giá hóa chất;</w:t>
+      </w:r>
+    </w:p>
+    <w:p>
+      <w:pPr>
+        <w:spacing w:before="120" w:after="280" w:afterAutospacing="1"/>
+      </w:pPr>
+      <w:r>
+        <w:t>c) Tổ chức thử nghiệm của quốc gia đã ký kết với nước Cộng hòa xã hội chủ nghĩa Việt Nam về thỏa thuận thừa nhận lẫn nhau kết quả đánh giá sự phù</w:t>
+      </w:r>
+      <w:r>
+        <w:t xml:space="preserve"> hợp.</w:t>
       </w:r>
     </w:p>
     <w:p>
@@ -3168,15 +3689,24 @@
         <w:spacing w:before="120" w:after="280" w:afterAutospacing="1"/>
       </w:pPr>
       <w:r>
-        <w:t>2. Trong thời hạn 05 năm kể từ ngày hóa chất mới được đăng ký, hằng năm, tổ chức, cá nhân có hoạt động hóa chất liên quan đến hóa chất mới phải cập nhật thông tin, dữ liệu vào Cơ sở dữ liệu chuyên ngành hóa chất về quá trình hoạt động với hóa chất mới.</w:t>
-      </w:r>
-    </w:p>
-    <w:p>
-      <w:pPr>
-        <w:spacing w:before="120" w:after="280" w:afterAutospacing="1"/>
-      </w:pPr>
-      <w:r>
-        <w:t>3. Căn cứ kết quả đánh giá hóa chất mới và báo cáo quá trình hoạt động với hóa chất mới trong thời gian 05 năm kể từ ngày hóa chất mới được đăng ký, cơ quan nhà nước có thẩm quyền có trách nhiệm đánh giá mức độ rủi ro về an toàn, an ninh hóa chất để đề xuất Chính phủ xem xét, quyết định phương thức quản lý phù hợp và thông báo với tổ chức, cá nhân đăng ký hóa chất mới.</w:t>
+        <w:t xml:space="preserve">2. Trong thời hạn 05 năm kể từ ngày </w:t>
+      </w:r>
+      <w:r>
+        <w:t>hóa chất mới được đăng ký, hằng năm, tổ chức, cá nhân có hoạt động hóa chất liên quan đến hóa chất mới phải cập nhật thông tin, dữ liệu vào Cơ sở dữ liệu chuyên ngành hóa chất về quá trình hoạt động với hóa chất mới.</w:t>
+      </w:r>
+    </w:p>
+    <w:p>
+      <w:pPr>
+        <w:spacing w:before="120" w:after="280" w:afterAutospacing="1"/>
+      </w:pPr>
+      <w:r>
+        <w:t>3. Căn cứ kết quả đánh giá hóa chất mới</w:t>
+      </w:r>
+      <w:r>
+        <w:t xml:space="preserve"> và báo cáo quá trình hoạt động với hóa chất mới trong thời gian 05 năm kể từ ngày hóa chất mới được đăng ký, cơ quan nhà nước có thẩm quyền có trách nhiệm đánh giá mức độ rủi ro về an toàn, an ninh hóa chất để đề xuất Chính phủ xem xét, quyết định phương </w:t>
+      </w:r>
+      <w:r>
+        <w:t>thức quản lý phù hợp và thông báo với tổ chức, cá nhân đăng ký hóa chất mới.</w:t>
       </w:r>
     </w:p>
     <w:p>
@@ -3207,15 +3737,21 @@
         <w:spacing w:before="120" w:after="280" w:afterAutospacing="1"/>
       </w:pPr>
       <w:r>
-        <w:t>1. Tổ chức, cá nhân sản xuất, nhập khẩu hóa chất có nghĩa vụ phân loại, ghi nhãn hóa chất trước khi đưa hóa chất vào sử dụng, lưu thông trên thị trường; chịu trách nhiệm trước pháp luật về kết quả phân loại hóa chất và thông tin thể hiện trên nhãn hóa chất.</w:t>
-      </w:r>
-    </w:p>
-    <w:p>
-      <w:pPr>
-        <w:spacing w:before="120" w:after="280" w:afterAutospacing="1"/>
-      </w:pPr>
-      <w:r>
-        <w:t>2. Việc phân loại hóa chất thực hiện theo quy tắc, hướng dẫn kỹ thuật của Hệ thống hài hòa toàn cầu về phân loại và ghi nhãn hóa chất (GHS) và theo quy định chi tiết của Thủ trưởng cơ quan quản lý nhà nước ở trung ương về hóa chất.</w:t>
+        <w:t xml:space="preserve">1. Tổ chức, cá nhân sản xuất, nhập khẩu hóa chất có nghĩa vụ phân loại, ghi nhãn hóa chất trước </w:t>
+      </w:r>
+      <w:r>
+        <w:t>khi đưa hóa chất vào sử dụng, lưu thông trên thị trường; chịu trách nhiệm trước pháp luật về kết quả phân loại hóa chất và thông tin thể hiện trên nhãn hóa chất.</w:t>
+      </w:r>
+    </w:p>
+    <w:p>
+      <w:pPr>
+        <w:spacing w:before="120" w:after="280" w:afterAutospacing="1"/>
+      </w:pPr>
+      <w:r>
+        <w:t>2. Việc phân loại hóa chất thực hiện theo quy tắc, hướng dẫn kỹ thuật của Hệ thống hài hòa toà</w:t>
+      </w:r>
+      <w:r>
+        <w:t>n cầu về phân loại và ghi nhãn hóa chất (GHS) và theo quy định chi tiết của Thủ trưởng cơ quan quản lý nhà nước ở trung ương về hóa chất.</w:t>
       </w:r>
     </w:p>
     <w:p>
@@ -3231,15 +3767,21 @@
         <w:spacing w:before="120" w:after="280" w:afterAutospacing="1"/>
       </w:pPr>
       <w:r>
-        <w:t>4. Việc ghi nhãn hóa chất nguy hiểm thực hiện theo quy định tại khoản 3 Điều này và hướng dẫn của Hệ thống hài hòa toàn cầu về phân loại và ghi nhãn hóa chất.</w:t>
-      </w:r>
-    </w:p>
-    <w:p>
-      <w:pPr>
-        <w:spacing w:before="120" w:after="280" w:afterAutospacing="1"/>
-      </w:pPr>
-      <w:r>
-        <w:t>5. Khi phát hiện đặc tính nguy hiểm mới của hóa chất chưa được thể hiện trong thông tin phân loại hóa chất, tổ chức, cá nhân hoạt động hóa chất có nghĩa vụ kịp thời thông báo cho tổ chức, cá nhân sản xuất, nhập khẩu hóa chất đó để thực hiện lại việc phân loại, ghi nhãn hóa chất theo quy định của Thủ trưởng cơ quan quản lý nhà nước ở trung ương về hóa chất.</w:t>
+        <w:t xml:space="preserve">4. Việc ghi nhãn hóa chất nguy hiểm </w:t>
+      </w:r>
+      <w:r>
+        <w:t>thực hiện theo quy định tại khoản 3 Điều này và hướng dẫn của Hệ thống hài hòa toàn cầu về phân loại và ghi nhãn hóa chất.</w:t>
+      </w:r>
+    </w:p>
+    <w:p>
+      <w:pPr>
+        <w:spacing w:before="120" w:after="280" w:afterAutospacing="1"/>
+      </w:pPr>
+      <w:r>
+        <w:t>5. Khi phát hiện đặc tính nguy hiểm mới của hóa chất chưa được thể hiện trong thông tin phân loại hóa chất, tổ chức, cá nhân hoạt độn</w:t>
+      </w:r>
+      <w:r>
+        <w:t>g hóa chất có nghĩa vụ kịp thời thông báo cho tổ chức, cá nhân sản xuất, nhập khẩu hóa chất đó để thực hiện lại việc phân loại, ghi nhãn hóa chất theo quy định của Thủ trưởng cơ quan quản lý nhà nước ở trung ương về hóa chất.</w:t>
       </w:r>
     </w:p>
     <w:p>
@@ -3252,7 +3794,14 @@
           <w:b/>
           <w:bCs/>
         </w:rPr>
-        <w:t>Điều 24. Bao bì, thiết bị chứa và hoạt động đóng gói hóa chất</w:t>
+        <w:t>Điều 24. Bao bì, thiết bị chứa</w:t>
+      </w:r>
+      <w:r>
+        <w:rPr>
+          <w:b/>
+          <w:bCs/>
+        </w:rPr>
+        <w:t xml:space="preserve"> và hoạt động đóng gói hóa chất</w:t>
       </w:r>
       <w:bookmarkEnd w:id="120"/>
     </w:p>
@@ -3285,15 +3834,21 @@
         <w:spacing w:before="120" w:after="280" w:afterAutospacing="1"/>
       </w:pPr>
       <w:r>
-        <w:t>2. Bao bì, thiết bị chứa và hoạt động đóng gói hóa chất phải tuân thủ quy chuẩn kỹ thuật quốc gia và quy định khác của pháp luật có liên quan, bảo đảm không bị rò rỉ, thất thoát hóa chất trong vận chuyển, tồn trữ;</w:t>
-      </w:r>
-    </w:p>
-    <w:p>
-      <w:pPr>
-        <w:spacing w:before="120" w:after="280" w:afterAutospacing="1"/>
-      </w:pPr>
-      <w:r>
-        <w:t>3. Bao bì, thiết bị chứa hóa chất nhập khẩu thực hiện theo khuyến cáo và yêu cầu của nhà sản xuất;</w:t>
+        <w:t xml:space="preserve">2. Bao bì, thiết bị chứa và hoạt động đóng gói hóa </w:t>
+      </w:r>
+      <w:r>
+        <w:t>chất phải tuân thủ quy chuẩn kỹ thuật quốc gia và quy định khác của pháp luật có liên quan, bảo đảm không bị rò rỉ, thất thoát hóa chất trong vận chuyển, tồn trữ;</w:t>
+      </w:r>
+    </w:p>
+    <w:p>
+      <w:pPr>
+        <w:spacing w:before="120" w:after="280" w:afterAutospacing="1"/>
+      </w:pPr>
+      <w:r>
+        <w:t xml:space="preserve">3. Bao bì, thiết bị chứa hóa chất nhập khẩu thực hiện theo khuyến cáo và yêu cầu của nhà sản </w:t>
+      </w:r>
+      <w:r>
+        <w:t>xuất;</w:t>
       </w:r>
     </w:p>
     <w:p>
@@ -3323,7 +3878,10 @@
         <w:spacing w:before="120" w:after="280" w:afterAutospacing="1"/>
       </w:pPr>
       <w:r>
-        <w:t>1. Tổ chức sản xuất hóa chất nguy hiểm, tổ chức, cá nhân nhập khẩu hóa chất nguy hiểm phải lập phiếu an toàn hóa chất khi nhập khẩu hóa chất, trước khi đưa hóa chất vào sử dụng, lưu thông trên thị trường và chịu trách nhiệm trước pháp luật về thông tin thể hiện trong phiếu an toàn hóa chất.</w:t>
+        <w:t xml:space="preserve">1. Tổ chức sản xuất hóa chất nguy hiểm, tổ chức, cá nhân nhập khẩu hóa chất nguy hiểm phải lập phiếu an toàn hóa chất </w:t>
+      </w:r>
+      <w:r>
+        <w:t>khi nhập khẩu hóa chất, trước khi đưa hóa chất vào sử dụng, lưu thông trên thị trường và chịu trách nhiệm trước pháp luật về thông tin thể hiện trong phiếu an toàn hóa chất.</w:t>
       </w:r>
     </w:p>
     <w:p>
@@ -3332,23 +3890,32 @@
       </w:pPr>
       <w:r>
         <w:lastRenderedPageBreak/>
-        <w:t>2. Tổ chức bán hóa chất nguy hiểm có nghĩa vụ cung cấp phiếu an toàn hóa chất cho tổ chức, cá nhân mua hóa chất. Tổ chức, cá nhân mua hóa chất nguy hiểm có nghĩa vụ yêu cầu tổ chức bán hóa chất cung cấp phiếu an toàn hóa chất, lưu giữ phiếu an toàn hóa chất tại địa điểm tồn trữ hóa chất.</w:t>
-      </w:r>
-    </w:p>
-    <w:p>
-      <w:pPr>
-        <w:spacing w:before="120" w:after="280" w:afterAutospacing="1"/>
-      </w:pPr>
-      <w:r>
-        <w:t>3. Tổ chức sản xuất hóa chất nguy hiểm, tổ chức, cá nhân nhập khẩu hóa chất nguy hiểm có nghĩa vụ sửa đổi, bổ sung phiếu an toàn hóa chất khi có thay đổi về nội dung hoặc phát hiện đặc tính nguy hiểm mới của hóa chất trước khi tiếp tục lưu thông hóa chất trên thị trường, đưa hóa chất vào sử dụng.</w:t>
-      </w:r>
-    </w:p>
-    <w:p>
-      <w:pPr>
-        <w:spacing w:before="120" w:after="280" w:afterAutospacing="1"/>
-      </w:pPr>
-      <w:r>
-        <w:t>4. Thủ trưởng cơ quan quản lý nhà nước ở trung ương về hóa chất quy định chi tiết về nội dung, biểu mẫu phiếu an toàn hóa chất.</w:t>
+        <w:t xml:space="preserve">2. Tổ chức bán hóa chất nguy hiểm có nghĩa vụ cung cấp phiếu an toàn hóa chất cho </w:t>
+      </w:r>
+      <w:r>
+        <w:t>tổ chức, cá nhân mua hóa chất. Tổ chức, cá nhân mua hóa chất nguy hiểm có nghĩa vụ yêu cầu tổ chức bán hóa chất cung cấp phiếu an toàn hóa chất, lưu giữ phiếu an toàn hóa chất tại địa điểm tồn trữ hóa chất.</w:t>
+      </w:r>
+    </w:p>
+    <w:p>
+      <w:pPr>
+        <w:spacing w:before="120" w:after="280" w:afterAutospacing="1"/>
+      </w:pPr>
+      <w:r>
+        <w:t xml:space="preserve">3. Tổ chức sản xuất hóa chất nguy hiểm, tổ chức, </w:t>
+      </w:r>
+      <w:r>
+        <w:t>cá nhân nhập khẩu hóa chất nguy hiểm có nghĩa vụ sửa đổi, bổ sung phiếu an toàn hóa chất khi có thay đổi về nội dung hoặc phát hiện đặc tính nguy hiểm mới của hóa chất trước khi tiếp tục lưu thông hóa chất trên thị trường, đưa hóa chất vào sử dụng.</w:t>
+      </w:r>
+    </w:p>
+    <w:p>
+      <w:pPr>
+        <w:spacing w:before="120" w:after="280" w:afterAutospacing="1"/>
+      </w:pPr>
+      <w:r>
+        <w:t xml:space="preserve">4. Thủ </w:t>
+      </w:r>
+      <w:r>
+        <w:t>trưởng cơ quan quản lý nhà nước ở trung ương về hóa chất quy định chi tiết về nội dung, biểu mẫu phiếu an toàn hóa chất.</w:t>
       </w:r>
     </w:p>
     <w:p>
@@ -3370,7 +3937,13 @@
         <w:spacing w:before="120" w:after="280" w:afterAutospacing="1"/>
       </w:pPr>
       <w:r>
-        <w:t>1. Tổ chức, cá nhân khai báo, đăng ký, báo cáo, cập nhật thông tin, cập nhật dữ liệu theo quy định của Luật này có quyền yêu cầu cơ quan, tổ chức tiếp nhận có trách nhiệm bảo mật thông tin có liên quan đến bí quyết công nghệ, bí mật thương mại và thông tin bảo mật khác theo quy định của pháp luật, trừ trường hợp quy định tại khoản 2 Điều này. Tổ chức, cá nhân yêu cầu bảo mật có nghĩa vụ cung cấp thông tin, tài liệu liên quan gửi cơ quan nhà nước có thẩm quyền để đánh giá sự phù hợp của yêu cầu bảo mật thông tin.</w:t>
+        <w:t xml:space="preserve">1. Tổ chức, cá nhân khai báo, đăng ký, báo cáo, cập nhật thông tin, cập nhật dữ liệu theo quy định của Luật </w:t>
+      </w:r>
+      <w:r>
+        <w:t>này có quyền yêu cầu cơ quan, tổ chức tiếp nhận có trách nhiệm bảo mật thông tin có liên quan đến bí quyết công nghệ, bí mật thương mại và thông tin bảo mật khác theo quy định của pháp luật, trừ trường hợp quy định tại khoản 2 Điều này. Tổ chức, cá nhân yê</w:t>
+      </w:r>
+      <w:r>
+        <w:t>u cầu bảo mật có nghĩa vụ cung cấp thông tin, tài liệu liên quan gửi cơ quan nhà nước có thẩm quyền để đánh giá sự phù hợp của yêu cầu bảo mật thông tin.</w:t>
       </w:r>
     </w:p>
     <w:p>
@@ -3394,7 +3967,10 @@
         <w:spacing w:before="120" w:after="280" w:afterAutospacing="1"/>
       </w:pPr>
       <w:r>
-        <w:t xml:space="preserve">b) Tên của tổ chức, cá nhân sản xuất, nhập khẩu hóa chất; tổ chức, cá nhân quy định tại </w:t>
+        <w:t xml:space="preserve">b) Tên của tổ chức, cá </w:t>
+      </w:r>
+      <w:r>
+        <w:t xml:space="preserve">nhân sản xuất, nhập khẩu hóa chất; tổ chức, cá nhân quy định tại </w:t>
       </w:r>
       <w:bookmarkStart w:id="124" w:name="tc_34"/>
       <w:r>
@@ -3426,15 +4002,21 @@
         <w:spacing w:before="120" w:after="280" w:afterAutospacing="1"/>
       </w:pPr>
       <w:r>
-        <w:t>d) Thông tin phục vụ phòng ngừa và ứng phó sự cố hóa chất; ngăn chặn và hạn chế ảnh hưởng xấu do độc tính của hóa chất; thông tin cảnh báo khi sử dụng, tiếp xúc với hóa chất và cách xử lý sơ bộ trong trường hợp xảy ra sự cố hóa chất;</w:t>
-      </w:r>
-    </w:p>
-    <w:p>
-      <w:pPr>
-        <w:spacing w:before="120" w:after="280" w:afterAutospacing="1"/>
-      </w:pPr>
-      <w:r>
-        <w:t>đ) Phương pháp phân tích để xác định khả năng phơi nhiễm đối với con người và môi trường; tóm tắt kết quả thử nghiệm độc tính của hóa chất;</w:t>
+        <w:t>d) Thông tin phục vụ phòng ngừa và ứng phó sự cố hóa chất; ngăn chặn và hạn chế ảnh hưởng xấu do độc</w:t>
+      </w:r>
+      <w:r>
+        <w:t xml:space="preserve"> tính của hóa chất; thông tin cảnh báo khi sử dụng, tiếp xúc với hóa chất và cách xử lý sơ bộ trong trường hợp xảy ra sự cố hóa chất;</w:t>
+      </w:r>
+    </w:p>
+    <w:p>
+      <w:pPr>
+        <w:spacing w:before="120" w:after="280" w:afterAutospacing="1"/>
+      </w:pPr>
+      <w:r>
+        <w:t>đ) Phương pháp phân tích để xác định khả năng phơi nhiễm đối với con người và môi trường; tóm tắt kết quả thử nghiệm độc t</w:t>
+      </w:r>
+      <w:r>
+        <w:t>ính của hóa chất;</w:t>
       </w:r>
     </w:p>
     <w:p>
@@ -3450,7 +4032,10 @@
         <w:spacing w:before="120" w:after="280" w:afterAutospacing="1"/>
       </w:pPr>
       <w:r>
-        <w:t>3. Cơ quan, người tiếp nhận thông tin của tổ chức, cá nhân quy định tại khoản 1 Điều này có trách nhiệm cung cấp thông tin bảo mật khi có yêu cầu của cơ quan nhà nước có thẩm quyền theo quy định của pháp luật.</w:t>
+        <w:t xml:space="preserve">3. Cơ quan, người tiếp nhận thông tin của tổ chức, cá nhân quy định tại khoản 1 Điều này có trách nhiệm cung cấp thông tin bảo mật khi có yêu cầu của cơ quan nhà </w:t>
+      </w:r>
+      <w:r>
+        <w:t>nước có thẩm quyền theo quy định của pháp luật.</w:t>
       </w:r>
     </w:p>
     <w:p>
@@ -3481,23 +4066,32 @@
         <w:spacing w:before="120" w:after="280" w:afterAutospacing="1"/>
       </w:pPr>
       <w:r>
-        <w:t>1. Tổ chức, cá nhân hoạt động hóa chất phải thiết lập, thường xuyên cập nhật, lưu trữ thông tin về hóa chất nguy hiểm trong hoạt động hóa chất của mình và lưu giữ hồ sơ trong thời hạn ít nhất 03 năm kể từ ngày kết thúc hoạt động đối với hóa chất đó.</w:t>
-      </w:r>
-    </w:p>
-    <w:p>
-      <w:pPr>
-        <w:spacing w:before="120" w:after="280" w:afterAutospacing="1"/>
-      </w:pPr>
-      <w:r>
-        <w:t>2. Nội dung thông tin cần lưu trữ gồm tên khoa học, tên thương mại của hóa chất; khối lượng sản xuất, nhập khẩu, sử dụng, thải bỏ; mục đích sử dụng; phân loại nguy hiểm theo Hệ thống hài hòa toàn cầu về phân loại và ghi nhãn hóa chất; thông tin liên quan đến sự cố hóa chất, an toàn hóa chất tại cơ sở hoạt động hóa chất.</w:t>
-      </w:r>
-    </w:p>
-    <w:p>
-      <w:pPr>
-        <w:spacing w:before="120" w:after="280" w:afterAutospacing="1"/>
-      </w:pPr>
-      <w:r>
-        <w:t>3. Trường hợp cơ sở hoạt động hóa chất có nhiều chi nhánh thì dữ liệu thông tin hóa chất nguy hiểm phải gồm tất cả các thông tin có liên quan quy định tại khoản 2 Điều này đối với cơ sở hoạt động hóa chất, các chi nhánh.</w:t>
+        <w:t xml:space="preserve">1. Tổ chức, cá nhân hoạt động hóa chất phải thiết lập, thường xuyên cập nhật, lưu trữ thông tin về hóa chất nguy hiểm </w:t>
+      </w:r>
+      <w:r>
+        <w:t>trong hoạt động hóa chất của mình và lưu giữ hồ sơ trong thời hạn ít nhất 03 năm kể từ ngày kết thúc hoạt động đối với hóa chất đó.</w:t>
+      </w:r>
+    </w:p>
+    <w:p>
+      <w:pPr>
+        <w:spacing w:before="120" w:after="280" w:afterAutospacing="1"/>
+      </w:pPr>
+      <w:r>
+        <w:t>2. Nội dung thông tin cần lưu trữ gồm tên khoa học, tên thương mại của hóa chất; khối lượng sản xuất, nhập khẩu, sử dụng, th</w:t>
+      </w:r>
+      <w:r>
+        <w:t>ải bỏ; mục đích sử dụng; phân loại nguy hiểm theo Hệ thống hài hòa toàn cầu về phân loại và ghi nhãn hóa chất; thông tin liên quan đến sự cố hóa chất, an toàn hóa chất tại cơ sở hoạt động hóa chất.</w:t>
+      </w:r>
+    </w:p>
+    <w:p>
+      <w:pPr>
+        <w:spacing w:before="120" w:after="280" w:afterAutospacing="1"/>
+      </w:pPr>
+      <w:r>
+        <w:t xml:space="preserve">3. Trường hợp cơ sở hoạt động hóa chất có nhiều chi nhánh </w:t>
+      </w:r>
+      <w:r>
+        <w:t>thì dữ liệu thông tin hóa chất nguy hiểm phải gồm tất cả các thông tin có liên quan quy định tại khoản 2 Điều này đối với cơ sở hoạt động hóa chất, các chi nhánh.</w:t>
       </w:r>
     </w:p>
     <w:p>
@@ -3519,7 +4113,10 @@
         <w:spacing w:before="120" w:after="280" w:afterAutospacing="1"/>
       </w:pPr>
       <w:r>
-        <w:t>1. Tổ chức, cá nhân hoạt động hóa chất có nghĩa vụ cung cấp đầy đủ, kịp thời, chính xác thông tin theo yêu cầu của cơ quan có thẩm quyền trong các trường hợp sau đây:</w:t>
+        <w:t xml:space="preserve">1. Tổ chức, cá nhân hoạt động hóa chất có nghĩa vụ cung </w:t>
+      </w:r>
+      <w:r>
+        <w:t>cấp đầy đủ, kịp thời, chính xác thông tin theo yêu cầu của cơ quan có thẩm quyền trong các trường hợp sau đây:</w:t>
       </w:r>
     </w:p>
     <w:p>
@@ -3535,7 +4132,10 @@
         <w:spacing w:before="120" w:after="280" w:afterAutospacing="1"/>
       </w:pPr>
       <w:r>
-        <w:t>b) Phục vụ yêu cầu phòng ngừa thảm họa tự nhiên có khả năng gây ra sự cố hóa chất trong hoạt động hóa chất;</w:t>
+        <w:t>b) Phục vụ yêu cầu phòng ngừa thảm họa tự nhiên có khả năng gây ra sự cố hóa chất trong hoạt đ</w:t>
+      </w:r>
+      <w:r>
+        <w:t>ộng hóa chất;</w:t>
       </w:r>
     </w:p>
     <w:p>
@@ -3551,7 +4151,10 @@
         <w:spacing w:before="120" w:after="280" w:afterAutospacing="1"/>
       </w:pPr>
       <w:r>
-        <w:t>d) Phục vụ công tác thanh tra, kiểm tra, giám sát, xử lý vi phạm pháp luật trong hoạt động hóa chất.</w:t>
+        <w:t>d) Phục vụ công tác thanh tra, kiểm tra, giám sát, xử lý vi phạm pháp luật trong hoạt động hóa chất</w:t>
+      </w:r>
+      <w:r>
+        <w:t>.</w:t>
       </w:r>
     </w:p>
     <w:p>
@@ -3567,7 +4170,10 @@
         <w:spacing w:before="120" w:after="280" w:afterAutospacing="1"/>
       </w:pPr>
       <w:r>
-        <w:t>3. Bộ, cơ quan ngang Bộ có trách nhiệm cung cấp thông tin về hóa chất nguy hiểm thuộc lĩnh vực quản lý của mình theo yêu cầu để phục vụ cứu chữa, điều trị cho người chịu ảnh hưởng của sự cố hóa chất.</w:t>
+        <w:t>3. Bộ, cơ quan ngang Bộ có trách n</w:t>
+      </w:r>
+      <w:r>
+        <w:t>hiệm cung cấp thông tin về hóa chất nguy hiểm thuộc lĩnh vực quản lý của mình theo yêu cầu để phục vụ cứu chữa, điều trị cho người chịu ảnh hưởng của sự cố hóa chất.</w:t>
       </w:r>
     </w:p>
     <w:p>
@@ -3588,7 +4194,14 @@
           <w:b/>
           <w:bCs/>
         </w:rPr>
-        <w:t>Điều 29. Chuyển đổi số trong quản lý nhà nước về hóa chất</w:t>
+        <w:t xml:space="preserve">Điều 29. Chuyển đổi số trong quản lý nhà nước về </w:t>
+      </w:r>
+      <w:r>
+        <w:rPr>
+          <w:b/>
+          <w:bCs/>
+        </w:rPr>
+        <w:t>hóa chất</w:t>
       </w:r>
       <w:bookmarkEnd w:id="128"/>
     </w:p>
@@ -3606,7 +4219,10 @@
       </w:pPr>
       <w:r>
         <w:lastRenderedPageBreak/>
-        <w:t xml:space="preserve">2. Cơ quan quản lý nhà nước ở trung ương về hóa chất công bố công khai, vận hành, nâng cấp, cập nhật thường xuyên, bảo đảm </w:t>
+        <w:t>2.</w:t>
+      </w:r>
+      <w:r>
+        <w:t xml:space="preserve"> Cơ quan quản lý nhà nước ở trung ương về hóa chất công bố công khai, vận hành, nâng cấp, cập nhật thường xuyên, bảo đảm </w:t>
       </w:r>
       <w:bookmarkStart w:id="129" w:name="cumtu_2_29"/>
       <w:r>
@@ -3614,31 +4230,46 @@
       </w:r>
       <w:bookmarkEnd w:id="129"/>
       <w:r>
-        <w:t xml:space="preserve"> an ninh mạng cho Cơ sở dữ liệu chuyên ngành hóa chất; xây dựng cơ chế chia sẻ, sử dụng thông tin Cơ sở dữ liệu chuyên ngành hóa chất.</w:t>
-      </w:r>
-    </w:p>
-    <w:p>
-      <w:pPr>
-        <w:spacing w:before="120" w:after="280" w:afterAutospacing="1"/>
-      </w:pPr>
-      <w:r>
-        <w:t>3. Cơ sở dữ liệu chuyên ngành hóa chất được sử dụng để phục vụ lưu trữ, quản lý, cập nhật, tích hợp thống nhất dữ liệu về hóa chất; về hoạt động hóa chất; ngành công nghiệp hóa chất; hóa chất nguy hiểm trong sản phẩm, hàng hóa; an toàn, an ninh trong hoạt động hóa chất; Danh mục hóa chất quốc gia; danh mục hóa chất nước ngoài được cơ quan nhà nước có thẩm quyền của nước Cộng hòa xã hội chủ nghĩa Việt Nam thừa nhận và dữ liệu khác theo quy định của Thủ trưởng cơ quan quản lý nhà nước ở trung ương về hóa chất.</w:t>
-      </w:r>
-    </w:p>
-    <w:p>
-      <w:pPr>
-        <w:spacing w:before="120" w:after="280" w:afterAutospacing="1"/>
-      </w:pPr>
-      <w:r>
-        <w:t>4. Cơ sở dữ liệu chuyên ngành hóa chất được thiết kế bảo đảm khả năng tích hợp, liên thông và chia sẻ dữ liệu với hệ thống thông tin quốc gia, hệ thống thông tin chuyên ngành có liên quan theo quy định của pháp luật. Thông tin trên Cơ sở dữ liệu chuyên ngành hóa chất được phân cấp, phân quyền cho cơ quan nhà nước có thẩm quyền khai thác, sử dụng cho công tác quản lý nhà nước, điều tra và xử lý vi phạm.</w:t>
-      </w:r>
-    </w:p>
-    <w:p>
-      <w:pPr>
-        <w:spacing w:before="120" w:after="280" w:afterAutospacing="1"/>
-      </w:pPr>
-      <w:r>
-        <w:t>5. Cơ quan, tổ chức, cá nhân có trách nhiệm thực hiện chế độ cập nhật thông tin, dữ liệu vào Cơ sở dữ liệu chuyên ngành hóa chất bảo đảm đầy đủ, chính xác, đúng thời hạn.</w:t>
+        <w:t xml:space="preserve"> an ninh mạng cho Cơ sở dữ liệu chuyên ngành hóa chất; xây dựng cơ chế chia sẻ, sử dụng thông tin Cơ sở dữ liệu chu</w:t>
+      </w:r>
+      <w:r>
+        <w:t>yên ngành hóa chất.</w:t>
+      </w:r>
+    </w:p>
+    <w:p>
+      <w:pPr>
+        <w:spacing w:before="120" w:after="280" w:afterAutospacing="1"/>
+      </w:pPr>
+      <w:r>
+        <w:t>3. Cơ sở dữ liệu chuyên ngành hóa chất được sử dụng để phục vụ lưu trữ, quản lý, cập nhật, tích hợp thống nhất dữ liệu về hóa chất; về hoạt động hóa chất; ngành công nghiệp hóa chất; hóa chất nguy hiểm trong sản phẩm, hàng hóa; an toàn,</w:t>
+      </w:r>
+      <w:r>
+        <w:t xml:space="preserve"> an ninh trong hoạt động hóa chất; Danh mục hóa chất quốc gia; danh mục hóa chất nước ngoài được cơ quan nhà nước có thẩm quyền của nước Cộng hòa xã hội chủ nghĩa Việt Nam thừa nhận và dữ liệu khác theo quy định của Thủ trưởng cơ quan quản lý nhà nước ở tr</w:t>
+      </w:r>
+      <w:r>
+        <w:t>ung ương về hóa chất.</w:t>
+      </w:r>
+    </w:p>
+    <w:p>
+      <w:pPr>
+        <w:spacing w:before="120" w:after="280" w:afterAutospacing="1"/>
+      </w:pPr>
+      <w:r>
+        <w:t>4. Cơ sở dữ liệu chuyên ngành hóa chất được thiết kế bảo đảm khả năng tích hợp, liên thông và chia sẻ dữ liệu với hệ thống thông tin quốc gia, hệ thống thông tin chuyên ngành có liên quan theo quy định của pháp luật. Thông tin trên Cơ</w:t>
+      </w:r>
+      <w:r>
+        <w:t xml:space="preserve"> sở dữ liệu chuyên ngành hóa chất được phân cấp, phân quyền cho cơ quan nhà nước có thẩm quyền khai thác, sử dụng cho công tác quản lý nhà nước, điều tra và xử lý vi phạm.</w:t>
+      </w:r>
+    </w:p>
+    <w:p>
+      <w:pPr>
+        <w:spacing w:before="120" w:after="280" w:afterAutospacing="1"/>
+      </w:pPr>
+      <w:r>
+        <w:t xml:space="preserve">5. Cơ quan, tổ chức, cá nhân có trách nhiệm thực hiện chế độ cập nhật thông tin, dữ </w:t>
+      </w:r>
+      <w:r>
+        <w:t>liệu vào Cơ sở dữ liệu chuyên ngành hóa chất bảo đảm đầy đủ, chính xác, đúng thời hạn.</w:t>
       </w:r>
     </w:p>
     <w:p>
@@ -3654,7 +4285,10 @@
         <w:spacing w:before="120" w:after="280" w:afterAutospacing="1"/>
       </w:pPr>
       <w:r>
-        <w:t xml:space="preserve">7. Việc truy cập, khai thác và sử dụng dữ liệu trên Cơ sở dữ liệu chuyên ngành hóa chất phải bảo đảm đúng thẩm quyền, đúng mục đích, tuân thủ quy định về bảo vệ bí mật nhà nước, bảo vệ dữ liệu cá nhân, bảo đảm </w:t>
+        <w:t>7. Việc truy cập, khai thác và</w:t>
+      </w:r>
+      <w:r>
+        <w:t xml:space="preserve"> sử dụng dữ liệu trên Cơ sở dữ liệu chuyên ngành hóa chất phải bảo đảm đúng thẩm quyền, đúng mục đích, tuân thủ quy định về bảo vệ bí mật nhà nước, bảo vệ dữ liệu cá nhân, bảo đảm </w:t>
       </w:r>
       <w:bookmarkStart w:id="130" w:name="cumtu_7_29"/>
       <w:r>
@@ -3670,7 +4304,10 @@
         <w:spacing w:before="120" w:after="280" w:afterAutospacing="1"/>
       </w:pPr>
       <w:r>
-        <w:t xml:space="preserve">8. Nhà nước bảo đảm nguồn lực để đầu tư, xây dựng, vận hành, duy trì và phát triển Cơ sở dữ liệu chuyên ngành hóa chất; bảo đảm </w:t>
+        <w:t xml:space="preserve">8. Nhà nước bảo đảm nguồn lực để đầu tư, </w:t>
+      </w:r>
+      <w:r>
+        <w:t xml:space="preserve">xây dựng, vận hành, duy trì và phát triển Cơ sở dữ liệu chuyên ngành hóa chất; bảo đảm </w:t>
       </w:r>
       <w:bookmarkStart w:id="131" w:name="cumtu_8_29"/>
       <w:r>
@@ -3678,7 +4315,10 @@
       </w:r>
       <w:bookmarkEnd w:id="131"/>
       <w:r>
-        <w:t xml:space="preserve"> an ninh mạng và khả năng kết nối, chia sẻ dữ liệu với hệ thống thông tin quốc gia, hệ thống thông tin chuyên ngành có liên quan theo quy định của pháp luật.</w:t>
+        <w:t xml:space="preserve"> an ninh mạng và khả năng kết nối, chia sẻ dữ liệu với hệ thống thông tin quốc gia, hệ thống thông tin chuyên ngành có liên quan theo quy định của pháp</w:t>
+      </w:r>
+      <w:r>
+        <w:t xml:space="preserve"> luật.</w:t>
       </w:r>
     </w:p>
     <w:p>
@@ -3716,7 +4356,10 @@
         <w:spacing w:before="120" w:after="280" w:afterAutospacing="1"/>
       </w:pPr>
       <w:r>
-        <w:t>2. Hoạt động quảng cáo hóa chất nguy hiểm được thực hiện theo quy định tại khoản 1 Điều này. Nội dung quảng cáo hóa chất nguy hiểm phải bao gồm thông tin cảnh báo về đặc tính nguy hiểm của hóa chất, chỉ dẫn phòng ngừa tác hại của hóa chất.</w:t>
+        <w:t>2. Hoạt động quảng cáo hóa chất nguy hiểm được</w:t>
+      </w:r>
+      <w:r>
+        <w:t xml:space="preserve"> thực hiện theo quy định tại khoản 1 Điều này. Nội dung quảng cáo hóa chất nguy hiểm phải bao gồm thông tin cảnh báo về đặc tính nguy hiểm của hóa chất, chỉ dẫn phòng ngừa tác hại của hóa chất.</w:t>
       </w:r>
     </w:p>
     <w:p>
@@ -3759,7 +4402,14 @@
           <w:b/>
           <w:bCs/>
         </w:rPr>
-        <w:t>Điều 31. Quy định chung về hóa chất nguy hiểm trong sản phẩm, hàng hóa</w:t>
+        <w:t xml:space="preserve">Điều </w:t>
+      </w:r>
+      <w:r>
+        <w:rPr>
+          <w:b/>
+          <w:bCs/>
+        </w:rPr>
+        <w:t>31. Quy định chung về hóa chất nguy hiểm trong sản phẩm, hàng hóa</w:t>
       </w:r>
       <w:bookmarkEnd w:id="135"/>
     </w:p>
@@ -3784,6 +4434,52 @@
       </w:r>
       <w:bookmarkEnd w:id="137"/>
       <w:r>
+        <w:t xml:space="preserve"> và luật k</w:t>
+      </w:r>
+      <w:r>
+        <w:t>hác có liên quan.</w:t>
+      </w:r>
+    </w:p>
+    <w:p>
+      <w:pPr>
+        <w:spacing w:before="120" w:after="280" w:afterAutospacing="1"/>
+      </w:pPr>
+      <w:bookmarkStart w:id="138" w:name="khoan_2_31"/>
+      <w:r>
+        <w:t xml:space="preserve">2. Đối với hóa chất nguy hiểm trong sản phẩm, hàng hóa chưa có quy chuẩn kỹ thuật, Bộ trưởng, Thủ trưởng cơ quan ngang Bộ ban hành Danh mục hóa chất nguy hiểm trong sản phẩm, hàng hóa cần công bố thông tin thuộc lĩnh vực quản lý nhà nước </w:t>
+      </w:r>
+      <w:r>
+        <w:t>của mình.</w:t>
+      </w:r>
+      <w:bookmarkEnd w:id="138"/>
+    </w:p>
+    <w:p>
+      <w:pPr>
+        <w:spacing w:before="120" w:after="280" w:afterAutospacing="1"/>
+      </w:pPr>
+      <w:r>
+        <w:t xml:space="preserve">3. Tổ chức, cá nhân sản xuất sản phẩm, hàng hóa chứa hóa chất nguy hiểm thuộc Danh mục hóa chất nguy hiểm trong sản phẩm, hàng hóa quy định tại khoản 2 Điều này có nghĩa vụ xây dựng Quy trình kiểm soát hóa chất nguy hiểm trong quá trình sản xuất </w:t>
+      </w:r>
+      <w:r>
+        <w:t>theo quy định của Chính phủ.</w:t>
+      </w:r>
+    </w:p>
+    <w:p>
+      <w:pPr>
+        <w:spacing w:before="120" w:after="280" w:afterAutospacing="1"/>
+      </w:pPr>
+      <w:r>
+        <w:t xml:space="preserve">4. Tổ chức, cá nhân sản xuất, nhập khẩu sản phẩm, hàng hóa quy định tại khoản 1 và khoản 2 Điều này có nghĩa vụ thực hiện công bố thông tin về hàm lượng hóa chất nguy hiểm trong sản phẩm, hàng hóa theo quy định tại </w:t>
+      </w:r>
+      <w:bookmarkStart w:id="139" w:name="tc_36"/>
+      <w:r>
+        <w:t xml:space="preserve">Điều 32 của </w:t>
+      </w:r>
+      <w:r>
+        <w:t>Luật này</w:t>
+      </w:r>
+      <w:bookmarkEnd w:id="139"/>
+      <w:r>
         <w:t xml:space="preserve"> và luật khác có liên quan.</w:t>
       </w:r>
     </w:p>
@@ -3791,40 +4487,6 @@
       <w:pPr>
         <w:spacing w:before="120" w:after="280" w:afterAutospacing="1"/>
       </w:pPr>
-      <w:bookmarkStart w:id="138" w:name="khoan_2_31"/>
-      <w:r>
-        <w:t>2. Đối với hóa chất nguy hiểm trong sản phẩm, hàng hóa chưa có quy chuẩn kỹ thuật, Bộ trưởng, Thủ trưởng cơ quan ngang Bộ ban hành Danh mục hóa chất nguy hiểm trong sản phẩm, hàng hóa cần công bố thông tin thuộc lĩnh vực quản lý nhà nước của mình.</w:t>
-      </w:r>
-      <w:bookmarkEnd w:id="138"/>
-    </w:p>
-    <w:p>
-      <w:pPr>
-        <w:spacing w:before="120" w:after="280" w:afterAutospacing="1"/>
-      </w:pPr>
-      <w:r>
-        <w:t>3. Tổ chức, cá nhân sản xuất sản phẩm, hàng hóa chứa hóa chất nguy hiểm thuộc Danh mục hóa chất nguy hiểm trong sản phẩm, hàng hóa quy định tại khoản 2 Điều này có nghĩa vụ xây dựng Quy trình kiểm soát hóa chất nguy hiểm trong quá trình sản xuất theo quy định của Chính phủ.</w:t>
-      </w:r>
-    </w:p>
-    <w:p>
-      <w:pPr>
-        <w:spacing w:before="120" w:after="280" w:afterAutospacing="1"/>
-      </w:pPr>
-      <w:r>
-        <w:t xml:space="preserve">4. Tổ chức, cá nhân sản xuất, nhập khẩu sản phẩm, hàng hóa quy định tại khoản 1 và khoản 2 Điều này có nghĩa vụ thực hiện công bố thông tin về hàm lượng hóa chất nguy hiểm trong sản phẩm, hàng hóa theo quy định tại </w:t>
-      </w:r>
-      <w:bookmarkStart w:id="139" w:name="tc_36"/>
-      <w:r>
-        <w:t>Điều 32 của Luật này</w:t>
-      </w:r>
-      <w:bookmarkEnd w:id="139"/>
-      <w:r>
-        <w:t xml:space="preserve"> và luật khác có liên quan.</w:t>
-      </w:r>
-    </w:p>
-    <w:p>
-      <w:pPr>
-        <w:spacing w:before="120" w:after="280" w:afterAutospacing="1"/>
-      </w:pPr>
       <w:r>
         <w:t>5. Phòng thử nghiệm xác định hàm lượng hóa chất nguy hiểm trong sản phẩm, hàng hóa phải đăng ký hoạt động thử nghiệm theo quy định của pháp luật về chất lượng sản phẩm, hàng hóa.</w:t>
       </w:r>
@@ -3834,15 +4496,21 @@
         <w:spacing w:before="120" w:after="280" w:afterAutospacing="1"/>
       </w:pPr>
       <w:r>
-        <w:t>6. Bộ, cơ quan ngang Bộ, Ủy ban nhân dân cấp tỉnh và cơ quan có thẩm quyền có trách nhiệm thanh tra, kiểm tra việc thực hiện quy định về quản lý hóa chất nguy hiểm trong sản phẩm, hàng hóa của tổ chức, cá nhân trong phạm vi nhiệm vụ, quyền hạn của mình.</w:t>
-      </w:r>
-    </w:p>
-    <w:p>
-      <w:pPr>
-        <w:spacing w:before="120" w:after="280" w:afterAutospacing="1"/>
-      </w:pPr>
-      <w:r>
-        <w:t>7. Chính phủ quy định chi tiết Điều này.</w:t>
+        <w:t xml:space="preserve">6. Bộ, cơ quan ngang Bộ, Ủy ban nhân </w:t>
+      </w:r>
+      <w:r>
+        <w:t>dân cấp tỉnh và cơ quan có thẩm quyền có trách nhiệm thanh tra, kiểm tra việc thực hiện quy định về quản lý hóa chất nguy hiểm trong sản phẩm, hàng hóa của tổ chức, cá nhân trong phạm vi nhiệm vụ, quyền hạn của mình.</w:t>
+      </w:r>
+    </w:p>
+    <w:p>
+      <w:pPr>
+        <w:spacing w:before="120" w:after="280" w:afterAutospacing="1"/>
+      </w:pPr>
+      <w:r>
+        <w:t>7. Chính phủ quy định chi tiết Điều này</w:t>
+      </w:r>
+      <w:r>
+        <w:t>.</w:t>
       </w:r>
     </w:p>
     <w:p>
@@ -3872,7 +4540,13 @@
       </w:r>
       <w:bookmarkEnd w:id="141"/>
       <w:r>
-        <w:t xml:space="preserve"> có nghĩa vụ công bố thông tin về hàm lượng hóa chất nguy hiểm trong sản phẩm, hàng hóa trước khi lưu thông trên thị trường trên Cơ sở dữ liệu chuyên ngành hóa chất; công khai thông tin trên cổng thông tin điện tử, trang thông tin điện tử của tổ chức, cá nhân hoặc tại nơi trực tiếp cung cấp sản phẩm, hàng hóa cho bên mua.</w:t>
+        <w:t xml:space="preserve"> có nghĩa vụ công bố thông tin về h</w:t>
+      </w:r>
+      <w:r>
+        <w:t>àm lượng hóa chất nguy hiểm trong sản phẩm, hàng hóa trước khi lưu thông trên thị trường trên Cơ sở dữ liệu chuyên ngành hóa chất; công khai thông tin trên cổng thông tin điện tử, trang thông tin điện tử của tổ chức, cá nhân hoặc tại nơi trực tiếp cung cấp</w:t>
+      </w:r>
+      <w:r>
+        <w:t xml:space="preserve"> sản phẩm, hàng hóa cho bên mua.</w:t>
       </w:r>
     </w:p>
     <w:p>
@@ -3889,7 +4563,10 @@
       </w:pPr>
       <w:bookmarkStart w:id="142" w:name="khoan_3_32"/>
       <w:r>
-        <w:t>3. Chính phủ quy định chi tiết về cách thức và thông tin công bố hàm lượng hóa chất nguy hiểm trong sản phẩm, hàng hóa.</w:t>
+        <w:t xml:space="preserve">3. Chính phủ quy định chi tiết về </w:t>
+      </w:r>
+      <w:r>
+        <w:t>cách thức và thông tin công bố hàm lượng hóa chất nguy hiểm trong sản phẩm, hàng hóa.</w:t>
       </w:r>
       <w:bookmarkEnd w:id="142"/>
     </w:p>
@@ -3963,7 +4640,10 @@
         <w:spacing w:before="120" w:after="280" w:afterAutospacing="1"/>
       </w:pPr>
       <w:r>
-        <w:t>1. Tổ chức, cá nhân hoạt động hóa chất phải bảo đảm yêu cầu về cơ sở vật chất - kỹ thuật về an toàn, an ninh hóa chất.</w:t>
+        <w:t>1. Tổ chứ</w:t>
+      </w:r>
+      <w:r>
+        <w:t>c, cá nhân hoạt động hóa chất phải bảo đảm yêu cầu về cơ sở vật chất - kỹ thuật về an toàn, an ninh hóa chất.</w:t>
       </w:r>
     </w:p>
     <w:p>
@@ -3979,15 +4659,21 @@
         <w:spacing w:before="120" w:after="280" w:afterAutospacing="1"/>
       </w:pPr>
       <w:r>
-        <w:t>3. Người lao động có liên quan đến hoạt động hóa chất phải được huấn luyện an toàn về chuyên ngành hóa chất và trang bị bảo hộ cá nhân phù hợp với nhiệm vụ được phân công.</w:t>
-      </w:r>
-    </w:p>
-    <w:p>
-      <w:pPr>
-        <w:spacing w:before="120" w:after="280" w:afterAutospacing="1"/>
-      </w:pPr>
-      <w:r>
-        <w:t>4. Quy định tại khoản 2 và khoản 3 Điều này không áp dụng đối với hoạt động sử dụng hóa chất cho nhu cầu tiêu dùng, sinh hoạt thiết yếu.</w:t>
+        <w:t>3. Người lao động có liê</w:t>
+      </w:r>
+      <w:r>
+        <w:t>n quan đến hoạt động hóa chất phải được huấn luyện an toàn về chuyên ngành hóa chất và trang bị bảo hộ cá nhân phù hợp với nhiệm vụ được phân công.</w:t>
+      </w:r>
+    </w:p>
+    <w:p>
+      <w:pPr>
+        <w:spacing w:before="120" w:after="280" w:afterAutospacing="1"/>
+      </w:pPr>
+      <w:r>
+        <w:t>4. Quy định tại khoản 2 và khoản 3 Điều này không áp dụng đối với hoạt động sử dụng hóa chất cho nhu cầu tiê</w:t>
+      </w:r>
+      <w:r>
+        <w:t>u dùng, sinh hoạt thiết yếu.</w:t>
       </w:r>
     </w:p>
     <w:p>
@@ -4019,7 +4705,10 @@
         <w:spacing w:before="120" w:after="280" w:afterAutospacing="1"/>
       </w:pPr>
       <w:r>
-        <w:t>1. Duy trì điều kiện về an toàn, an ninh hóa chất theo quy định của Luật này và quy định khác của pháp luật có liên quan trong quá trình hoạt động hóa chất.</w:t>
+        <w:t>1. Duy trì điều kiện về an toàn, an ninh hóa chất theo quy định của Luật này và quy định khác của pháp luật có</w:t>
+      </w:r>
+      <w:r>
+        <w:t xml:space="preserve"> liên quan trong quá trình hoạt động hóa chất.</w:t>
       </w:r>
     </w:p>
     <w:p>
@@ -4035,7 +4724,10 @@
         <w:spacing w:before="120" w:after="280" w:afterAutospacing="1"/>
       </w:pPr>
       <w:r>
-        <w:t>3. Nghĩa vụ khác theo quy định của Luật này và quy định khác của pháp luật có liên quan.</w:t>
+        <w:t xml:space="preserve">3. Nghĩa vụ khác theo quy định của Luật này và quy định </w:t>
+      </w:r>
+      <w:r>
+        <w:t>khác của pháp luật có liên quan.</w:t>
       </w:r>
     </w:p>
     <w:p>
@@ -4057,15 +4749,21 @@
         <w:spacing w:before="120" w:after="280" w:afterAutospacing="1"/>
       </w:pPr>
       <w:r>
-        <w:t>1. Khoảng cách an toàn là khoảng cách cần bảo đảm từ một công trình hóa chất đến khu dân cư, công trình công cộng, công trình quốc phòng, khu quân sự, công trình an ninh, di tích lịch sử - văn hóa, danh lam thắng cảnh, khu bảo tồn thiên nhiên, khu vực khai thác nguồn nước sinh hoạt nhằm hạn chế tối đa tác động tiêu cực đến con người, cơ sở vật chất, tài sản, môi trường trong điều kiện hoạt động bình thường.</w:t>
-      </w:r>
-    </w:p>
-    <w:p>
-      <w:pPr>
-        <w:spacing w:before="120" w:after="280" w:afterAutospacing="1"/>
-      </w:pPr>
-      <w:r>
-        <w:t>2. Công trình hóa chất phải bảo đảm khoảng cách an toàn theo quy chuẩn kỹ thuật có liên quan.</w:t>
+        <w:t xml:space="preserve">1. Khoảng cách an toàn là khoảng cách cần bảo đảm từ một công trình hóa chất đến khu dân cư, công trình công cộng, công trình quốc phòng, khu quân sự, công trình an ninh, di tích lịch sử - </w:t>
+      </w:r>
+      <w:r>
+        <w:t>văn hóa, danh lam thắng cảnh, khu bảo tồn thiên nhiên, khu vực khai thác nguồn nước sinh hoạt nhằm hạn chế tối đa tác động tiêu cực đến con người, cơ sở vật chất, tài sản, môi trường trong điều kiện hoạt động bình thường.</w:t>
+      </w:r>
+    </w:p>
+    <w:p>
+      <w:pPr>
+        <w:spacing w:before="120" w:after="280" w:afterAutospacing="1"/>
+      </w:pPr>
+      <w:r>
+        <w:t>2. Công trình hóa chất phải bảo đả</w:t>
+      </w:r>
+      <w:r>
+        <w:t>m khoảng cách an toàn theo quy chuẩn kỹ thuật có liên quan.</w:t>
       </w:r>
     </w:p>
     <w:p>
@@ -4097,7 +4795,14 @@
           <w:b/>
           <w:bCs/>
         </w:rPr>
-        <w:t>Mục 2. PHÒNG NGỪA, ỨNG PHÓ SỰ CỐ HÓA CHẤT</w:t>
+        <w:t>Mục 2.</w:t>
+      </w:r>
+      <w:r>
+        <w:rPr>
+          <w:b/>
+          <w:bCs/>
+        </w:rPr>
+        <w:t xml:space="preserve"> PHÒNG NGỪA, ỨNG PHÓ SỰ CỐ HÓA CHẤT</w:t>
       </w:r>
       <w:bookmarkEnd w:id="151"/>
     </w:p>
@@ -4128,7 +4833,10 @@
         <w:spacing w:before="120" w:after="280" w:afterAutospacing="1"/>
       </w:pPr>
       <w:r>
-        <w:t xml:space="preserve">2. Việc huấn luyện an toàn về chuyên ngành hóa chất thực hiện theo quy định của Luật này, </w:t>
+        <w:t>2. Việc huấn luyện an toàn về chuyên ngành hóa chất</w:t>
+      </w:r>
+      <w:r>
+        <w:t xml:space="preserve"> thực hiện theo quy định của Luật này, </w:t>
       </w:r>
       <w:bookmarkStart w:id="153" w:name="tvpllink_rnkvqnahsb"/>
       <w:r>
@@ -4153,7 +4861,10 @@
       </w:pPr>
       <w:bookmarkStart w:id="155" w:name="khoan_3_36"/>
       <w:r>
-        <w:t>3. Chính phủ quy định chi tiết về đối tượng, nội dung, thời lượng huấn luyện và năng lực của người huấn luyện an toàn về chuyên ngành hóa chất.</w:t>
+        <w:t>3. Chính phủ quy định chi tiết về đối tượng, nội dung, thời lượng huấn luyện và năng lực của n</w:t>
+      </w:r>
+      <w:r>
+        <w:t>gười huấn luyện an toàn về chuyên ngành hóa chất.</w:t>
       </w:r>
       <w:bookmarkEnd w:id="155"/>
     </w:p>
@@ -4184,15 +4895,24 @@
         <w:spacing w:before="120" w:after="280" w:afterAutospacing="1"/>
       </w:pPr>
       <w:r>
-        <w:t>a) Chủ đầu tư dự án có hoạt động tồn trữ hóa chất thuộc danh mục và vượt ngưỡng quy định tại khoản 2 Điều này phải xây dựng Kế hoạch phòng ngừa, ứng phó sự cố hóa chất trong giai đoạn chuẩn bị dự án đầu tư xây dựng theo quy định của pháp luật về xây dựng và chỉ được tồn trữ hóa chất sau khi Kế hoạch phòng ngừa, ứng phó sự cố hóa chất đã được phê duyệt;</w:t>
-      </w:r>
-    </w:p>
-    <w:p>
-      <w:pPr>
-        <w:spacing w:before="120" w:after="280" w:afterAutospacing="1"/>
-      </w:pPr>
-      <w:r>
-        <w:t>b) Tổ chức, cá nhân quản lý, vận hành cơ sở có hoạt động tồn trữ hóa chất thuộc danh mục và vượt ngưỡng quy định tại khoản 2 Điều này phải được cơ quan quản lý nhà nước có thẩm quyền phê duyệt Kế hoạch phòng ngừa, ứng phó sự cố hóa chất trước khi thực hiện hoạt động tồn trữ hóa chất.</w:t>
+        <w:t>a) Chủ đầu tư dự án có hoạt động tồn trữ hóa chất thuộc danh m</w:t>
+      </w:r>
+      <w:r>
+        <w:t>ục và vượt ngưỡng quy định tại khoản 2 Điều này phải xây dựng Kế hoạch phòng ngừa, ứng phó sự cố hóa chất trong giai đoạn chuẩn bị dự án đầu tư xây dựng theo quy định của pháp luật về xây dựng và chỉ được tồn trữ hóa chất sau khi Kế hoạch phòng ngừa, ứng p</w:t>
+      </w:r>
+      <w:r>
+        <w:t>hó sự cố hóa chất đã được phê duyệt;</w:t>
+      </w:r>
+    </w:p>
+    <w:p>
+      <w:pPr>
+        <w:spacing w:before="120" w:after="280" w:afterAutospacing="1"/>
+      </w:pPr>
+      <w:r>
+        <w:t>b) Tổ chức, cá nhân quản lý, vận hành cơ sở có hoạt động tồn trữ hóa chất thuộc danh mục và vượt ngưỡng quy định tại khoản 2 Điều này phải được cơ quan quản lý nhà nước có thẩm quyền phê duyệt Kế hoạch phòng ngừa, ứng p</w:t>
+      </w:r>
+      <w:r>
+        <w:t>hó sự cố hóa chất trước khi thực hiện hoạt động tồn trữ hóa chất.</w:t>
       </w:r>
     </w:p>
     <w:p>
@@ -4201,7 +4921,10 @@
       </w:pPr>
       <w:bookmarkStart w:id="157" w:name="khoan_2_37"/>
       <w:r>
-        <w:t>2. Chính phủ ban hành Danh mục hóa chất phải xây dựng Kế hoạch phòng ngừa, ứng phó sự cố hóa chất; quy định ngưỡng khối lượng tồn trữ hóa chất lớn nhất tại một thời điểm phải xây dựng Kế hoạch phòng ngừa, ứng phó sự cố hóa chất; quy định chi tiết nội dung, trình tự, thủ tục, thẩm quyền, thời điểm thẩm định, phê duyệt Kế hoạch phòng ngừa, ứng phó sự cố hóa chất.</w:t>
+        <w:t>2. Chính phủ ban hành Danh mục hóa chất phải xây dựng Kế hoạch phòng ngừa, ứng phó sự cố hóa chất; quy định ngưỡng khối lượng tồn trữ hóa chất lớn nhất tại một thời điểm phải xây dựng Kế hoạ</w:t>
+      </w:r>
+      <w:r>
+        <w:t>ch phòng ngừa, ứng phó sự cố hóa chất; quy định chi tiết nội dung, trình tự, thủ tục, thẩm quyền, thời điểm thẩm định, phê duyệt Kế hoạch phòng ngừa, ứng phó sự cố hóa chất.</w:t>
       </w:r>
       <w:bookmarkEnd w:id="157"/>
     </w:p>
@@ -4224,7 +4947,10 @@
         <w:spacing w:before="120" w:after="280" w:afterAutospacing="1"/>
       </w:pPr>
       <w:r>
-        <w:t>1. Trách nhiệm xây dựng Biện pháp phòng ngừa, ứng phó sự cố hóa chất được quy định như sau:</w:t>
+        <w:t>1. Trách nhiệm xây dựng Biện</w:t>
+      </w:r>
+      <w:r>
+        <w:t xml:space="preserve"> pháp phòng ngừa, ứng phó sự cố hóa chất được quy định như sau:</w:t>
       </w:r>
     </w:p>
     <w:p>
@@ -4240,7 +4966,10 @@
       </w:r>
       <w:bookmarkEnd w:id="159"/>
       <w:r>
-        <w:t xml:space="preserve"> phải xây dựng Biện pháp phòng ngừa, ứng phó sự cố hóa chất trong giai đoạn chuẩn bị dự án đầu tư xây dựng theo quy định của pháp luật về xây dựng và chỉ được tồn trữ hóa chất sau khi Biện pháp phòng ngừa, ứng phó sự cố hóa chất đã được ban hành;</w:t>
+        <w:t xml:space="preserve"> phải xây dựng Biện pháp phòng ngừa, ứng phó sự cố hóa chất trong giai đoạn chu</w:t>
+      </w:r>
+      <w:r>
+        <w:t>ẩn bị dự án đầu tư xây dựng theo quy định của pháp luật về xây dựng và chỉ được tồn trữ hóa chất sau khi Biện pháp phòng ngừa, ứng phó sự cố hóa chất đã được ban hành;</w:t>
       </w:r>
     </w:p>
     <w:p>
@@ -4249,7 +4978,10 @@
       </w:pPr>
       <w:r>
         <w:lastRenderedPageBreak/>
-        <w:t xml:space="preserve">b) Tổ chức, cá nhân quản lý, vận hành cơ sở có hoạt động tồn trữ hóa chất nguy hiểm không thuộc quy định tại </w:t>
+        <w:t>b) Tổ chức, cá nhân quản lý, vận hành cơ sở có hoạt động tồn trữ hóa chất nguy hiểm khôn</w:t>
+      </w:r>
+      <w:r>
+        <w:t xml:space="preserve">g thuộc quy định tại </w:t>
       </w:r>
       <w:bookmarkStart w:id="160" w:name="tc_39"/>
       <w:r>
@@ -4265,7 +4997,10 @@
         <w:spacing w:before="120" w:after="280" w:afterAutospacing="1"/>
       </w:pPr>
       <w:r>
-        <w:t>c) Trước khi vận chuyển hóa chất nguy hiểm, tổ chức, cá nhân vận chuyển hóa chất nguy hiểm có nghĩa vụ xây dựng và ban hành Biện pháp phòng ngừa, ứng phó sự cố hóa chất trong vận chuyển và mang theo trong suốt quá trình vận chuyển.</w:t>
+        <w:t>c) Trước khi vận chuyển hóa chất nguy hiểm, tổ chức, cá nhân vận chuyển hóa chất nguy h</w:t>
+      </w:r>
+      <w:r>
+        <w:t>iểm có nghĩa vụ xây dựng và ban hành Biện pháp phòng ngừa, ứng phó sự cố hóa chất trong vận chuyển và mang theo trong suốt quá trình vận chuyển.</w:t>
       </w:r>
     </w:p>
     <w:p>
@@ -4286,7 +5021,14 @@
           <w:b/>
           <w:bCs/>
         </w:rPr>
-        <w:t>Điều 39. Thực hiện Kế hoạch phòng ngừa, ứng phó sự cố hóa chất, Biện pháp phòng ngừa, ứng phó sự cố hóa chất</w:t>
+        <w:t>Điều 39. Thực hiện Kế hoạch phòng ngừa, ứng phó sự cố hóa chất, Biện p</w:t>
+      </w:r>
+      <w:r>
+        <w:rPr>
+          <w:b/>
+          <w:bCs/>
+        </w:rPr>
+        <w:t>háp phòng ngừa, ứng phó sự cố hóa chất</w:t>
       </w:r>
       <w:bookmarkEnd w:id="161"/>
     </w:p>
@@ -4311,7 +5053,13 @@
       </w:r>
       <w:bookmarkEnd w:id="162"/>
       <w:r>
-        <w:t xml:space="preserve"> có nghĩa vụ điều chỉnh Kế hoạch phòng ngừa, ứng phó sự cố hóa chất, Biện pháp phòng ngừa, ứng phó sự cố hóa chất trong trường hợp mở rộng quy mô, thay đổi dây chuyền công nghệ, trang thiết bị sản xuất, sử dụng, tồn trữ của dự án, cơ sở tồn trữ hóa chất. Hạng mục thay đổi của dự án, cơ sở hóa chất chỉ được đưa vào hoạt động sau khi Kế hoạch phòng ngừa, ứng phó sự cố hóa chất đã được phê duyệt hoặc Biện pháp phòng ngừa, ứng phó sự cố hóa chất đã được ban hành.</w:t>
+        <w:t xml:space="preserve"> có nghĩa vụ điều chỉnh Kế hoạch phòng ngừa, ứng phó sự cố hóa chất, Biện pháp phòng ngừa, ứng phó sự</w:t>
+      </w:r>
+      <w:r>
+        <w:t xml:space="preserve"> cố hóa chất trong trường hợp mở rộng quy mô, thay đổi dây chuyền công nghệ, trang thiết bị sản xuất, sử dụng, tồn trữ của dự án, cơ sở tồn trữ hóa chất. Hạng mục thay đổi của dự án, cơ sở hóa chất chỉ được đưa vào hoạt động sau khi Kế hoạch phòng ngừa, ứn</w:t>
+      </w:r>
+      <w:r>
+        <w:t>g phó sự cố hóa chất đã được phê duyệt hoặc Biện pháp phòng ngừa, ứng phó sự cố hóa chất đã được ban hành.</w:t>
       </w:r>
     </w:p>
     <w:p>
@@ -4327,15 +5075,21 @@
       </w:r>
       <w:bookmarkEnd w:id="163"/>
       <w:r>
-        <w:t xml:space="preserve"> có nghĩa vụ tổ chức diễn tập ứng phó sự cố hóa chất định kỳ hằng năm.</w:t>
-      </w:r>
-    </w:p>
-    <w:p>
-      <w:pPr>
-        <w:spacing w:before="120" w:after="280" w:afterAutospacing="1"/>
-      </w:pPr>
-      <w:r>
-        <w:t>4. Tổ chức, cá nhân có nghĩa vụ cập nhật Kế hoạch phòng ngừa, ứng phó sự cố hóa chất đã được phê duyệt hoặc Biện pháp phòng ngừa, ứng phó sự cố hóa chất đã được ban hành vào Cơ sở dữ liệu chuyên ngành hóa chất, trừ trường hợp vì mục đích quốc phòng, an ninh.</w:t>
+        <w:t xml:space="preserve"> có nghĩa vụ tổ chức di</w:t>
+      </w:r>
+      <w:r>
+        <w:t>ễn tập ứng phó sự cố hóa chất định kỳ hằng năm.</w:t>
+      </w:r>
+    </w:p>
+    <w:p>
+      <w:pPr>
+        <w:spacing w:before="120" w:after="280" w:afterAutospacing="1"/>
+      </w:pPr>
+      <w:r>
+        <w:t>4. Tổ chức, cá nhân có nghĩa vụ cập nhật Kế hoạch phòng ngừa, ứng phó sự cố hóa chất đã được phê duyệt hoặc Biện pháp phòng ngừa, ứng phó sự cố hóa chất đã được ban hành vào Cơ sở dữ liệu chuyên ngành hóa chấ</w:t>
+      </w:r>
+      <w:r>
+        <w:t>t, trừ trường hợp vì mục đích quốc phòng, an ninh.</w:t>
       </w:r>
     </w:p>
     <w:p>
@@ -4365,15 +5119,24 @@
         <w:spacing w:before="120" w:after="280" w:afterAutospacing="1"/>
       </w:pPr>
       <w:r>
-        <w:t>1. Tổ chức, cá nhân hoạt động hóa chất có nghĩa vụ bảo đảm đủ năng lực về trang thiết bị, nhân lực ứng phó sự cố hóa chất tại chỗ và đầu tư hệ thống trang thiết bị ứng phó sự cố hóa chất phù hợp với quy mô, đặc tính nguy hiểm của hóa chất theo Kế hoạch phòng ngừa, ứng phó sự cố hóa chất đã được phê duyệt hoặc Biện pháp phòng ngừa, ứng phó sự cố hóa chất đã được ban hành để bảo đảm an toàn và kịp thời khi ứng phó sự cố hóa chất.</w:t>
-      </w:r>
-    </w:p>
-    <w:p>
-      <w:pPr>
-        <w:spacing w:before="120" w:after="280" w:afterAutospacing="1"/>
-      </w:pPr>
-      <w:r>
-        <w:t>2. Lực lượng phòng cháy, chữa cháy và cứu nạn, cứu hộ, lực lượng khác và cơ quan nhà nước có liên quan có trách nhiệm bảo đảm đủ năng lực về trang thiết bị, nhân lực để ứng phó sự cố hóa chất theo Kế hoạch phòng ngừa, ứng phó sự cố hóa chất cấp tỉnh đã được ban hành.</w:t>
+        <w:t xml:space="preserve">1. Tổ chức, cá nhân hoạt động hóa chất có nghĩa vụ bảo đảm đủ năng lực về trang thiết bị, nhân lực ứng phó </w:t>
+      </w:r>
+      <w:r>
+        <w:t>sự cố hóa chất tại chỗ và đầu tư hệ thống trang thiết bị ứng phó sự cố hóa chất phù hợp với quy mô, đặc tính nguy hiểm của hóa chất theo Kế hoạch phòng ngừa, ứng phó sự cố hóa chất đã được phê duyệt hoặc Biện pháp phòng ngừa, ứng phó sự cố hóa chất đã được</w:t>
+      </w:r>
+      <w:r>
+        <w:t xml:space="preserve"> ban hành để bảo đảm an toàn và kịp thời khi ứng phó sự cố hóa chất.</w:t>
+      </w:r>
+    </w:p>
+    <w:p>
+      <w:pPr>
+        <w:spacing w:before="120" w:after="280" w:afterAutospacing="1"/>
+      </w:pPr>
+      <w:r>
+        <w:t xml:space="preserve">2. Lực lượng phòng cháy, chữa cháy và cứu nạn, cứu hộ, lực lượng khác và cơ quan nhà nước có liên quan có trách nhiệm bảo đảm đủ năng lực về trang thiết bị, nhân lực để ứng phó sự cố </w:t>
+      </w:r>
+      <w:r>
+        <w:t>hóa chất theo Kế hoạch phòng ngừa, ứng phó sự cố hóa chất cấp tỉnh đã được ban hành.</w:t>
       </w:r>
     </w:p>
     <w:p>
@@ -4406,15 +5169,21 @@
         <w:spacing w:before="120" w:after="280" w:afterAutospacing="1"/>
       </w:pPr>
       <w:r>
-        <w:t>1. Sự cố hóa chất được phân cấp như sau:</w:t>
-      </w:r>
-    </w:p>
-    <w:p>
-      <w:pPr>
-        <w:spacing w:before="120" w:after="280" w:afterAutospacing="1"/>
-      </w:pPr>
-      <w:r>
-        <w:t>a) Sự cố hóa chất cấp cơ sở là sự cố hóa chất xảy ra trong phạm vi địa giới của cơ sở hóa chất và khi diễn biến, mức độ thiệt hại của sự cố nằm trong khả năng, điều kiện ứng phó, khắc phục hậu quả của lực lượng ứng phó tại cơ sở hóa chất;</w:t>
+        <w:t xml:space="preserve">1. Sự cố hóa </w:t>
+      </w:r>
+      <w:r>
+        <w:t>chất được phân cấp như sau:</w:t>
+      </w:r>
+    </w:p>
+    <w:p>
+      <w:pPr>
+        <w:spacing w:before="120" w:after="280" w:afterAutospacing="1"/>
+      </w:pPr>
+      <w:r>
+        <w:t>a) Sự cố hóa chất cấp cơ sở là sự cố hóa chất xảy ra trong phạm vi địa giới của cơ sở hóa chất và khi diễn biến, mức độ thiệt hại của sự cố nằm trong khả năng, điều kiện ứng phó, khắc phục hậu quả của lực lượng ứng phó tại cơ sở</w:t>
+      </w:r>
+      <w:r>
+        <w:t xml:space="preserve"> hóa chất;</w:t>
       </w:r>
     </w:p>
     <w:p>
@@ -4430,47 +5199,65 @@
         <w:spacing w:before="120" w:after="280" w:afterAutospacing="1"/>
       </w:pPr>
       <w:r>
-        <w:t>c) Sự cố hóa chất cấp quốc gia là sự cố hóa chất xảy ra trên địa bàn một hoặc một số tỉnh và khi diễn biến, mức độ thiệt hại của sự cố vượt quá khả năng, điều kiện ứng phó, khắc phục hậu quả của chính quyền địa phương cấp tỉnh.</w:t>
-      </w:r>
-    </w:p>
-    <w:p>
-      <w:pPr>
-        <w:spacing w:before="120" w:after="280" w:afterAutospacing="1"/>
-      </w:pPr>
-      <w:r>
-        <w:t>2. Cơ quan nhà nước có thẩm quyền có trách nhiệm tổ chức thực hiện ứng phó sự cố hóa chất theo quy định của pháp luật về phòng thủ dân sự; tổng hợp thông tin, diễn biến sự cố, hiện trạng và kiến nghị về ảnh hưởng của sự cố đến con người, cơ sở vật chất, tài sản, môi trường đến Bộ quản lý lĩnh vực.</w:t>
-      </w:r>
-    </w:p>
-    <w:p>
-      <w:pPr>
-        <w:spacing w:before="120" w:after="280" w:afterAutospacing="1"/>
-      </w:pPr>
-      <w:r>
-        <w:t>3. Nghĩa vụ của tổ chức, cá nhân khi xảy ra sự cố hóa chất bao gồm:</w:t>
-      </w:r>
-    </w:p>
-    <w:p>
-      <w:pPr>
-        <w:spacing w:before="120" w:after="280" w:afterAutospacing="1"/>
-      </w:pPr>
-      <w:r>
-        <w:t>a) Khi xảy ra sự cố hóa chất, tổ chức, cá nhân hoạt động hóa chất phải áp dụng kịp thời Biện pháp phòng ngừa, ứng phó sự cố hóa chất, Kế hoạch phòng ngừa, ứng phó sự cố hóa chất; phải thông báo cho cơ quan nhà nước có thẩm quyền khi vượt quá khả năng ứng phó để phối hợp xử lý theo quy định của pháp luật;</w:t>
-      </w:r>
-    </w:p>
-    <w:p>
-      <w:pPr>
-        <w:spacing w:before="120" w:after="280" w:afterAutospacing="1"/>
-      </w:pPr>
-      <w:r>
-        <w:t>b) Tổ chức, cá nhân có nghĩa vụ chấp hành việc huy động người, tài sản của cơ quan nhà nước có thẩm quyền để ứng phó, khắc phục hậu quả sự cố hóa chất theo quy định của pháp luật;</w:t>
-      </w:r>
-    </w:p>
-    <w:p>
-      <w:pPr>
-        <w:spacing w:before="120" w:after="280" w:afterAutospacing="1"/>
-      </w:pPr>
-      <w:r>
-        <w:t>c) Khi xảy ra sự cố, tổ chức, cá nhân hoạt động hóa chất phải xây dựng báo cáo cung cấp thông tin chi tiết về sự cố, chủng loại hóa chất, nguyên nhân, biện pháp ứng phó, khối lượng hóa chất bị thất thoát, hậu quả, phương hướng khắc phục sự cố gửi cho cơ quan quản lý ngành tại địa phương;</w:t>
+        <w:t>c) Sự cố hóa chất c</w:t>
+      </w:r>
+      <w:r>
+        <w:t>ấp quốc gia là sự cố hóa chất xảy ra trên địa bàn một hoặc một số tỉnh và khi diễn biến, mức độ thiệt hại của sự cố vượt quá khả năng, điều kiện ứng phó, khắc phục hậu quả của chính quyền địa phương cấp tỉnh.</w:t>
+      </w:r>
+    </w:p>
+    <w:p>
+      <w:pPr>
+        <w:spacing w:before="120" w:after="280" w:afterAutospacing="1"/>
+      </w:pPr>
+      <w:r>
+        <w:t>2. Cơ quan nhà nước có thẩm quyền có trách nhiệ</w:t>
+      </w:r>
+      <w:r>
+        <w:t>m tổ chức thực hiện ứng phó sự cố hóa chất theo quy định của pháp luật về phòng thủ dân sự; tổng hợp thông tin, diễn biến sự cố, hiện trạng và kiến nghị về ảnh hưởng của sự cố đến con người, cơ sở vật chất, tài sản, môi trường đến Bộ quản lý lĩnh vực.</w:t>
+      </w:r>
+    </w:p>
+    <w:p>
+      <w:pPr>
+        <w:spacing w:before="120" w:after="280" w:afterAutospacing="1"/>
+      </w:pPr>
+      <w:r>
+        <w:t>3. N</w:t>
+      </w:r>
+      <w:r>
+        <w:t>ghĩa vụ của tổ chức, cá nhân khi xảy ra sự cố hóa chất bao gồm:</w:t>
+      </w:r>
+    </w:p>
+    <w:p>
+      <w:pPr>
+        <w:spacing w:before="120" w:after="280" w:afterAutospacing="1"/>
+      </w:pPr>
+      <w:r>
+        <w:t>a) Khi xảy ra sự cố hóa chất, tổ chức, cá nhân hoạt động hóa chất phải áp dụng kịp thời Biện pháp phòng ngừa, ứng phó sự cố hóa chất, Kế hoạch phòng ngừa, ứng phó sự cố hóa chất; phải thông bá</w:t>
+      </w:r>
+      <w:r>
+        <w:t>o cho cơ quan nhà nước có thẩm quyền khi vượt quá khả năng ứng phó để phối hợp xử lý theo quy định của pháp luật;</w:t>
+      </w:r>
+    </w:p>
+    <w:p>
+      <w:pPr>
+        <w:spacing w:before="120" w:after="280" w:afterAutospacing="1"/>
+      </w:pPr>
+      <w:r>
+        <w:t xml:space="preserve">b) Tổ chức, cá nhân có nghĩa vụ chấp hành việc huy động người, tài sản của cơ quan nhà nước có thẩm quyền để ứng phó, khắc phục hậu quả sự cố </w:t>
+      </w:r>
+      <w:r>
+        <w:t>hóa chất theo quy định của pháp luật;</w:t>
+      </w:r>
+    </w:p>
+    <w:p>
+      <w:pPr>
+        <w:spacing w:before="120" w:after="280" w:afterAutospacing="1"/>
+      </w:pPr>
+      <w:r>
+        <w:t>c) Khi xảy ra sự cố, tổ chức, cá nhân hoạt động hóa chất phải xây dựng báo cáo cung cấp thông tin chi tiết về sự cố, chủng loại hóa chất, nguyên nhân, biện pháp ứng phó, khối lượng hóa chất bị thất thoát, hậu quả, phươ</w:t>
+      </w:r>
+      <w:r>
+        <w:t>ng hướng khắc phục sự cố gửi cho cơ quan quản lý ngành tại địa phương;</w:t>
       </w:r>
     </w:p>
     <w:p>
@@ -4500,7 +5287,10 @@
         <w:spacing w:before="120" w:after="280" w:afterAutospacing="1"/>
       </w:pPr>
       <w:r>
-        <w:t>1. Ủy ban nhân dân cấp tỉnh có trách nhiệm xây dựng và ban hành Kế hoạch phòng ngừa, ứng phó sự cố hóa chất cấp tỉnh phù hợp với quy hoạch vùng, quy hoạch tỉnh và cập nhật vào Cơ sở dữ liệu chuyên ngành hóa chất.</w:t>
+        <w:t>1. Ủy ban nhân dân cấp tỉ</w:t>
+      </w:r>
+      <w:r>
+        <w:t>nh có trách nhiệm xây dựng và ban hành Kế hoạch phòng ngừa, ứng phó sự cố hóa chất cấp tỉnh phù hợp với quy hoạch vùng, quy hoạch tỉnh và cập nhật vào Cơ sở dữ liệu chuyên ngành hóa chất.</w:t>
       </w:r>
     </w:p>
     <w:p>
@@ -4509,7 +5299,10 @@
       </w:pPr>
       <w:r>
         <w:lastRenderedPageBreak/>
-        <w:t>2. Ủy ban nhân dân cấp tỉnh tổ chức diễn tập ứng phó sự cố hóa chất cấp tỉnh theo Kế hoạch phòng ngừa, ứng phó sự cố hóa chất cấp tỉnh đã được ban hành. Diễn tập ứng phó sự cố hóa chất cấp tỉnh có thể được kết hợp với diễn tập ứng phó sự cố khác trên địa bàn.</w:t>
+        <w:t xml:space="preserve">2. Ủy ban nhân dân cấp tỉnh tổ chức diễn tập ứng phó sự cố hóa chất </w:t>
+      </w:r>
+      <w:r>
+        <w:t>cấp tỉnh theo Kế hoạch phòng ngừa, ứng phó sự cố hóa chất cấp tỉnh đã được ban hành. Diễn tập ứng phó sự cố hóa chất cấp tỉnh có thể được kết hợp với diễn tập ứng phó sự cố khác trên địa bàn.</w:t>
       </w:r>
     </w:p>
     <w:p>
@@ -4532,7 +5325,14 @@
           <w:b/>
           <w:bCs/>
         </w:rPr>
-        <w:t>Mục 3. BẢO VỆ MÔI TRƯỜNG VÀ AN TOÀN CHO CỘNG ĐỒNG</w:t>
+        <w:t>Mục 3. BẢO VỆ MÔI TRƯỜN</w:t>
+      </w:r>
+      <w:r>
+        <w:rPr>
+          <w:b/>
+          <w:bCs/>
+        </w:rPr>
+        <w:t>G VÀ AN TOÀN CHO CỘNG ĐỒNG</w:t>
       </w:r>
       <w:bookmarkEnd w:id="169"/>
     </w:p>
@@ -4555,7 +5355,10 @@
         <w:spacing w:before="120" w:after="280" w:afterAutospacing="1"/>
       </w:pPr>
       <w:r>
-        <w:t>Tổ chức, cá nhân liên quan đến hoạt động hóa chất có nghĩa vụ thực hiện đầy đủ quy định về an toàn hóa chất theo quy định của Luật này, quy định của pháp luật về bảo vệ môi trường, an toàn lao động và quy định khác của pháp luật có liên quan.</w:t>
+        <w:t>Tổ chức, cá nhân liên quan đến hoạt động hóa chất có nghĩa vụ thực hiện đầy đủ quy định về an toàn hóa ch</w:t>
+      </w:r>
+      <w:r>
+        <w:t>ất theo quy định của Luật này, quy định của pháp luật về bảo vệ môi trường, an toàn lao động và quy định khác của pháp luật có liên quan.</w:t>
       </w:r>
     </w:p>
     <w:p>
@@ -4568,7 +5371,14 @@
           <w:b/>
           <w:bCs/>
         </w:rPr>
-        <w:t>Điều 44. Quyền và nghĩa vụ của tổ chức, cá nhân nơi có cơ sở hoạt động hóa chất trong bảo vệ môi trường và an toàn cho cộng đồng</w:t>
+        <w:t>Điều 44. Quyền và nghĩa vụ của tổ chức, cá nhân nơi có cơ sở hoạt động hóa chất trong bảo vệ môi trường và an toàn cho</w:t>
+      </w:r>
+      <w:r>
+        <w:rPr>
+          <w:b/>
+          <w:bCs/>
+        </w:rPr>
+        <w:t xml:space="preserve"> cộng đồng</w:t>
       </w:r>
       <w:bookmarkEnd w:id="171"/>
     </w:p>
@@ -4593,7 +5403,10 @@
         <w:spacing w:before="120" w:after="280" w:afterAutospacing="1"/>
       </w:pPr>
       <w:r>
-        <w:t>b) Yêu cầu cơ sở hoạt động hóa chất thực hiện các biện pháp bảo vệ sức khỏe cộng đồng, bảo vệ môi trường theo quy định của pháp luật;</w:t>
+        <w:t>b) Yêu cầu cơ sở hoạt động hóa chất thực hiện các biện ph</w:t>
+      </w:r>
+      <w:r>
+        <w:t>áp bảo vệ sức khỏe cộng đồng, bảo vệ môi trường theo quy định của pháp luật;</w:t>
       </w:r>
     </w:p>
     <w:p>
@@ -4609,7 +5422,10 @@
         <w:spacing w:before="120" w:after="280" w:afterAutospacing="1"/>
       </w:pPr>
       <w:r>
-        <w:t>d) Phản ánh đến cơ quan nhà nước có thẩm quyền về tổ chức, cá nhân có hành vi vi phạm quy định của pháp luật về an toàn hóa chất;</w:t>
+        <w:t>d) Phản ánh đến cơ quan nhà nước có thẩm quyền về tổ chức, cá nhân có hành vi vi phạm quy đị</w:t>
+      </w:r>
+      <w:r>
+        <w:t>nh của pháp luật về an toàn hóa chất;</w:t>
       </w:r>
     </w:p>
     <w:p>
@@ -4625,7 +5441,10 @@
         <w:spacing w:before="120" w:after="280" w:afterAutospacing="1"/>
       </w:pPr>
       <w:r>
-        <w:t>2. Tổ chức, cá nhân nơi có cơ sở hoạt động hóa chất có các nghĩa vụ sau đây:</w:t>
+        <w:t>2. Tổ chức, cá nhân nơi có cơ sở hoạt độn</w:t>
+      </w:r>
+      <w:r>
+        <w:t>g hóa chất có các nghĩa vụ sau đây:</w:t>
       </w:r>
     </w:p>
     <w:p>
@@ -4641,7 +5460,10 @@
         <w:spacing w:before="120" w:after="280" w:afterAutospacing="1"/>
       </w:pPr>
       <w:r>
-        <w:t>b) Tạo điều kiện thuận lợi để cơ quan, tổ chức thực hiện ứng phó, khắc phục sự cố hóa chất, xử lý và giải quyết theo quy định của pháp luật trong trường hợp xảy ra sự cố hóa chất.</w:t>
+        <w:t xml:space="preserve">b) Tạo điều kiện thuận lợi để cơ quan, tổ chức thực hiện ứng phó, khắc phục sự cố hóa </w:t>
+      </w:r>
+      <w:r>
+        <w:t>chất, xử lý và giải quyết theo quy định của pháp luật trong trường hợp xảy ra sự cố hóa chất.</w:t>
       </w:r>
     </w:p>
     <w:p>
@@ -4664,7 +5486,10 @@
       </w:pPr>
       <w:r>
         <w:lastRenderedPageBreak/>
-        <w:t>Tổ chức, cá nhân hoạt động hóa chất có nghĩa vụ phối hợp với chính quyền địa phương phổ biến công khai cho cộng đồng dân cư nơi có cơ sở hoạt động hóa chất thông tin về an toàn hóa chất sau đây:</w:t>
+        <w:t>Tổ chức, cá nhân hoạt động hóa chất có nghĩa vụ phối hợp với chính quyền địa phương phổ biến công khai cho cộng đ</w:t>
+      </w:r>
+      <w:r>
+        <w:t>ồng dân cư nơi có cơ sở hoạt động hóa chất thông tin về an toàn hóa chất sau đây:</w:t>
       </w:r>
     </w:p>
     <w:p>
@@ -4680,7 +5505,10 @@
         <w:spacing w:before="120" w:after="280" w:afterAutospacing="1"/>
       </w:pPr>
       <w:r>
-        <w:t xml:space="preserve">2. Nội dung cơ bản của Kế hoạch phòng ngừa, ứng phó sự cố hóa chất quy định tại </w:t>
+        <w:t xml:space="preserve">2. Nội dung cơ </w:t>
+      </w:r>
+      <w:r>
+        <w:t xml:space="preserve">bản của Kế hoạch phòng ngừa, ứng phó sự cố hóa chất quy định tại </w:t>
       </w:r>
       <w:bookmarkStart w:id="173" w:name="tc_42"/>
       <w:r>
@@ -4709,7 +5537,14 @@
           <w:b/>
           <w:bCs/>
         </w:rPr>
-        <w:t>Điều 46. Trách nhiệm xử lý hóa chất, sản phẩm chứa chất độc không rõ nguồn gốc; hóa chất, sản phẩm chứa chất độc bị tịch thu; xử lý chất độc tồn dư của chiến tranh</w:t>
+        <w:t>Điều 46. Trách nhiệm xử lý hóa chất, sản phẩm chứa chất độc không rõ nguồn gốc; hóa chất, sản phẩm chứa chất độc</w:t>
+      </w:r>
+      <w:r>
+        <w:rPr>
+          <w:b/>
+          <w:bCs/>
+        </w:rPr>
+        <w:t xml:space="preserve"> bị tịch thu; xử lý chất độc tồn dư của chiến tranh</w:t>
       </w:r>
       <w:bookmarkEnd w:id="175"/>
     </w:p>
@@ -4726,7 +5561,10 @@
         <w:spacing w:before="120" w:after="280" w:afterAutospacing="1"/>
       </w:pPr>
       <w:r>
-        <w:t>a) Thống kê, phát hiện và thông báo về địa điểm, số lượng hóa chất, sản phẩm chứa chất độc không rõ nguồn gốc; hóa chất, sản phẩm chứa chất độc bị tịch thu trên địa bàn;</w:t>
+        <w:t>a) Thống kê, phát hiện và thông báo về địa điểm, số lượng hóa chất, sản phẩm chứa chất độc không rõ nguồn g</w:t>
+      </w:r>
+      <w:r>
+        <w:t>ốc; hóa chất, sản phẩm chứa chất độc bị tịch thu trên địa bàn;</w:t>
       </w:r>
     </w:p>
     <w:p>
@@ -4742,7 +5580,10 @@
         <w:spacing w:before="120" w:after="280" w:afterAutospacing="1"/>
       </w:pPr>
       <w:r>
-        <w:t>c) Tổ chức thực hiện phương án xử lý hóa chất, sản phẩm chứa chất độc không rõ nguồn gốc; hóa chất, sản phẩm chứa chất độc bị tịch thu.</w:t>
+        <w:t xml:space="preserve">c) Tổ chức thực hiện phương án xử lý hóa chất, sản phẩm chứa chất </w:t>
+      </w:r>
+      <w:r>
+        <w:t>độc không rõ nguồn gốc; hóa chất, sản phẩm chứa chất độc bị tịch thu.</w:t>
       </w:r>
     </w:p>
     <w:p>
@@ -4758,7 +5599,13 @@
         <w:spacing w:before="120" w:after="280" w:afterAutospacing="1"/>
       </w:pPr>
       <w:r>
-        <w:t>3. Trường hợp cá nhân quy định tại khoản 2 Điều này bị chết hoặc mất tích; tổ chức quy định tại khoản 2 Điều này bị giải thể, phá sản; hóa chất, sản phẩm chứa chất độc không rõ nguồn gốc hoặc không xác định được chủ sở hữu thì chi phí xử lý hóa chất, sản phẩm chứa chất độc do cơ quan của người có thẩm quyền xử phạt ra quyết định thực hiện được lấy từ nguồn ngân sách dự phòng cấp cho cơ quan đó.</w:t>
+        <w:t>3. Trường hợp cá nhân quy định tại khoản 2 Đi</w:t>
+      </w:r>
+      <w:r>
+        <w:t>ều này bị chết hoặc mất tích; tổ chức quy định tại khoản 2 Điều này bị giải thể, phá sản; hóa chất, sản phẩm chứa chất độc không rõ nguồn gốc hoặc không xác định được chủ sở hữu thì chi phí xử lý hóa chất, sản phẩm chứa chất độc do cơ quan của người có thẩ</w:t>
+      </w:r>
+      <w:r>
+        <w:t>m quyền xử phạt ra quyết định thực hiện được lấy từ nguồn ngân sách dự phòng cấp cho cơ quan đó.</w:t>
       </w:r>
     </w:p>
     <w:p>
@@ -4826,7 +5673,10 @@
         <w:spacing w:before="120" w:after="280" w:afterAutospacing="1"/>
       </w:pPr>
       <w:r>
-        <w:t>1. Luật này có hiệu lực thi hành từ ngày 01 tháng 01 năm 2026, trừ trường hợp quy định tại khoản 2 Điều này.</w:t>
+        <w:t>1. Luật này có hiệu lực thi hành t</w:t>
+      </w:r>
+      <w:r>
+        <w:t>ừ ngày 01 tháng 01 năm 2026, trừ trường hợp quy định tại khoản 2 Điều này.</w:t>
       </w:r>
     </w:p>
     <w:p>
@@ -4859,7 +5709,10 @@
       </w:r>
       <w:bookmarkEnd w:id="181"/>
       <w:r>
-        <w:t xml:space="preserve"> Hóa chất số 06/2007/QH12 đã được sửa đổi, bổ sung một số điều theo Luật số </w:t>
+        <w:t xml:space="preserve"> Hóa chất số</w:t>
+      </w:r>
+      <w:r>
+        <w:t xml:space="preserve"> 06/2007/QH12 đã được sửa đổi, bổ sung một số điều theo Luật số </w:t>
       </w:r>
       <w:bookmarkStart w:id="182" w:name="tvpllink_mnfbmulzqk"/>
       <w:r>
@@ -4887,7 +5740,10 @@
       </w:r>
       <w:bookmarkStart w:id="185" w:name="tc_45"/>
       <w:r>
-        <w:t>Điều 48 của Luật này</w:t>
+        <w:t>Điều 48 của Luật nà</w:t>
+      </w:r>
+      <w:r>
+        <w:t>y</w:t>
       </w:r>
       <w:bookmarkEnd w:id="185"/>
       <w:r>
@@ -4913,15 +5769,21 @@
         <w:spacing w:before="120" w:after="280" w:afterAutospacing="1"/>
       </w:pPr>
       <w:r>
-        <w:t>1. Báo cáo nghiên cứu khả thi đầu tư xây dựng, báo cáo kinh tế - kỹ thuật đầu tư xây dựng dự án hóa chất đã được trình cơ quan có thẩm quyền thẩm định nhưng đến ngày Luật này có hiệu lực thi hành chưa có văn bản thẩm định thì việc thẩm định tiếp tục thực hiện theo quy định của pháp luật về xây dựng.</w:t>
-      </w:r>
-    </w:p>
-    <w:p>
-      <w:pPr>
-        <w:spacing w:before="120" w:after="280" w:afterAutospacing="1"/>
-      </w:pPr>
-      <w:r>
-        <w:t>2. Tổ chức, cá nhân đã được cơ quan có thẩm quyền cấp giấy phép sản xuất, kinh doanh hóa chất trước ngày Luật này có hiệu lực thi hành được tiếp tục hoạt động theo giấy phép đã được cấp đến khi hết thời hạn của giấy phép.</w:t>
+        <w:t xml:space="preserve">1. Báo cáo nghiên cứu khả thi đầu tư xây dựng, báo cáo kinh tế - kỹ thuật đầu tư xây dựng dự án hóa chất đã được trình cơ quan có thẩm quyền thẩm định nhưng đến ngày Luật này có hiệu lực thi hành chưa có văn bản thẩm </w:t>
+      </w:r>
+      <w:r>
+        <w:t>định thì việc thẩm định tiếp tục thực hiện theo quy định của pháp luật về xây dựng.</w:t>
+      </w:r>
+    </w:p>
+    <w:p>
+      <w:pPr>
+        <w:spacing w:before="120" w:after="280" w:afterAutospacing="1"/>
+      </w:pPr>
+      <w:r>
+        <w:t>2. Tổ chức, cá nhân đã được cơ quan có thẩm quyền cấp giấy phép sản xuất, kinh doanh hóa chất trước ngày Luật này có hiệu lực thi hành được tiếp tục hoạt động theo giấy phé</w:t>
+      </w:r>
+      <w:r>
+        <w:t>p đã được cấp đến khi hết thời hạn của giấy phép.</w:t>
       </w:r>
     </w:p>
     <w:p>
@@ -4937,7 +5799,10 @@
       </w:r>
       <w:bookmarkEnd w:id="187"/>
       <w:r>
-        <w:t xml:space="preserve"> mà không thuộc Danh mục hóa chất hạn chế sản xuất, kinh doanh được ban hành theo quy định của </w:t>
+        <w:t xml:space="preserve"> mà không thuộc Danh mục hóa chất hạn chế sản xuất, kinh doanh được ban hành</w:t>
+      </w:r>
+      <w:r>
+        <w:t xml:space="preserve"> theo quy định của </w:t>
       </w:r>
       <w:bookmarkStart w:id="188" w:name="tvpllink_sybbqvhocm_2"/>
       <w:r>
@@ -4953,7 +5818,10 @@
         <w:spacing w:before="120" w:after="280" w:afterAutospacing="1"/>
       </w:pPr>
       <w:r>
-        <w:t>3. Tổ chức, cá nhân đã được cơ quan có thẩm quyền cấp giấy chứng nhận đủ điều kiện sản xuất, kinh doanh hóa chất trước ngày Luật này có hiệu lực thi hành được tiếp tục hoạt động theo giấy chứng nhận đã được cấp đến hết ngày 31 tháng 12 năm 2027.</w:t>
+        <w:t>3. Tổ chức, cá nhân đã được cơ quan có thẩm quyền cấp giấy chứng nhận đủ điều kiện sản xuất, kinh doanh hóa chất trước ngày Luật này có</w:t>
+      </w:r>
+      <w:r>
+        <w:t xml:space="preserve"> hiệu lực thi hành được tiếp tục hoạt động theo giấy chứng nhận đã được cấp đến hết ngày 31 tháng 12 năm 2027.</w:t>
       </w:r>
     </w:p>
     <w:p>
@@ -4969,7 +5837,10 @@
       </w:r>
       <w:bookmarkEnd w:id="189"/>
       <w:r>
-        <w:t xml:space="preserve"> mà không thuộc Danh mục hóa chất sản xuất, kinh doanh có điều kiện được ban hành theo quy định của </w:t>
+        <w:t xml:space="preserve"> mà </w:t>
+      </w:r>
+      <w:r>
+        <w:t xml:space="preserve">không thuộc Danh mục hóa chất sản xuất, kinh doanh có điều kiện được ban hành theo quy định của </w:t>
       </w:r>
       <w:bookmarkStart w:id="190" w:name="tvpllink_sybbqvhocm_3"/>
       <w:r>
@@ -4985,7 +5856,10 @@
         <w:spacing w:before="120" w:after="280" w:afterAutospacing="1"/>
       </w:pPr>
       <w:r>
-        <w:t>4. Kế hoạch phòng ngừa, ứng phó sự cố hóa chất đã được phê duyệt, Biện pháp phòng ngừa, ứng phó sự cố hóa chất đã được ban hành trước ngày Luật này có hiệu lực thi hành thì được tiếp tục thực hiện theo Kế hoạch, Biện pháp đó.</w:t>
+        <w:t>4. Kế hoạch phòng ngừa, ứng phó sự cố hóa chất đã được phê</w:t>
+      </w:r>
+      <w:r>
+        <w:t xml:space="preserve"> duyệt, Biện pháp phòng ngừa, ứng phó sự cố hóa chất đã được ban hành trước ngày Luật này có hiệu lực thi hành thì được tiếp tục thực hiện theo Kế hoạch, Biện pháp đó.</w:t>
       </w:r>
     </w:p>
     <w:p>
@@ -4997,24 +5871,90 @@
       </w:r>
       <w:bookmarkStart w:id="191" w:name="tc_48"/>
       <w:r>
-        <w:t>điểm a khoản 1 Điều 37 và điểm a khoản 1 Điều 38 của Luật này</w:t>
+        <w:t xml:space="preserve">điểm a khoản 1 Điều 37 và điểm a khoản 1 Điều 38 </w:t>
+      </w:r>
+      <w:r>
+        <w:t>của Luật này</w:t>
       </w:r>
       <w:bookmarkEnd w:id="191"/>
       <w:r>
-        <w:t xml:space="preserve"> đã kết thúc giai đoạn chuẩn bị dự án đầu tư xây dựng trước ngày Luật này có hiệu lực thi hành mà chủ đầu tư dự án chưa xây dựng Kế hoạch phòng ngừa, ứng phó sự cố hóa chất, Biện pháp phòng ngừa, ứng phó sự cố hóa chất thì phải xây dựng Kế hoạch phòng ngừa, ứng phó sự cố hóa chất, Biện pháp phòng ngừa, ứng phó sự cố hóa chất và phải được phê duyệt Kế hoạch phòng ngừa, ứng phó sự cố hóa chất hoặc ban hành Biện pháp phòng ngừa, ứng phó sự cố hóa chất trước khi đưa công trình của dự án vào khai thác sử dụng.</w:t>
-      </w:r>
-    </w:p>
-    <w:p>
-      <w:pPr>
-        <w:spacing w:before="120" w:after="280" w:afterAutospacing="1"/>
-      </w:pPr>
+        <w:t xml:space="preserve"> đã kết thúc giai đoạn chuẩn bị dự án đầu tư xây dựng trước ngày Luật này có hiệu lực thi hành mà chủ đầu tư dự án chưa xây dựng Kế hoạch phòng ngừa, ứng phó sự cố hóa chất, Biện pháp phòng ngừa, ứng phó sự cố hóa chất thì phải xây dựng Kế hoạc</w:t>
+      </w:r>
+      <w:r>
+        <w:t>h phòng ngừa, ứng phó sự cố hóa chất, Biện pháp phòng ngừa, ứng phó sự cố hóa chất và phải được phê duyệt Kế hoạch phòng ngừa, ứng phó sự cố hóa chất hoặc ban hành Biện pháp phòng ngừa, ứng phó sự cố hóa chất trước khi đưa công trình của dự án vào khai thá</w:t>
+      </w:r>
+      <w:r>
+        <w:t>c sử dụng.</w:t>
+      </w:r>
+    </w:p>
+    <w:p>
+      <w:pPr>
+        <w:spacing w:before="120" w:after="280" w:afterAutospacing="1"/>
+      </w:pPr>
+      <w:proofErr w:type="spellStart"/>
       <w:r>
         <w:rPr>
           <w:i/>
           <w:iCs/>
         </w:rPr>
         <w:lastRenderedPageBreak/>
-        <w:t>Luật này được Quốc hội nước Cộng hòa xã hội chủ nghĩa Việt Nam khóa XV, kỳ họp thứ 9 thông qua ngày 14 tháng 6 năm 2025.</w:t>
+        <w:t>Luật</w:t>
+      </w:r>
+      <w:proofErr w:type="spellEnd"/>
+      <w:r>
+        <w:rPr>
+          <w:i/>
+          <w:iCs/>
+        </w:rPr>
+        <w:t xml:space="preserve"> </w:t>
+      </w:r>
+      <w:proofErr w:type="spellStart"/>
+      <w:r>
+        <w:rPr>
+          <w:i/>
+          <w:iCs/>
+        </w:rPr>
+        <w:t>này</w:t>
+      </w:r>
+      <w:proofErr w:type="spellEnd"/>
+      <w:r>
+        <w:rPr>
+          <w:i/>
+          <w:iCs/>
+        </w:rPr>
+        <w:t xml:space="preserve"> </w:t>
+      </w:r>
+      <w:proofErr w:type="spellStart"/>
+      <w:r>
+        <w:rPr>
+          <w:i/>
+          <w:iCs/>
+        </w:rPr>
+        <w:t>được</w:t>
+      </w:r>
+      <w:proofErr w:type="spellEnd"/>
+      <w:r>
+        <w:rPr>
+          <w:i/>
+          <w:iCs/>
+        </w:rPr>
+        <w:t xml:space="preserve"> </w:t>
+      </w:r>
+      <w:proofErr w:type="spellStart"/>
+      <w:r>
+        <w:rPr>
+          <w:i/>
+          <w:iCs/>
+        </w:rPr>
+        <w:t>Quốc</w:t>
+      </w:r>
+      <w:proofErr w:type="spellEnd"/>
+      <w:r>
+        <w:rPr>
+          <w:i/>
+          <w:iCs/>
+        </w:rPr>
+        <w:t xml:space="preserve"> hội nước Cộng hòa xã hội chủ nghĩa Việt Nam khóa XV, kỳ họp thứ 9 thông qua ngày 14 tháng 6 năm 2025.</w:t>
       </w:r>
     </w:p>
     <w:p>
@@ -5159,12 +6099,8 @@
 </w:document>
 </file>
 
-<file path=word/numbering.xml><?xml version="1.0" encoding="utf-8"?>
-<w:numbering xmlns:wpc="http://schemas.microsoft.com/office/word/2010/wordprocessingCanvas" xmlns:cx="http://schemas.microsoft.com/office/drawing/2014/chartex" xmlns:cx1="http://schemas.microsoft.com/office/drawing/2015/9/8/chartex" xmlns:cx2="http://schemas.microsoft.com/office/drawing/2015/10/21/chartex" xmlns:cx3="http://schemas.microsoft.com/office/drawing/2016/5/9/chartex" xmlns:cx4="http://schemas.microsoft.com/office/drawing/2016/5/10/chartex" xmlns:cx5="http://schemas.microsoft.com/office/drawing/2016/5/11/chartex" xmlns:cx6="http://schemas.microsoft.com/office/drawing/2016/5/12/chartex" xmlns:cx7="http://schemas.microsoft.com/office/drawing/2016/5/13/chartex" xmlns:cx8="http://schemas.microsoft.com/office/drawing/2016/5/14/chartex" xmlns:mc="http://schemas.openxmlformats.org/markup-compatibility/2006" xmlns:aink="http://schemas.microsoft.com/office/drawing/2016/ink" xmlns:am3d="http://schemas.microsoft.com/office/drawing/2017/model3d" xmlns:o="urn:schemas-microsoft-com:office:office" xmlns:oel="http://schemas.microsoft.com/office/2019/extlst" xmlns:r="http://schemas.openxmlformats.org/officeDocument/2006/relationships" xmlns:m="http://schemas.openxmlformats.org/officeDocument/2006/math" xmlns:v="urn:schemas-microsoft-com:vml" xmlns:wp14="http://schemas.microsoft.com/office/word/2010/wordprocessingDrawing" xmlns:wp="http://schemas.openxmlformats.org/drawingml/2006/wordprocessingDrawing" xmlns:w10="urn:schemas-microsoft-com:office:word" xmlns:w="http://schemas.openxmlformats.org/wordprocessingml/2006/main" xmlns:w14="http://schemas.microsoft.com/office/word/2010/wordml" xmlns:w15="http://schemas.microsoft.com/office/word/2012/wordml" xmlns:w16cex="http://schemas.microsoft.com/office/word/2018/wordml/cex" xmlns:w16cid="http://schemas.microsoft.com/office/word/2016/wordml/cid" xmlns:w16="http://schemas.microsoft.com/office/word/2018/wordml" xmlns:w16du="http://schemas.microsoft.com/office/word/2023/wordml/word16du" xmlns:w16sdtdh="http://schemas.microsoft.com/office/word/2020/wordml/sdtdatahash" xmlns:w16sdtfl="http://schemas.microsoft.com/office/word/2024/wordml/sdtformatlock" xmlns:w16se="http://schemas.microsoft.com/office/word/2015/wordml/symex" xmlns:wpg="http://schemas.microsoft.com/office/word/2010/wordprocessingGroup" xmlns:wpi="http://schemas.microsoft.com/office/word/2010/wordprocessingInk" xmlns:wne="http://schemas.microsoft.com/office/word/2006/wordml" xmlns:wps="http://schemas.microsoft.com/office/word/2010/wordprocessingShape" mc:Ignorable="w14 w15 w16se w16cid w16 w16cex w16sdtdh w16sdtfl w16du wp14"/>
-</file>
-
 <file path=word/styles.xml><?xml version="1.0" encoding="utf-8"?>
-<w:styles xmlns:mc="http://schemas.openxmlformats.org/markup-compatibility/2006" xmlns:r="http://schemas.openxmlformats.org/officeDocument/2006/relationships" xmlns:w="http://schemas.openxmlformats.org/wordprocessingml/2006/main" xmlns:w14="http://schemas.microsoft.com/office/word/2010/wordml" xmlns:w15="http://schemas.microsoft.com/office/word/2012/wordml" xmlns:w16cex="http://schemas.microsoft.com/office/word/2018/wordml/cex" xmlns:w16cid="http://schemas.microsoft.com/office/word/2016/wordml/cid" xmlns:w16="http://schemas.microsoft.com/office/word/2018/wordml" xmlns:w16du="http://schemas.microsoft.com/office/word/2023/wordml/word16du" xmlns:w16sdtdh="http://schemas.microsoft.com/office/word/2020/wordml/sdtdatahash" xmlns:w16sdtfl="http://schemas.microsoft.com/office/word/2024/wordml/sdtformatlock" xmlns:w16se="http://schemas.microsoft.com/office/word/2015/wordml/symex" mc:Ignorable="w14 w15 w16se w16cid w16 w16cex w16sdtdh w16sdtfl w16du">
+<w:styles xmlns:mc="http://schemas.openxmlformats.org/markup-compatibility/2006" xmlns:r="http://schemas.openxmlformats.org/officeDocument/2006/relationships" xmlns:w="http://schemas.openxmlformats.org/wordprocessingml/2006/main" xmlns:w14="http://schemas.microsoft.com/office/word/2010/wordml" xmlns:w15="http://schemas.microsoft.com/office/word/2012/wordml" xmlns:w16cex="http://schemas.microsoft.com/office/word/2018/wordml/cex" xmlns:w16cid="http://schemas.microsoft.com/office/word/2016/wordml/cid" xmlns:w16="http://schemas.microsoft.com/office/word/2018/wordml" xmlns:w16sdtdh="http://schemas.microsoft.com/office/word/2020/wordml/sdtdatahash" xmlns:w16se="http://schemas.microsoft.com/office/word/2015/wordml/symex" mc:Ignorable="w14 w15 w16se w16cid w16 w16cex w16sdtdh">
   <w:docDefaults>
     <w:rPrDefault>
       <w:rPr>
@@ -5329,7 +6265,6 @@
     <w:lsdException w:name="Table Web 2" w:semiHidden="1" w:unhideWhenUsed="1"/>
     <w:lsdException w:name="Table Web 3" w:semiHidden="1" w:unhideWhenUsed="1"/>
     <w:lsdException w:name="Balloon Text" w:semiHidden="1" w:unhideWhenUsed="1"/>
-    <w:lsdException w:name="Table Grid" w:semiHidden="1" w:unhideWhenUsed="1"/>
     <w:lsdException w:name="Table Theme" w:semiHidden="1" w:unhideWhenUsed="1"/>
     <w:lsdException w:name="Placeholder Text" w:semiHidden="1" w:unhideWhenUsed="1"/>
     <w:lsdException w:name="No Spacing" w:qFormat="1"/>
@@ -5563,7 +6498,9 @@
   </w:style>
   <w:style w:type="character" w:default="1" w:styleId="DefaultParagraphFont">
     <w:name w:val="Default Paragraph Font"/>
+    <w:uiPriority w:val="1"/>
     <w:semiHidden/>
+    <w:unhideWhenUsed/>
   </w:style>
   <w:style w:type="table" w:default="1" w:styleId="TableNormal">
     <w:name w:val="Normal Table"/>

</xml_diff>